<commit_message>
Correcciones autoevaluaciones Nicolas Soto
</commit_message>
<xml_diff>
--- a/Fase 1/Evidencias Individuales/Nicolas_Soto_1.3_APT122_AutoevaluacionFase1.docx
+++ b/Fase 1/Evidencias Individuales/Nicolas_Soto_1.3_APT122_AutoevaluacionFase1.docx
@@ -1,6 +1,6 @@
 
 <file path=word/document.xml><?xml version="1.0" encoding="utf-8"?>
-<w:document xmlns:wpc="http://schemas.microsoft.com/office/word/2010/wordprocessingCanvas" xmlns:cx="http://schemas.microsoft.com/office/drawing/2014/chartex" xmlns:cx1="http://schemas.microsoft.com/office/drawing/2015/9/8/chartex" xmlns:cx2="http://schemas.microsoft.com/office/drawing/2015/10/21/chartex" xmlns:cx3="http://schemas.microsoft.com/office/drawing/2016/5/9/chartex" xmlns:cx4="http://schemas.microsoft.com/office/drawing/2016/5/10/chartex" xmlns:cx5="http://schemas.microsoft.com/office/drawing/2016/5/11/chartex" xmlns:cx6="http://schemas.microsoft.com/office/drawing/2016/5/12/chartex" xmlns:cx7="http://schemas.microsoft.com/office/drawing/2016/5/13/chartex" xmlns:cx8="http://schemas.microsoft.com/office/drawing/2016/5/14/chartex" xmlns:mc="http://schemas.openxmlformats.org/markup-compatibility/2006" xmlns:aink="http://schemas.microsoft.com/office/drawing/2016/ink" xmlns:am3d="http://schemas.microsoft.com/office/drawing/2017/model3d" xmlns:o="urn:schemas-microsoft-com:office:office" xmlns:oel="http://schemas.microsoft.com/office/2019/extlst" xmlns:r="http://schemas.openxmlformats.org/officeDocument/2006/relationships" xmlns:m="http://schemas.openxmlformats.org/officeDocument/2006/math" xmlns:v="urn:schemas-microsoft-com:vml" xmlns:wp14="http://schemas.microsoft.com/office/word/2010/wordprocessingDrawing" xmlns:wp="http://schemas.openxmlformats.org/drawingml/2006/wordprocessingDrawing" xmlns:w10="urn:schemas-microsoft-com:office:word" xmlns:w="http://schemas.openxmlformats.org/wordprocessingml/2006/main" xmlns:w14="http://schemas.microsoft.com/office/word/2010/wordml" xmlns:w15="http://schemas.microsoft.com/office/word/2012/wordml" xmlns:w16cex="http://schemas.microsoft.com/office/word/2018/wordml/cex" xmlns:w16cid="http://schemas.microsoft.com/office/word/2016/wordml/cid" xmlns:w16="http://schemas.microsoft.com/office/word/2018/wordml" xmlns:w16du="http://schemas.microsoft.com/office/word/2023/wordml/word16du" xmlns:w16sdtdh="http://schemas.microsoft.com/office/word/2020/wordml/sdtdatahash" xmlns:w16sdtfl="http://schemas.microsoft.com/office/word/2024/wordml/sdtformatlock" xmlns:w16se="http://schemas.microsoft.com/office/word/2015/wordml/symex" xmlns:wpg="http://schemas.microsoft.com/office/word/2010/wordprocessingGroup" xmlns:wpi="http://schemas.microsoft.com/office/word/2010/wordprocessingInk" xmlns:wne="http://schemas.microsoft.com/office/word/2006/wordml" xmlns:wps="http://schemas.microsoft.com/office/word/2010/wordprocessingShape" mc:Ignorable="w14 w15 w16se w16cid w16 w16cex w16sdtdh w16sdtfl w16du wp14">
+<w:document xmlns:wpc="http://schemas.microsoft.com/office/word/2010/wordprocessingCanvas" xmlns:cx="http://schemas.microsoft.com/office/drawing/2014/chartex" xmlns:cx1="http://schemas.microsoft.com/office/drawing/2015/9/8/chartex" xmlns:cx2="http://schemas.microsoft.com/office/drawing/2015/10/21/chartex" xmlns:cx3="http://schemas.microsoft.com/office/drawing/2016/5/9/chartex" xmlns:cx4="http://schemas.microsoft.com/office/drawing/2016/5/10/chartex" xmlns:cx5="http://schemas.microsoft.com/office/drawing/2016/5/11/chartex" xmlns:cx6="http://schemas.microsoft.com/office/drawing/2016/5/12/chartex" xmlns:cx7="http://schemas.microsoft.com/office/drawing/2016/5/13/chartex" xmlns:cx8="http://schemas.microsoft.com/office/drawing/2016/5/14/chartex" xmlns:mc="http://schemas.openxmlformats.org/markup-compatibility/2006" xmlns:aink="http://schemas.microsoft.com/office/drawing/2016/ink" xmlns:am3d="http://schemas.microsoft.com/office/drawing/2017/model3d" xmlns:o="urn:schemas-microsoft-com:office:office" xmlns:r="http://schemas.openxmlformats.org/officeDocument/2006/relationships" xmlns:m="http://schemas.openxmlformats.org/officeDocument/2006/math" xmlns:v="urn:schemas-microsoft-com:vml" xmlns:wp14="http://schemas.microsoft.com/office/word/2010/wordprocessingDrawing" xmlns:wp="http://schemas.openxmlformats.org/drawingml/2006/wordprocessingDrawing" xmlns:w10="urn:schemas-microsoft-com:office:word" xmlns:w="http://schemas.openxmlformats.org/wordprocessingml/2006/main" xmlns:w14="http://schemas.microsoft.com/office/word/2010/wordml" xmlns:w15="http://schemas.microsoft.com/office/word/2012/wordml" xmlns:w16cex="http://schemas.microsoft.com/office/word/2018/wordml/cex" xmlns:w16cid="http://schemas.microsoft.com/office/word/2016/wordml/cid" xmlns:w16="http://schemas.microsoft.com/office/word/2018/wordml" xmlns:w16sdtdh="http://schemas.microsoft.com/office/word/2020/wordml/sdtdatahash" xmlns:w16se="http://schemas.microsoft.com/office/word/2015/wordml/symex" xmlns:wpg="http://schemas.microsoft.com/office/word/2010/wordprocessingGroup" xmlns:wpi="http://schemas.microsoft.com/office/word/2010/wordprocessingInk" xmlns:wne="http://schemas.microsoft.com/office/word/2006/wordml" xmlns:wps="http://schemas.microsoft.com/office/word/2010/wordprocessingShape" mc:Ignorable="w14 w15 w16se w16cid w16 w16cex w16sdtdh wp14">
   <w:body>
     <w:p>
       <w:pPr>
@@ -334,6 +334,7 @@
               <w:spacing w:before="120" w:after="120"/>
               <w:jc w:val="center"/>
             </w:pPr>
+            <w:proofErr w:type="spellStart"/>
             <w:r>
               <w:rPr>
                 <w:rFonts w:asciiTheme="minorHAnsi" w:eastAsiaTheme="minorEastAsia" w:hAnsiTheme="minorHAnsi" w:cstheme="minorBidi"/>
@@ -346,6 +347,7 @@
               </w:rPr>
               <w:t>Capstone</w:t>
             </w:r>
+            <w:proofErr w:type="spellEnd"/>
           </w:p>
         </w:tc>
         <w:tc>
@@ -1890,32 +1892,14 @@
                 <w:bCs/>
                 <w:color w:val="3B3838" w:themeColor="background2" w:themeShade="40"/>
               </w:rPr>
-              <w:t xml:space="preserve">IL </w:t>
-            </w:r>
-            <w:proofErr w:type="gramStart"/>
-            <w:r>
-              <w:rPr>
-                <w:rFonts w:asciiTheme="minorHAnsi" w:eastAsiaTheme="minorEastAsia" w:hAnsiTheme="minorHAnsi" w:cstheme="minorBidi"/>
-                <w:b/>
-                <w:bCs/>
-                <w:color w:val="3B3838" w:themeColor="background2" w:themeShade="40"/>
-              </w:rPr>
-              <w:t xml:space="preserve">1.3  </w:t>
-            </w:r>
-            <w:r>
-              <w:rPr>
-                <w:rFonts w:asciiTheme="minorHAnsi" w:eastAsiaTheme="minorEastAsia" w:hAnsiTheme="minorHAnsi" w:cstheme="minorBidi"/>
-                <w:color w:val="3B3838" w:themeColor="background2" w:themeShade="40"/>
-              </w:rPr>
-              <w:t>Establece</w:t>
-            </w:r>
-            <w:proofErr w:type="gramEnd"/>
-            <w:r>
-              <w:rPr>
-                <w:rFonts w:asciiTheme="minorHAnsi" w:eastAsiaTheme="minorEastAsia" w:hAnsiTheme="minorHAnsi" w:cstheme="minorBidi"/>
-                <w:color w:val="3B3838" w:themeColor="background2" w:themeShade="40"/>
-              </w:rPr>
-              <w:t xml:space="preserve"> un plan de trabajo para su Proyecto APT y evidencias que permiten cumplir los objetivos propuestos, considerando recursos y tiempos pertinentes para el desarrollo de las actividades en el periodo académico establecido.</w:t>
+              <w:t xml:space="preserve">IL 1.3  </w:t>
+            </w:r>
+            <w:r>
+              <w:rPr>
+                <w:rFonts w:asciiTheme="minorHAnsi" w:eastAsiaTheme="minorEastAsia" w:hAnsiTheme="minorHAnsi" w:cstheme="minorBidi"/>
+                <w:color w:val="3B3838" w:themeColor="background2" w:themeShade="40"/>
+              </w:rPr>
+              <w:t>Establece un plan de trabajo para su Proyecto APT y evidencias que permiten cumplir los objetivos propuestos, considerando recursos y tiempos pertinentes para el desarrollo de las actividades en el periodo académico establecido.</w:t>
             </w:r>
           </w:p>
         </w:tc>
@@ -2481,23 +2465,7 @@
                 <w:rFonts w:asciiTheme="minorHAnsi" w:eastAsiaTheme="minorEastAsia" w:hAnsiTheme="minorHAnsi" w:cstheme="minorBidi"/>
                 <w:color w:val="3B3838" w:themeColor="background2" w:themeShade="40"/>
               </w:rPr>
-              <w:t xml:space="preserve">el diseño del Proyecto APT </w:t>
-            </w:r>
-            <w:proofErr w:type="gramStart"/>
-            <w:r>
-              <w:rPr>
-                <w:rFonts w:asciiTheme="minorHAnsi" w:eastAsiaTheme="minorEastAsia" w:hAnsiTheme="minorHAnsi" w:cstheme="minorBidi"/>
-                <w:color w:val="3B3838" w:themeColor="background2" w:themeShade="40"/>
-              </w:rPr>
-              <w:t>de acuerdo a</w:t>
-            </w:r>
-            <w:proofErr w:type="gramEnd"/>
-            <w:r>
-              <w:rPr>
-                <w:rFonts w:asciiTheme="minorHAnsi" w:eastAsiaTheme="minorEastAsia" w:hAnsiTheme="minorHAnsi" w:cstheme="minorBidi"/>
-                <w:color w:val="3B3838" w:themeColor="background2" w:themeShade="40"/>
-              </w:rPr>
-              <w:t xml:space="preserve"> estándares definidos por la disciplina.</w:t>
+              <w:t>el diseño del Proyecto APT de acuerdo a estándares definidos por la disciplina.</w:t>
             </w:r>
           </w:p>
         </w:tc>
@@ -2521,25 +2489,7 @@
                 <w:color w:val="000000" w:themeColor="text1"/>
                 <w:lang w:eastAsia="es-CL"/>
               </w:rPr>
-              <w:t xml:space="preserve">11. Cumple con los indicadores de calidad requeridos en la presentación del diseño del Proyecto APT </w:t>
-            </w:r>
-            <w:proofErr w:type="gramStart"/>
-            <w:r>
-              <w:rPr>
-                <w:rFonts w:asciiTheme="minorHAnsi" w:eastAsiaTheme="minorEastAsia" w:hAnsiTheme="minorHAnsi" w:cstheme="minorBidi"/>
-                <w:color w:val="000000" w:themeColor="text1"/>
-                <w:lang w:eastAsia="es-CL"/>
-              </w:rPr>
-              <w:t>de acuerdo a</w:t>
-            </w:r>
-            <w:proofErr w:type="gramEnd"/>
-            <w:r>
-              <w:rPr>
-                <w:rFonts w:asciiTheme="minorHAnsi" w:eastAsiaTheme="minorEastAsia" w:hAnsiTheme="minorHAnsi" w:cstheme="minorBidi"/>
-                <w:color w:val="000000" w:themeColor="text1"/>
-                <w:lang w:eastAsia="es-CL"/>
-              </w:rPr>
-              <w:t xml:space="preserve"> estándares definidos por la disciplina.</w:t>
+              <w:t>11. Cumple con los indicadores de calidad requeridos en la presentación del diseño del Proyecto APT de acuerdo a estándares definidos por la disciplina.</w:t>
             </w:r>
           </w:p>
         </w:tc>
@@ -2651,7 +2601,7 @@
               </w:rPr>
               <w:t xml:space="preserve">Redacta el </w:t>
             </w:r>
-            <w:proofErr w:type="gramStart"/>
+            <w:proofErr w:type="spellStart"/>
             <w:r>
               <w:rPr>
                 <w:rFonts w:asciiTheme="minorHAnsi" w:eastAsiaTheme="minorEastAsia" w:hAnsiTheme="minorHAnsi" w:cstheme="minorBidi"/>
@@ -2660,7 +2610,7 @@
               </w:rPr>
               <w:t>abstract</w:t>
             </w:r>
-            <w:proofErr w:type="gramEnd"/>
+            <w:proofErr w:type="spellEnd"/>
             <w:r>
               <w:rPr>
                 <w:rFonts w:asciiTheme="minorHAnsi" w:eastAsiaTheme="minorEastAsia" w:hAnsiTheme="minorHAnsi" w:cstheme="minorBidi"/>
@@ -3363,6 +3313,7 @@
                 <w:lang w:val="es-ES"/>
               </w:rPr>
             </w:pPr>
+            <w:proofErr w:type="spellStart"/>
             <w:r>
               <w:rPr>
                 <w:rStyle w:val="normaltextrun"/>
@@ -3372,7 +3323,19 @@
                 <w:szCs w:val="22"/>
                 <w:lang w:val="es-CL"/>
               </w:rPr>
-              <w:t>Abstract (inglés y español) </w:t>
+              <w:t>Abstract</w:t>
+            </w:r>
+            <w:proofErr w:type="spellEnd"/>
+            <w:r>
+              <w:rPr>
+                <w:rStyle w:val="normaltextrun"/>
+                <w:rFonts w:ascii="Calibri" w:eastAsia="Calibri" w:hAnsi="Calibri" w:cs="Calibri"/>
+                <w:color w:val="000000" w:themeColor="text1"/>
+                <w:sz w:val="22"/>
+                <w:szCs w:val="22"/>
+                <w:lang w:val="es-CL"/>
+              </w:rPr>
+              <w:t xml:space="preserve"> (inglés y español) </w:t>
             </w:r>
           </w:p>
           <w:p>
@@ -4178,25 +4141,7 @@
                 <w:sz w:val="22"/>
                 <w:szCs w:val="22"/>
               </w:rPr>
-              <w:t xml:space="preserve"> diseño del Proyecto APT </w:t>
-            </w:r>
-            <w:proofErr w:type="gramStart"/>
-            <w:r>
-              <w:rPr>
-                <w:rFonts w:asciiTheme="minorHAnsi" w:eastAsiaTheme="minorEastAsia" w:hAnsiTheme="minorHAnsi" w:cstheme="minorBidi"/>
-                <w:sz w:val="22"/>
-                <w:szCs w:val="22"/>
-              </w:rPr>
-              <w:t>de acuerdo a</w:t>
-            </w:r>
-            <w:proofErr w:type="gramEnd"/>
-            <w:r>
-              <w:rPr>
-                <w:rFonts w:asciiTheme="minorHAnsi" w:eastAsiaTheme="minorEastAsia" w:hAnsiTheme="minorHAnsi" w:cstheme="minorBidi"/>
-                <w:sz w:val="22"/>
-                <w:szCs w:val="22"/>
-              </w:rPr>
-              <w:t xml:space="preserve"> estándares definidos por la disciplina”, deberás revisar si tu Definición de Proyecto APT cumple con los indicadores de calidad disciplinarios, propios de las competencias del Perfil de Egreso de la Carrera que están involucradas en tu Proyecto. Para ello, deberás seleccionar de la siguiente tabla aquellos indicadores de calidad propios de cada una de las competencias del perfil de egreso que </w:t>
+              <w:t xml:space="preserve"> diseño del Proyecto APT de acuerdo a estándares definidos por la disciplina”, deberás revisar si tu Definición de Proyecto APT cumple con los indicadores de calidad disciplinarios, propios de las competencias del Perfil de Egreso de la Carrera que están involucradas en tu Proyecto. Para ello, deberás seleccionar de la siguiente tabla aquellos indicadores de calidad propios de cada una de las competencias del perfil de egreso que </w:t>
             </w:r>
             <w:r>
               <w:rPr>
@@ -4324,6 +4269,7 @@
                 <w:bCs/>
                 <w:color w:val="FFFFFF" w:themeColor="background1"/>
               </w:rPr>
+              <w:lastRenderedPageBreak/>
               <w:t>Competencia del Perfil de Egreso</w:t>
             </w:r>
           </w:p>
@@ -4524,23 +4470,7 @@
                 <w:rFonts w:asciiTheme="minorHAnsi" w:eastAsiaTheme="minorEastAsia" w:hAnsiTheme="minorHAnsi" w:cstheme="minorBidi"/>
                 <w:color w:val="000000" w:themeColor="text1"/>
               </w:rPr>
-              <w:t xml:space="preserve">1.3 Desarrolla mejoras al producto en base al resultado de </w:t>
-            </w:r>
-            <w:proofErr w:type="gramStart"/>
-            <w:r>
-              <w:rPr>
-                <w:rFonts w:asciiTheme="minorHAnsi" w:eastAsiaTheme="minorEastAsia" w:hAnsiTheme="minorHAnsi" w:cstheme="minorBidi"/>
-                <w:color w:val="000000" w:themeColor="text1"/>
-              </w:rPr>
-              <w:t>las mismas</w:t>
-            </w:r>
-            <w:proofErr w:type="gramEnd"/>
-            <w:r>
-              <w:rPr>
-                <w:rFonts w:asciiTheme="minorHAnsi" w:eastAsiaTheme="minorEastAsia" w:hAnsiTheme="minorHAnsi" w:cstheme="minorBidi"/>
-                <w:color w:val="000000" w:themeColor="text1"/>
-              </w:rPr>
-              <w:t xml:space="preserve">. </w:t>
+              <w:t xml:space="preserve">1.3 Desarrolla mejoras al producto en base al resultado de las mismas. </w:t>
             </w:r>
           </w:p>
         </w:tc>
@@ -4581,27 +4511,7 @@
                 <w:bCs/>
                 <w:color w:val="000000" w:themeColor="text1"/>
               </w:rPr>
-              <w:t xml:space="preserve">Gestionar proyectos informáticos, ofreciendo alternativas para la toma de decisiones </w:t>
-            </w:r>
-            <w:proofErr w:type="gramStart"/>
-            <w:r>
-              <w:rPr>
-                <w:rFonts w:asciiTheme="minorHAnsi" w:eastAsiaTheme="minorEastAsia" w:hAnsiTheme="minorHAnsi" w:cstheme="minorBidi"/>
-                <w:b/>
-                <w:bCs/>
-                <w:color w:val="000000" w:themeColor="text1"/>
-              </w:rPr>
-              <w:t>de acuerdo a</w:t>
-            </w:r>
-            <w:proofErr w:type="gramEnd"/>
-            <w:r>
-              <w:rPr>
-                <w:rFonts w:asciiTheme="minorHAnsi" w:eastAsiaTheme="minorEastAsia" w:hAnsiTheme="minorHAnsi" w:cstheme="minorBidi"/>
-                <w:b/>
-                <w:bCs/>
-                <w:color w:val="000000" w:themeColor="text1"/>
-              </w:rPr>
-              <w:t xml:space="preserve"> los requerimientos de la organización.</w:t>
+              <w:t>Gestionar proyectos informáticos, ofreciendo alternativas para la toma de decisiones de acuerdo a los requerimientos de la organización.</w:t>
             </w:r>
           </w:p>
         </w:tc>
@@ -4629,23 +4539,7 @@
                 <w:rFonts w:asciiTheme="minorHAnsi" w:eastAsiaTheme="minorEastAsia" w:hAnsiTheme="minorHAnsi" w:cstheme="minorBidi"/>
                 <w:color w:val="000000" w:themeColor="text1"/>
               </w:rPr>
-              <w:t xml:space="preserve">2.1 Planifica proyectos informáticos, ofreciendo alternativas para la toma de decisiones </w:t>
-            </w:r>
-            <w:proofErr w:type="gramStart"/>
-            <w:r>
-              <w:rPr>
-                <w:rFonts w:asciiTheme="minorHAnsi" w:eastAsiaTheme="minorEastAsia" w:hAnsiTheme="minorHAnsi" w:cstheme="minorBidi"/>
-                <w:color w:val="000000" w:themeColor="text1"/>
-              </w:rPr>
-              <w:t>de acuerdo a</w:t>
-            </w:r>
-            <w:proofErr w:type="gramEnd"/>
-            <w:r>
-              <w:rPr>
-                <w:rFonts w:asciiTheme="minorHAnsi" w:eastAsiaTheme="minorEastAsia" w:hAnsiTheme="minorHAnsi" w:cstheme="minorBidi"/>
-                <w:color w:val="000000" w:themeColor="text1"/>
-              </w:rPr>
-              <w:t xml:space="preserve"> los requerimientos de la organización.</w:t>
+              <w:t>2.1 Planifica proyectos informáticos, ofreciendo alternativas para la toma de decisiones de acuerdo a los requerimientos de la organización.</w:t>
             </w:r>
           </w:p>
         </w:tc>
@@ -4686,23 +4580,7 @@
                 <w:rFonts w:asciiTheme="minorHAnsi" w:eastAsiaTheme="minorEastAsia" w:hAnsiTheme="minorHAnsi" w:cstheme="minorBidi"/>
                 <w:color w:val="000000" w:themeColor="text1"/>
               </w:rPr>
-              <w:t xml:space="preserve">2.2 Controla proyectos informáticos, ofreciendo alternativas para la toma de decisiones </w:t>
-            </w:r>
-            <w:proofErr w:type="gramStart"/>
-            <w:r>
-              <w:rPr>
-                <w:rFonts w:asciiTheme="minorHAnsi" w:eastAsiaTheme="minorEastAsia" w:hAnsiTheme="minorHAnsi" w:cstheme="minorBidi"/>
-                <w:color w:val="000000" w:themeColor="text1"/>
-              </w:rPr>
-              <w:t>de acuerdo a</w:t>
-            </w:r>
-            <w:proofErr w:type="gramEnd"/>
-            <w:r>
-              <w:rPr>
-                <w:rFonts w:asciiTheme="minorHAnsi" w:eastAsiaTheme="minorEastAsia" w:hAnsiTheme="minorHAnsi" w:cstheme="minorBidi"/>
-                <w:color w:val="000000" w:themeColor="text1"/>
-              </w:rPr>
-              <w:t xml:space="preserve"> los requerimientos de la organización.</w:t>
+              <w:t>2.2 Controla proyectos informáticos, ofreciendo alternativas para la toma de decisiones de acuerdo a los requerimientos de la organización.</w:t>
             </w:r>
           </w:p>
         </w:tc>
@@ -4743,27 +4621,7 @@
                 <w:bCs/>
                 <w:color w:val="000000" w:themeColor="text1"/>
               </w:rPr>
-              <w:t xml:space="preserve">Construir modelos de datos para soportar los requerimientos de la organización </w:t>
-            </w:r>
-            <w:proofErr w:type="gramStart"/>
-            <w:r>
-              <w:rPr>
-                <w:rFonts w:asciiTheme="minorHAnsi" w:eastAsiaTheme="minorEastAsia" w:hAnsiTheme="minorHAnsi" w:cstheme="minorBidi"/>
-                <w:b/>
-                <w:bCs/>
-                <w:color w:val="000000" w:themeColor="text1"/>
-              </w:rPr>
-              <w:t>de acuerdo a</w:t>
-            </w:r>
-            <w:proofErr w:type="gramEnd"/>
-            <w:r>
-              <w:rPr>
-                <w:rFonts w:asciiTheme="minorHAnsi" w:eastAsiaTheme="minorEastAsia" w:hAnsiTheme="minorHAnsi" w:cstheme="minorBidi"/>
-                <w:b/>
-                <w:bCs/>
-                <w:color w:val="000000" w:themeColor="text1"/>
-              </w:rPr>
-              <w:t xml:space="preserve"> un diseño definido y escalable en el tiempo.</w:t>
+              <w:t>Construir modelos de datos para soportar los requerimientos de la organización de acuerdo a un diseño definido y escalable en el tiempo.</w:t>
             </w:r>
           </w:p>
         </w:tc>
@@ -4791,23 +4649,7 @@
                 <w:rFonts w:asciiTheme="minorHAnsi" w:eastAsiaTheme="minorEastAsia" w:hAnsiTheme="minorHAnsi" w:cstheme="minorBidi"/>
                 <w:color w:val="000000" w:themeColor="text1"/>
               </w:rPr>
-              <w:t xml:space="preserve">3.1 Diseña modelos de datos para soportar los requerimientos de la organización </w:t>
-            </w:r>
-            <w:proofErr w:type="gramStart"/>
-            <w:r>
-              <w:rPr>
-                <w:rFonts w:asciiTheme="minorHAnsi" w:eastAsiaTheme="minorEastAsia" w:hAnsiTheme="minorHAnsi" w:cstheme="minorBidi"/>
-                <w:color w:val="000000" w:themeColor="text1"/>
-              </w:rPr>
-              <w:t>de acuerdo a</w:t>
-            </w:r>
-            <w:proofErr w:type="gramEnd"/>
-            <w:r>
-              <w:rPr>
-                <w:rFonts w:asciiTheme="minorHAnsi" w:eastAsiaTheme="minorEastAsia" w:hAnsiTheme="minorHAnsi" w:cstheme="minorBidi"/>
-                <w:color w:val="000000" w:themeColor="text1"/>
-              </w:rPr>
-              <w:t xml:space="preserve"> un diseño definido y escalable en el tiempo.</w:t>
+              <w:t>3.1 Diseña modelos de datos para soportar los requerimientos de la organización de acuerdo a un diseño definido y escalable en el tiempo.</w:t>
             </w:r>
           </w:p>
         </w:tc>
@@ -4848,23 +4690,7 @@
                 <w:rFonts w:asciiTheme="minorHAnsi" w:eastAsiaTheme="minorEastAsia" w:hAnsiTheme="minorHAnsi" w:cstheme="minorBidi"/>
                 <w:color w:val="000000" w:themeColor="text1"/>
               </w:rPr>
-              <w:t xml:space="preserve">3.2 Implementa modelos de datos para soportar los requerimientos de la organización </w:t>
-            </w:r>
-            <w:proofErr w:type="gramStart"/>
-            <w:r>
-              <w:rPr>
-                <w:rFonts w:asciiTheme="minorHAnsi" w:eastAsiaTheme="minorEastAsia" w:hAnsiTheme="minorHAnsi" w:cstheme="minorBidi"/>
-                <w:color w:val="000000" w:themeColor="text1"/>
-              </w:rPr>
-              <w:t>de acuerdo a</w:t>
-            </w:r>
-            <w:proofErr w:type="gramEnd"/>
-            <w:r>
-              <w:rPr>
-                <w:rFonts w:asciiTheme="minorHAnsi" w:eastAsiaTheme="minorEastAsia" w:hAnsiTheme="minorHAnsi" w:cstheme="minorBidi"/>
-                <w:color w:val="000000" w:themeColor="text1"/>
-              </w:rPr>
-              <w:t xml:space="preserve"> un diseño definido y escalable en el tiempo.</w:t>
+              <w:t>3.2 Implementa modelos de datos para soportar los requerimientos de la organización de acuerdo a un diseño definido y escalable en el tiempo.</w:t>
             </w:r>
           </w:p>
         </w:tc>
@@ -5726,12 +5552,14 @@
         <w:tblLook w:val="04A0" w:firstRow="1" w:lastRow="0" w:firstColumn="1" w:lastColumn="0" w:noHBand="0" w:noVBand="1"/>
       </w:tblPr>
       <w:tblGrid>
-        <w:gridCol w:w="2972"/>
-        <w:gridCol w:w="2268"/>
-        <w:gridCol w:w="2126"/>
-        <w:gridCol w:w="2127"/>
-        <w:gridCol w:w="2052"/>
-        <w:gridCol w:w="1449"/>
+        <w:gridCol w:w="1786"/>
+        <w:gridCol w:w="1777"/>
+        <w:gridCol w:w="1705"/>
+        <w:gridCol w:w="1750"/>
+        <w:gridCol w:w="1463"/>
+        <w:gridCol w:w="1290"/>
+        <w:gridCol w:w="1706"/>
+        <w:gridCol w:w="1517"/>
       </w:tblGrid>
       <w:tr>
         <w:trPr>
@@ -5739,7 +5567,7 @@
         </w:trPr>
         <w:tc>
           <w:tcPr>
-            <w:tcW w:w="2972" w:type="dxa"/>
+            <w:tcW w:w="2327" w:type="dxa"/>
             <w:vMerge w:val="restart"/>
             <w:shd w:val="clear" w:color="auto" w:fill="262626" w:themeFill="text1" w:themeFillTint="D9"/>
             <w:vAlign w:val="center"/>
@@ -5768,7 +5596,7 @@
         </w:tc>
         <w:tc>
           <w:tcPr>
-            <w:tcW w:w="8573" w:type="dxa"/>
+            <w:tcW w:w="7549" w:type="dxa"/>
             <w:gridSpan w:val="4"/>
             <w:shd w:val="clear" w:color="auto" w:fill="262626" w:themeFill="text1" w:themeFillTint="D9"/>
             <w:vAlign w:val="center"/>
@@ -5791,31 +5619,13 @@
                 <w:bCs/>
                 <w:lang w:eastAsia="es-CL"/>
               </w:rPr>
-              <w:t>Categoría</w:t>
-            </w:r>
-            <w:r>
-              <w:rPr>
-                <w:rFonts w:asciiTheme="minorHAnsi" w:eastAsiaTheme="minorEastAsia" w:hAnsiTheme="minorHAnsi" w:cstheme="minorBidi"/>
-                <w:b/>
-                <w:bCs/>
-                <w:lang w:eastAsia="es-CL"/>
-              </w:rPr>
-              <w:t>s</w:t>
-            </w:r>
-            <w:r>
-              <w:rPr>
-                <w:rFonts w:asciiTheme="minorHAnsi" w:eastAsiaTheme="minorEastAsia" w:hAnsiTheme="minorHAnsi" w:cstheme="minorBidi"/>
-                <w:b/>
-                <w:bCs/>
-                <w:lang w:eastAsia="es-CL"/>
-              </w:rPr>
-              <w:t xml:space="preserve"> de Respuesta</w:t>
-            </w:r>
-          </w:p>
-        </w:tc>
-        <w:tc>
-          <w:tcPr>
-            <w:tcW w:w="1449" w:type="dxa"/>
+              <w:t>Categorías de Respuesta</w:t>
+            </w:r>
+          </w:p>
+        </w:tc>
+        <w:tc>
+          <w:tcPr>
+            <w:tcW w:w="1362" w:type="dxa"/>
             <w:vMerge w:val="restart"/>
             <w:shd w:val="clear" w:color="auto" w:fill="262626" w:themeFill="text1" w:themeFillTint="D9"/>
             <w:vAlign w:val="center"/>
@@ -5840,6 +5650,40 @@
               </w:rPr>
               <w:t>Ponderación del Indicador de Evaluación</w:t>
             </w:r>
+          </w:p>
+        </w:tc>
+        <w:tc>
+          <w:tcPr>
+            <w:tcW w:w="878" w:type="dxa"/>
+            <w:shd w:val="clear" w:color="auto" w:fill="262626" w:themeFill="text1" w:themeFillTint="D9"/>
+          </w:tcPr>
+          <w:p>
+            <w:pPr>
+              <w:jc w:val="center"/>
+              <w:rPr>
+                <w:rFonts w:asciiTheme="minorHAnsi" w:eastAsiaTheme="minorEastAsia" w:hAnsiTheme="minorHAnsi" w:cstheme="minorBidi"/>
+                <w:b/>
+                <w:bCs/>
+                <w:lang w:eastAsia="es-CL"/>
+              </w:rPr>
+            </w:pPr>
+          </w:p>
+        </w:tc>
+        <w:tc>
+          <w:tcPr>
+            <w:tcW w:w="878" w:type="dxa"/>
+            <w:shd w:val="clear" w:color="auto" w:fill="262626" w:themeFill="text1" w:themeFillTint="D9"/>
+          </w:tcPr>
+          <w:p>
+            <w:pPr>
+              <w:jc w:val="center"/>
+              <w:rPr>
+                <w:rFonts w:asciiTheme="minorHAnsi" w:eastAsiaTheme="minorEastAsia" w:hAnsiTheme="minorHAnsi" w:cstheme="minorBidi"/>
+                <w:b/>
+                <w:bCs/>
+                <w:lang w:eastAsia="es-CL"/>
+              </w:rPr>
+            </w:pPr>
           </w:p>
         </w:tc>
       </w:tr>
@@ -5849,7 +5693,7 @@
         </w:trPr>
         <w:tc>
           <w:tcPr>
-            <w:tcW w:w="2972" w:type="dxa"/>
+            <w:tcW w:w="2327" w:type="dxa"/>
             <w:vMerge/>
             <w:hideMark/>
           </w:tcPr>
@@ -5866,7 +5710,7 @@
         </w:tc>
         <w:tc>
           <w:tcPr>
-            <w:tcW w:w="2268" w:type="dxa"/>
+            <w:tcW w:w="2001" w:type="dxa"/>
             <w:shd w:val="clear" w:color="auto" w:fill="262626" w:themeFill="text1" w:themeFillTint="D9"/>
             <w:vAlign w:val="center"/>
             <w:hideMark/>
@@ -5889,41 +5733,22 @@
                 <w:sz w:val="22"/>
                 <w:szCs w:val="22"/>
               </w:rPr>
-              <w:t xml:space="preserve">Completamente </w:t>
-            </w:r>
-            <w:r>
-              <w:rPr>
-                <w:rFonts w:asciiTheme="minorHAnsi" w:eastAsiaTheme="minorEastAsia" w:hAnsiTheme="minorHAnsi" w:cstheme="minorBidi"/>
-                <w:b/>
-                <w:bCs/>
-                <w:sz w:val="22"/>
-                <w:szCs w:val="22"/>
-              </w:rPr>
-              <w:t>Logrado (</w:t>
-            </w:r>
-            <w:r>
-              <w:rPr>
-                <w:rFonts w:asciiTheme="minorHAnsi" w:eastAsiaTheme="minorEastAsia" w:hAnsiTheme="minorHAnsi" w:cstheme="minorBidi"/>
-                <w:b/>
-                <w:bCs/>
-                <w:lang w:eastAsia="es-CL"/>
-              </w:rPr>
-              <w:t>100%</w:t>
-            </w:r>
-            <w:r>
-              <w:rPr>
-                <w:rFonts w:asciiTheme="minorHAnsi" w:eastAsiaTheme="minorEastAsia" w:hAnsiTheme="minorHAnsi" w:cstheme="minorBidi"/>
-                <w:b/>
-                <w:bCs/>
-                <w:lang w:eastAsia="es-CL"/>
-              </w:rPr>
-              <w:t>)</w:t>
-            </w:r>
-          </w:p>
-        </w:tc>
-        <w:tc>
-          <w:tcPr>
-            <w:tcW w:w="2126" w:type="dxa"/>
+              <w:t>Completamente Logrado (</w:t>
+            </w:r>
+            <w:r>
+              <w:rPr>
+                <w:rFonts w:asciiTheme="minorHAnsi" w:eastAsiaTheme="minorEastAsia" w:hAnsiTheme="minorHAnsi" w:cstheme="minorBidi"/>
+                <w:b/>
+                <w:bCs/>
+                <w:lang w:eastAsia="es-CL"/>
+              </w:rPr>
+              <w:t>100%)</w:t>
+            </w:r>
+          </w:p>
+        </w:tc>
+        <w:tc>
+          <w:tcPr>
+            <w:tcW w:w="1896" w:type="dxa"/>
             <w:shd w:val="clear" w:color="auto" w:fill="262626" w:themeFill="text1" w:themeFillTint="D9"/>
             <w:vAlign w:val="center"/>
             <w:hideMark/>
@@ -5938,7 +5763,6 @@
                 <w:lang w:eastAsia="es-CL"/>
               </w:rPr>
             </w:pPr>
-            <w:proofErr w:type="gramStart"/>
             <w:r>
               <w:rPr>
                 <w:rFonts w:asciiTheme="minorHAnsi" w:eastAsiaTheme="minorEastAsia" w:hAnsiTheme="minorHAnsi" w:cstheme="minorBidi"/>
@@ -5956,41 +5780,13 @@
                 <w:bCs/>
                 <w:lang w:eastAsia="es-CL"/>
               </w:rPr>
-              <w:t xml:space="preserve">  </w:t>
-            </w:r>
-            <w:r>
-              <w:rPr>
-                <w:rFonts w:asciiTheme="minorHAnsi" w:eastAsiaTheme="minorEastAsia" w:hAnsiTheme="minorHAnsi" w:cstheme="minorBidi"/>
-                <w:b/>
-                <w:bCs/>
-                <w:lang w:eastAsia="es-CL"/>
-              </w:rPr>
-              <w:t>(</w:t>
-            </w:r>
-            <w:proofErr w:type="gramEnd"/>
-            <w:r>
-              <w:rPr>
-                <w:rFonts w:asciiTheme="minorHAnsi" w:eastAsiaTheme="minorEastAsia" w:hAnsiTheme="minorHAnsi" w:cstheme="minorBidi"/>
-                <w:b/>
-                <w:bCs/>
-                <w:lang w:eastAsia="es-CL"/>
-              </w:rPr>
-              <w:t>60%</w:t>
-            </w:r>
-            <w:r>
-              <w:rPr>
-                <w:rFonts w:asciiTheme="minorHAnsi" w:eastAsiaTheme="minorEastAsia" w:hAnsiTheme="minorHAnsi" w:cstheme="minorBidi"/>
-                <w:b/>
-                <w:bCs/>
-                <w:lang w:eastAsia="es-CL"/>
-              </w:rPr>
-              <w:t>)</w:t>
-            </w:r>
-          </w:p>
-        </w:tc>
-        <w:tc>
-          <w:tcPr>
-            <w:tcW w:w="2127" w:type="dxa"/>
+              <w:t xml:space="preserve">  (60%)</w:t>
+            </w:r>
+          </w:p>
+        </w:tc>
+        <w:tc>
+          <w:tcPr>
+            <w:tcW w:w="1921" w:type="dxa"/>
             <w:shd w:val="clear" w:color="auto" w:fill="262626" w:themeFill="text1" w:themeFillTint="D9"/>
             <w:vAlign w:val="center"/>
             <w:hideMark/>
@@ -6037,31 +5833,13 @@
                 <w:bCs/>
                 <w:lang w:eastAsia="es-CL"/>
               </w:rPr>
-              <w:t>(</w:t>
-            </w:r>
-            <w:r>
-              <w:rPr>
-                <w:rFonts w:asciiTheme="minorHAnsi" w:eastAsiaTheme="minorEastAsia" w:hAnsiTheme="minorHAnsi" w:cstheme="minorBidi"/>
-                <w:b/>
-                <w:bCs/>
-                <w:lang w:eastAsia="es-CL"/>
-              </w:rPr>
-              <w:t>30%</w:t>
-            </w:r>
-            <w:r>
-              <w:rPr>
-                <w:rFonts w:asciiTheme="minorHAnsi" w:eastAsiaTheme="minorEastAsia" w:hAnsiTheme="minorHAnsi" w:cstheme="minorBidi"/>
-                <w:b/>
-                <w:bCs/>
-                <w:lang w:eastAsia="es-CL"/>
-              </w:rPr>
-              <w:t>)</w:t>
-            </w:r>
-          </w:p>
-        </w:tc>
-        <w:tc>
-          <w:tcPr>
-            <w:tcW w:w="2052" w:type="dxa"/>
+              <w:t>(30%)</w:t>
+            </w:r>
+          </w:p>
+        </w:tc>
+        <w:tc>
+          <w:tcPr>
+            <w:tcW w:w="1731" w:type="dxa"/>
             <w:shd w:val="clear" w:color="auto" w:fill="262626" w:themeFill="text1" w:themeFillTint="D9"/>
             <w:vAlign w:val="center"/>
             <w:hideMark/>
@@ -6083,16 +5861,7 @@
                 <w:bCs/>
                 <w:lang w:eastAsia="es-CL"/>
               </w:rPr>
-              <w:t>N</w:t>
-            </w:r>
-            <w:r>
-              <w:rPr>
-                <w:rFonts w:asciiTheme="minorHAnsi" w:eastAsiaTheme="minorEastAsia" w:hAnsiTheme="minorHAnsi" w:cstheme="minorBidi"/>
-                <w:b/>
-                <w:bCs/>
-                <w:lang w:eastAsia="es-CL"/>
-              </w:rPr>
-              <w:t>o logrado</w:t>
+              <w:t>No logrado</w:t>
             </w:r>
           </w:p>
           <w:p>
@@ -6112,31 +5881,13 @@
                 <w:bCs/>
                 <w:lang w:eastAsia="es-CL"/>
               </w:rPr>
-              <w:t>(</w:t>
-            </w:r>
-            <w:r>
-              <w:rPr>
-                <w:rFonts w:asciiTheme="minorHAnsi" w:eastAsiaTheme="minorEastAsia" w:hAnsiTheme="minorHAnsi" w:cstheme="minorBidi"/>
-                <w:b/>
-                <w:bCs/>
-                <w:lang w:eastAsia="es-CL"/>
-              </w:rPr>
-              <w:t>0%</w:t>
-            </w:r>
-            <w:r>
-              <w:rPr>
-                <w:rFonts w:asciiTheme="minorHAnsi" w:eastAsiaTheme="minorEastAsia" w:hAnsiTheme="minorHAnsi" w:cstheme="minorBidi"/>
-                <w:b/>
-                <w:bCs/>
-                <w:lang w:eastAsia="es-CL"/>
-              </w:rPr>
-              <w:t>)</w:t>
-            </w:r>
-          </w:p>
-        </w:tc>
-        <w:tc>
-          <w:tcPr>
-            <w:tcW w:w="1449" w:type="dxa"/>
+              <w:t>(0%)</w:t>
+            </w:r>
+          </w:p>
+        </w:tc>
+        <w:tc>
+          <w:tcPr>
+            <w:tcW w:w="1362" w:type="dxa"/>
             <w:vMerge/>
             <w:hideMark/>
           </w:tcPr>
@@ -6149,6 +5900,54 @@
                 <w:lang w:eastAsia="es-CL"/>
               </w:rPr>
             </w:pPr>
+          </w:p>
+        </w:tc>
+        <w:tc>
+          <w:tcPr>
+            <w:tcW w:w="878" w:type="dxa"/>
+          </w:tcPr>
+          <w:p>
+            <w:pPr>
+              <w:rPr>
+                <w:rFonts w:ascii="Arial" w:hAnsi="Arial" w:cs="Arial"/>
+                <w:b/>
+                <w:bCs/>
+                <w:lang w:eastAsia="es-CL"/>
+              </w:rPr>
+            </w:pPr>
+            <w:r>
+              <w:rPr>
+                <w:rFonts w:ascii="Arial" w:hAnsi="Arial" w:cs="Arial"/>
+                <w:b/>
+                <w:bCs/>
+                <w:lang w:eastAsia="es-CL"/>
+              </w:rPr>
+              <w:t>Autoevaluación</w:t>
+            </w:r>
+          </w:p>
+        </w:tc>
+        <w:tc>
+          <w:tcPr>
+            <w:tcW w:w="878" w:type="dxa"/>
+          </w:tcPr>
+          <w:p>
+            <w:pPr>
+              <w:rPr>
+                <w:rFonts w:ascii="Arial" w:hAnsi="Arial" w:cs="Arial"/>
+                <w:b/>
+                <w:bCs/>
+                <w:lang w:eastAsia="es-CL"/>
+              </w:rPr>
+            </w:pPr>
+            <w:r>
+              <w:rPr>
+                <w:rFonts w:ascii="Arial" w:hAnsi="Arial" w:cs="Arial"/>
+                <w:b/>
+                <w:bCs/>
+                <w:lang w:eastAsia="es-CL"/>
+              </w:rPr>
+              <w:t>Justificación</w:t>
+            </w:r>
           </w:p>
         </w:tc>
       </w:tr>
@@ -6158,7 +5957,7 @@
         </w:trPr>
         <w:tc>
           <w:tcPr>
-            <w:tcW w:w="2972" w:type="dxa"/>
+            <w:tcW w:w="2327" w:type="dxa"/>
             <w:vAlign w:val="center"/>
             <w:hideMark/>
           </w:tcPr>
@@ -6183,7 +5982,7 @@
         </w:tc>
         <w:tc>
           <w:tcPr>
-            <w:tcW w:w="2268" w:type="dxa"/>
+            <w:tcW w:w="2001" w:type="dxa"/>
           </w:tcPr>
           <w:p>
             <w:pPr>
@@ -6199,41 +5998,13 @@
                 <w:rFonts w:asciiTheme="minorHAnsi" w:eastAsiaTheme="minorEastAsia" w:hAnsiTheme="minorHAnsi" w:cstheme="minorBidi"/>
                 <w:color w:val="000000" w:themeColor="text1"/>
               </w:rPr>
-              <w:t>Describ</w:t>
-            </w:r>
-            <w:r>
-              <w:rPr>
-                <w:rFonts w:asciiTheme="minorHAnsi" w:eastAsiaTheme="minorEastAsia" w:hAnsiTheme="minorHAnsi" w:cstheme="minorBidi"/>
-                <w:color w:val="000000" w:themeColor="text1"/>
-              </w:rPr>
-              <w:t>í</w:t>
-            </w:r>
-            <w:r>
-              <w:rPr>
-                <w:rFonts w:asciiTheme="minorHAnsi" w:eastAsiaTheme="minorEastAsia" w:hAnsiTheme="minorHAnsi" w:cstheme="minorBidi"/>
-                <w:color w:val="000000" w:themeColor="text1"/>
-              </w:rPr>
-              <w:t xml:space="preserve"> brevemente en qué consiste el proyecto APT, justificando la relevancia, impacto o beneficio (real o simulado) que tendría en el campo laboral de </w:t>
-            </w:r>
-            <w:r>
-              <w:rPr>
-                <w:rFonts w:asciiTheme="minorHAnsi" w:eastAsiaTheme="minorEastAsia" w:hAnsiTheme="minorHAnsi" w:cstheme="minorBidi"/>
-                <w:color w:val="000000" w:themeColor="text1"/>
-              </w:rPr>
-              <w:t>mi</w:t>
-            </w:r>
-            <w:r>
-              <w:rPr>
-                <w:rFonts w:asciiTheme="minorHAnsi" w:eastAsiaTheme="minorEastAsia" w:hAnsiTheme="minorHAnsi" w:cstheme="minorBidi"/>
-                <w:color w:val="000000" w:themeColor="text1"/>
-              </w:rPr>
-              <w:t xml:space="preserve"> carrera.</w:t>
-            </w:r>
-          </w:p>
-        </w:tc>
-        <w:tc>
-          <w:tcPr>
-            <w:tcW w:w="2126" w:type="dxa"/>
+              <w:t>Describí brevemente en qué consiste el proyecto APT, justificando la relevancia, impacto o beneficio (real o simulado) que tendría en el campo laboral de mi carrera.</w:t>
+            </w:r>
+          </w:p>
+        </w:tc>
+        <w:tc>
+          <w:tcPr>
+            <w:tcW w:w="1896" w:type="dxa"/>
           </w:tcPr>
           <w:p>
             <w:pPr>
@@ -6249,41 +6020,13 @@
                 <w:rFonts w:asciiTheme="minorHAnsi" w:eastAsiaTheme="minorEastAsia" w:hAnsiTheme="minorHAnsi" w:cstheme="minorBidi"/>
                 <w:color w:val="000000" w:themeColor="text1"/>
               </w:rPr>
-              <w:t xml:space="preserve">Describí </w:t>
-            </w:r>
-            <w:r>
-              <w:rPr>
-                <w:rFonts w:asciiTheme="minorHAnsi" w:eastAsiaTheme="minorEastAsia" w:hAnsiTheme="minorHAnsi" w:cstheme="minorBidi"/>
-                <w:color w:val="000000" w:themeColor="text1"/>
-              </w:rPr>
-              <w:t xml:space="preserve">brevemente en qué consiste el proyecto APT, señalando la relevancia, impacto o beneficio (real o simulado) que tendría, pero no queda clara la relación con el campo laboral de </w:t>
-            </w:r>
-            <w:r>
-              <w:rPr>
-                <w:rFonts w:asciiTheme="minorHAnsi" w:eastAsiaTheme="minorEastAsia" w:hAnsiTheme="minorHAnsi" w:cstheme="minorBidi"/>
-                <w:color w:val="000000" w:themeColor="text1"/>
-              </w:rPr>
-              <w:t>mi</w:t>
-            </w:r>
-            <w:r>
-              <w:rPr>
-                <w:rFonts w:asciiTheme="minorHAnsi" w:eastAsiaTheme="minorEastAsia" w:hAnsiTheme="minorHAnsi" w:cstheme="minorBidi"/>
-                <w:color w:val="000000" w:themeColor="text1"/>
-              </w:rPr>
-              <w:t xml:space="preserve"> carrera</w:t>
-            </w:r>
-            <w:r>
-              <w:rPr>
-                <w:rFonts w:asciiTheme="minorHAnsi" w:eastAsiaTheme="minorEastAsia" w:hAnsiTheme="minorHAnsi" w:cstheme="minorBidi"/>
-                <w:color w:val="000000" w:themeColor="text1"/>
-              </w:rPr>
-              <w:t>.</w:t>
-            </w:r>
-          </w:p>
-        </w:tc>
-        <w:tc>
-          <w:tcPr>
-            <w:tcW w:w="2127" w:type="dxa"/>
+              <w:t>Describí brevemente en qué consiste el proyecto APT, señalando la relevancia, impacto o beneficio (real o simulado) que tendría, pero no queda clara la relación con el campo laboral de mi carrera.</w:t>
+            </w:r>
+          </w:p>
+        </w:tc>
+        <w:tc>
+          <w:tcPr>
+            <w:tcW w:w="1921" w:type="dxa"/>
             <w:hideMark/>
           </w:tcPr>
           <w:p>
@@ -6300,48 +6043,13 @@
                 <w:rFonts w:asciiTheme="minorHAnsi" w:eastAsiaTheme="minorEastAsia" w:hAnsiTheme="minorHAnsi" w:cstheme="minorBidi"/>
                 <w:color w:val="000000" w:themeColor="text1"/>
               </w:rPr>
-              <w:t xml:space="preserve">Describí </w:t>
-            </w:r>
-            <w:r>
-              <w:rPr>
-                <w:rFonts w:asciiTheme="minorHAnsi" w:eastAsiaTheme="minorEastAsia" w:hAnsiTheme="minorHAnsi" w:cstheme="minorBidi"/>
-                <w:color w:val="000000" w:themeColor="text1"/>
-              </w:rPr>
-              <w:t>brevemente en qué consiste el proyecto APT, pero no lo justifi</w:t>
-            </w:r>
-            <w:r>
-              <w:rPr>
-                <w:rFonts w:asciiTheme="minorHAnsi" w:eastAsiaTheme="minorEastAsia" w:hAnsiTheme="minorHAnsi" w:cstheme="minorBidi"/>
-                <w:color w:val="000000" w:themeColor="text1"/>
-              </w:rPr>
-              <w:t>qué</w:t>
-            </w:r>
-            <w:r>
-              <w:rPr>
-                <w:rFonts w:asciiTheme="minorHAnsi" w:eastAsiaTheme="minorEastAsia" w:hAnsiTheme="minorHAnsi" w:cstheme="minorBidi"/>
-                <w:color w:val="000000" w:themeColor="text1"/>
-              </w:rPr>
-              <w:t xml:space="preserve"> ni relaciona con el campo laboral de </w:t>
-            </w:r>
-            <w:r>
-              <w:rPr>
-                <w:rFonts w:asciiTheme="minorHAnsi" w:eastAsiaTheme="minorEastAsia" w:hAnsiTheme="minorHAnsi" w:cstheme="minorBidi"/>
-                <w:color w:val="000000" w:themeColor="text1"/>
-              </w:rPr>
-              <w:t>mi</w:t>
-            </w:r>
-            <w:r>
-              <w:rPr>
-                <w:rFonts w:asciiTheme="minorHAnsi" w:eastAsiaTheme="minorEastAsia" w:hAnsiTheme="minorHAnsi" w:cstheme="minorBidi"/>
-                <w:color w:val="000000" w:themeColor="text1"/>
-              </w:rPr>
-              <w:t xml:space="preserve"> carrera. </w:t>
-            </w:r>
-          </w:p>
-        </w:tc>
-        <w:tc>
-          <w:tcPr>
-            <w:tcW w:w="2052" w:type="dxa"/>
+              <w:t xml:space="preserve">Describí brevemente en qué consiste el proyecto APT, pero no lo justifiqué ni relaciona con el campo laboral de mi carrera. </w:t>
+            </w:r>
+          </w:p>
+        </w:tc>
+        <w:tc>
+          <w:tcPr>
+            <w:tcW w:w="1731" w:type="dxa"/>
             <w:hideMark/>
           </w:tcPr>
           <w:p>
@@ -6358,48 +6066,13 @@
                 <w:rFonts w:asciiTheme="minorHAnsi" w:eastAsiaTheme="minorEastAsia" w:hAnsiTheme="minorHAnsi" w:cstheme="minorBidi"/>
                 <w:color w:val="000000" w:themeColor="text1"/>
               </w:rPr>
-              <w:t xml:space="preserve">No </w:t>
-            </w:r>
-            <w:r>
-              <w:rPr>
-                <w:rFonts w:asciiTheme="minorHAnsi" w:eastAsiaTheme="minorEastAsia" w:hAnsiTheme="minorHAnsi" w:cstheme="minorBidi"/>
-                <w:color w:val="000000" w:themeColor="text1"/>
-              </w:rPr>
-              <w:t>d</w:t>
-            </w:r>
-            <w:r>
-              <w:rPr>
-                <w:rFonts w:asciiTheme="minorHAnsi" w:eastAsiaTheme="minorEastAsia" w:hAnsiTheme="minorHAnsi" w:cstheme="minorBidi"/>
-                <w:color w:val="000000" w:themeColor="text1"/>
-              </w:rPr>
-              <w:t xml:space="preserve">escribí </w:t>
-            </w:r>
-            <w:r>
-              <w:rPr>
-                <w:rFonts w:asciiTheme="minorHAnsi" w:eastAsiaTheme="minorEastAsia" w:hAnsiTheme="minorHAnsi" w:cstheme="minorBidi"/>
-                <w:color w:val="000000" w:themeColor="text1"/>
-              </w:rPr>
-              <w:t xml:space="preserve">o es confuso el proyecto APT, sin justificar ni relacionarlo con el campo laboral de </w:t>
-            </w:r>
-            <w:r>
-              <w:rPr>
-                <w:rFonts w:asciiTheme="minorHAnsi" w:eastAsiaTheme="minorEastAsia" w:hAnsiTheme="minorHAnsi" w:cstheme="minorBidi"/>
-                <w:color w:val="000000" w:themeColor="text1"/>
-              </w:rPr>
-              <w:t>mi</w:t>
-            </w:r>
-            <w:r>
-              <w:rPr>
-                <w:rFonts w:asciiTheme="minorHAnsi" w:eastAsiaTheme="minorEastAsia" w:hAnsiTheme="minorHAnsi" w:cstheme="minorBidi"/>
-                <w:color w:val="000000" w:themeColor="text1"/>
-              </w:rPr>
-              <w:t xml:space="preserve"> carrera. </w:t>
-            </w:r>
-          </w:p>
-        </w:tc>
-        <w:tc>
-          <w:tcPr>
-            <w:tcW w:w="1449" w:type="dxa"/>
+              <w:t xml:space="preserve">No describí o es confuso el proyecto APT, sin justificar ni relacionarlo con el campo laboral de mi carrera. </w:t>
+            </w:r>
+          </w:p>
+        </w:tc>
+        <w:tc>
+          <w:tcPr>
+            <w:tcW w:w="1362" w:type="dxa"/>
             <w:vAlign w:val="center"/>
             <w:hideMark/>
           </w:tcPr>
@@ -6416,6 +6089,60 @@
                 <w:lang w:eastAsia="es-CL"/>
               </w:rPr>
               <w:t>5</w:t>
+            </w:r>
+          </w:p>
+        </w:tc>
+        <w:tc>
+          <w:tcPr>
+            <w:tcW w:w="878" w:type="dxa"/>
+          </w:tcPr>
+          <w:p>
+            <w:pPr>
+              <w:jc w:val="center"/>
+              <w:rPr>
+                <w:rFonts w:asciiTheme="minorHAnsi" w:eastAsiaTheme="minorEastAsia" w:hAnsiTheme="minorHAnsi" w:cstheme="minorBidi"/>
+                <w:b/>
+                <w:bCs/>
+                <w:color w:val="3B3838" w:themeColor="background2" w:themeShade="40"/>
+                <w:lang w:eastAsia="es-CL"/>
+              </w:rPr>
+            </w:pPr>
+            <w:r>
+              <w:rPr>
+                <w:rFonts w:asciiTheme="minorHAnsi" w:eastAsiaTheme="minorEastAsia" w:hAnsiTheme="minorHAnsi" w:cstheme="minorBidi"/>
+                <w:b/>
+                <w:bCs/>
+                <w:color w:val="3B3838" w:themeColor="background2" w:themeShade="40"/>
+                <w:lang w:eastAsia="es-CL"/>
+              </w:rPr>
+              <w:t>100%</w:t>
+            </w:r>
+          </w:p>
+        </w:tc>
+        <w:tc>
+          <w:tcPr>
+            <w:tcW w:w="878" w:type="dxa"/>
+          </w:tcPr>
+          <w:p>
+            <w:pPr>
+              <w:jc w:val="center"/>
+              <w:rPr>
+                <w:rFonts w:asciiTheme="minorHAnsi" w:eastAsiaTheme="minorEastAsia" w:hAnsiTheme="minorHAnsi" w:cstheme="minorBidi"/>
+                <w:b/>
+                <w:bCs/>
+                <w:color w:val="3B3838" w:themeColor="background2" w:themeShade="40"/>
+                <w:lang w:eastAsia="es-CL"/>
+              </w:rPr>
+            </w:pPr>
+            <w:r>
+              <w:rPr>
+                <w:rFonts w:asciiTheme="minorHAnsi" w:eastAsiaTheme="minorEastAsia" w:hAnsiTheme="minorHAnsi" w:cstheme="minorBidi"/>
+                <w:b/>
+                <w:bCs/>
+                <w:color w:val="3B3838" w:themeColor="background2" w:themeShade="40"/>
+                <w:lang w:eastAsia="es-CL"/>
+              </w:rPr>
+              <w:t>Logré explicar clarito de qué trata el proyecto APT y cómo aporta directamente a mi trabajo en el mundo real.</w:t>
             </w:r>
           </w:p>
         </w:tc>
@@ -6426,7 +6153,7 @@
         </w:trPr>
         <w:tc>
           <w:tcPr>
-            <w:tcW w:w="2972" w:type="dxa"/>
+            <w:tcW w:w="2327" w:type="dxa"/>
             <w:vAlign w:val="center"/>
           </w:tcPr>
           <w:p>
@@ -6450,7 +6177,7 @@
         </w:tc>
         <w:tc>
           <w:tcPr>
-            <w:tcW w:w="2268" w:type="dxa"/>
+            <w:tcW w:w="2001" w:type="dxa"/>
           </w:tcPr>
           <w:p>
             <w:pPr>
@@ -6466,76 +6193,21 @@
                 <w:rFonts w:asciiTheme="minorHAnsi" w:eastAsiaTheme="minorEastAsia" w:hAnsiTheme="minorHAnsi" w:cstheme="minorBidi"/>
                 <w:color w:val="000000" w:themeColor="text1"/>
               </w:rPr>
-              <w:t xml:space="preserve">Describí </w:t>
-            </w:r>
-            <w:r>
-              <w:rPr>
-                <w:rFonts w:asciiTheme="minorHAnsi" w:eastAsiaTheme="minorEastAsia" w:hAnsiTheme="minorHAnsi" w:cstheme="minorBidi"/>
-                <w:color w:val="000000" w:themeColor="text1"/>
-              </w:rPr>
-              <w:t xml:space="preserve">una relación coherente entre </w:t>
-            </w:r>
-            <w:r>
-              <w:rPr>
-                <w:rFonts w:asciiTheme="minorHAnsi" w:eastAsiaTheme="minorEastAsia" w:hAnsiTheme="minorHAnsi" w:cstheme="minorBidi"/>
-                <w:color w:val="000000" w:themeColor="text1"/>
-              </w:rPr>
-              <w:t>mi</w:t>
-            </w:r>
-            <w:r>
-              <w:rPr>
-                <w:rFonts w:asciiTheme="minorHAnsi" w:eastAsiaTheme="minorEastAsia" w:hAnsiTheme="minorHAnsi" w:cstheme="minorBidi"/>
-                <w:color w:val="000000" w:themeColor="text1"/>
-              </w:rPr>
-              <w:t xml:space="preserve"> proyecto y el perfil de egreso de </w:t>
-            </w:r>
-            <w:r>
-              <w:rPr>
-                <w:rFonts w:asciiTheme="minorHAnsi" w:eastAsiaTheme="minorEastAsia" w:hAnsiTheme="minorHAnsi" w:cstheme="minorBidi"/>
-                <w:color w:val="000000" w:themeColor="text1"/>
-              </w:rPr>
-              <w:t>mi</w:t>
-            </w:r>
-            <w:r>
-              <w:rPr>
-                <w:rFonts w:asciiTheme="minorHAnsi" w:eastAsiaTheme="minorEastAsia" w:hAnsiTheme="minorHAnsi" w:cstheme="minorBidi"/>
-                <w:color w:val="000000" w:themeColor="text1"/>
-              </w:rPr>
-              <w:t xml:space="preserve"> plan de estudio, especificando cómo deb</w:t>
-            </w:r>
-            <w:r>
-              <w:rPr>
-                <w:rFonts w:asciiTheme="minorHAnsi" w:eastAsiaTheme="minorEastAsia" w:hAnsiTheme="minorHAnsi" w:cstheme="minorBidi"/>
-                <w:color w:val="000000" w:themeColor="text1"/>
-              </w:rPr>
-              <w:t>o</w:t>
-            </w:r>
-            <w:r>
-              <w:rPr>
-                <w:rFonts w:asciiTheme="minorHAnsi" w:eastAsiaTheme="minorEastAsia" w:hAnsiTheme="minorHAnsi" w:cstheme="minorBidi"/>
-                <w:color w:val="000000" w:themeColor="text1"/>
-              </w:rPr>
-              <w:t xml:space="preserve"> utilizar distintas competencias para desarrollar </w:t>
-            </w:r>
-            <w:r>
-              <w:rPr>
-                <w:rFonts w:asciiTheme="minorHAnsi" w:eastAsiaTheme="minorEastAsia" w:hAnsiTheme="minorHAnsi" w:cstheme="minorBidi"/>
-                <w:color w:val="000000" w:themeColor="text1"/>
-              </w:rPr>
-              <w:t>mi</w:t>
-            </w:r>
-            <w:r>
-              <w:rPr>
-                <w:rFonts w:asciiTheme="minorHAnsi" w:eastAsiaTheme="minorEastAsia" w:hAnsiTheme="minorHAnsi" w:cstheme="minorBidi"/>
-                <w:color w:val="000000" w:themeColor="text1"/>
-              </w:rPr>
-              <w:t xml:space="preserve"> Proyecto APT. </w:t>
-            </w:r>
-          </w:p>
-        </w:tc>
-        <w:tc>
-          <w:tcPr>
-            <w:tcW w:w="2126" w:type="dxa"/>
+              <w:t xml:space="preserve">Describí una relación coherente entre mi proyecto y el perfil de egreso de mi plan de estudio, </w:t>
+            </w:r>
+            <w:r>
+              <w:rPr>
+                <w:rFonts w:asciiTheme="minorHAnsi" w:eastAsiaTheme="minorEastAsia" w:hAnsiTheme="minorHAnsi" w:cstheme="minorBidi"/>
+                <w:color w:val="000000" w:themeColor="text1"/>
+              </w:rPr>
+              <w:lastRenderedPageBreak/>
+              <w:t xml:space="preserve">especificando cómo debo utilizar distintas competencias para desarrollar mi Proyecto APT. </w:t>
+            </w:r>
+          </w:p>
+        </w:tc>
+        <w:tc>
+          <w:tcPr>
+            <w:tcW w:w="1896" w:type="dxa"/>
           </w:tcPr>
           <w:p>
             <w:pPr>
@@ -6551,90 +6223,22 @@
                 <w:rFonts w:asciiTheme="minorHAnsi" w:eastAsiaTheme="minorEastAsia" w:hAnsiTheme="minorHAnsi" w:cstheme="minorBidi"/>
                 <w:color w:val="000000" w:themeColor="text1"/>
               </w:rPr>
-              <w:t xml:space="preserve">Describí </w:t>
-            </w:r>
-            <w:r>
-              <w:rPr>
-                <w:rFonts w:asciiTheme="minorHAnsi" w:eastAsiaTheme="minorEastAsia" w:hAnsiTheme="minorHAnsi" w:cstheme="minorBidi"/>
-                <w:color w:val="000000" w:themeColor="text1"/>
-              </w:rPr>
-              <w:t xml:space="preserve">una relación coherente entre </w:t>
-            </w:r>
-            <w:r>
-              <w:rPr>
-                <w:rFonts w:asciiTheme="minorHAnsi" w:eastAsiaTheme="minorEastAsia" w:hAnsiTheme="minorHAnsi" w:cstheme="minorBidi"/>
-                <w:color w:val="000000" w:themeColor="text1"/>
-              </w:rPr>
-              <w:t>mi</w:t>
-            </w:r>
-            <w:r>
-              <w:rPr>
-                <w:rFonts w:asciiTheme="minorHAnsi" w:eastAsiaTheme="minorEastAsia" w:hAnsiTheme="minorHAnsi" w:cstheme="minorBidi"/>
-                <w:color w:val="000000" w:themeColor="text1"/>
-              </w:rPr>
-              <w:t xml:space="preserve"> proyecto y el perfil de egreso de </w:t>
-            </w:r>
-            <w:r>
-              <w:rPr>
-                <w:rFonts w:asciiTheme="minorHAnsi" w:eastAsiaTheme="minorEastAsia" w:hAnsiTheme="minorHAnsi" w:cstheme="minorBidi"/>
-                <w:color w:val="000000" w:themeColor="text1"/>
-              </w:rPr>
-              <w:t>mi</w:t>
-            </w:r>
-            <w:r>
-              <w:rPr>
-                <w:rFonts w:asciiTheme="minorHAnsi" w:eastAsiaTheme="minorEastAsia" w:hAnsiTheme="minorHAnsi" w:cstheme="minorBidi"/>
-                <w:color w:val="000000" w:themeColor="text1"/>
-              </w:rPr>
-              <w:t xml:space="preserve"> plan de estudio, pero no especifi</w:t>
-            </w:r>
-            <w:r>
-              <w:rPr>
-                <w:rFonts w:asciiTheme="minorHAnsi" w:eastAsiaTheme="minorEastAsia" w:hAnsiTheme="minorHAnsi" w:cstheme="minorBidi"/>
-                <w:color w:val="000000" w:themeColor="text1"/>
-              </w:rPr>
-              <w:t>que</w:t>
-            </w:r>
-            <w:r>
-              <w:rPr>
-                <w:rFonts w:asciiTheme="minorHAnsi" w:eastAsiaTheme="minorEastAsia" w:hAnsiTheme="minorHAnsi" w:cstheme="minorBidi"/>
-                <w:color w:val="000000" w:themeColor="text1"/>
-              </w:rPr>
-              <w:t xml:space="preserve"> cómo deb</w:t>
-            </w:r>
-            <w:r>
-              <w:rPr>
-                <w:rFonts w:asciiTheme="minorHAnsi" w:eastAsiaTheme="minorEastAsia" w:hAnsiTheme="minorHAnsi" w:cstheme="minorBidi"/>
-                <w:color w:val="000000" w:themeColor="text1"/>
-              </w:rPr>
-              <w:t>o</w:t>
-            </w:r>
-            <w:r>
-              <w:rPr>
-                <w:rFonts w:asciiTheme="minorHAnsi" w:eastAsiaTheme="minorEastAsia" w:hAnsiTheme="minorHAnsi" w:cstheme="minorBidi"/>
-                <w:color w:val="000000" w:themeColor="text1"/>
-              </w:rPr>
-              <w:t xml:space="preserve"> utilizar distintas competencias para desarrollar </w:t>
-            </w:r>
-            <w:r>
-              <w:rPr>
-                <w:rFonts w:asciiTheme="minorHAnsi" w:eastAsiaTheme="minorEastAsia" w:hAnsiTheme="minorHAnsi" w:cstheme="minorBidi"/>
-                <w:color w:val="000000" w:themeColor="text1"/>
-              </w:rPr>
-              <w:t>mi</w:t>
-            </w:r>
-            <w:r>
-              <w:rPr>
-                <w:rFonts w:asciiTheme="minorHAnsi" w:eastAsiaTheme="minorEastAsia" w:hAnsiTheme="minorHAnsi" w:cstheme="minorBidi"/>
-                <w:color w:val="000000" w:themeColor="text1"/>
-              </w:rPr>
-              <w:t xml:space="preserve"> Proyecto APT.</w:t>
-            </w:r>
-          </w:p>
-        </w:tc>
-        <w:tc>
-          <w:tcPr>
-            <w:tcW w:w="2127" w:type="dxa"/>
+              <w:lastRenderedPageBreak/>
+              <w:t xml:space="preserve">Describí una relación coherente entre mi proyecto y el perfil de egreso de mi plan de </w:t>
+            </w:r>
+            <w:r>
+              <w:rPr>
+                <w:rFonts w:asciiTheme="minorHAnsi" w:eastAsiaTheme="minorEastAsia" w:hAnsiTheme="minorHAnsi" w:cstheme="minorBidi"/>
+                <w:color w:val="000000" w:themeColor="text1"/>
+              </w:rPr>
+              <w:lastRenderedPageBreak/>
+              <w:t>estudio, pero no especifique cómo debo utilizar distintas competencias para desarrollar mi Proyecto APT.</w:t>
+            </w:r>
+          </w:p>
+        </w:tc>
+        <w:tc>
+          <w:tcPr>
+            <w:tcW w:w="1921" w:type="dxa"/>
           </w:tcPr>
           <w:p>
             <w:pPr>
@@ -6650,62 +6254,22 @@
                 <w:rFonts w:asciiTheme="minorHAnsi" w:eastAsiaTheme="minorEastAsia" w:hAnsiTheme="minorHAnsi" w:cstheme="minorBidi"/>
                 <w:color w:val="000000" w:themeColor="text1"/>
               </w:rPr>
-              <w:t xml:space="preserve">Describí </w:t>
-            </w:r>
-            <w:r>
-              <w:rPr>
-                <w:rFonts w:asciiTheme="minorHAnsi" w:eastAsiaTheme="minorEastAsia" w:hAnsiTheme="minorHAnsi" w:cstheme="minorBidi"/>
-                <w:color w:val="000000" w:themeColor="text1"/>
-              </w:rPr>
-              <w:t>una relación que tiene elementos</w:t>
-            </w:r>
-            <w:r>
-              <w:rPr>
-                <w:rFonts w:asciiTheme="minorHAnsi" w:eastAsiaTheme="minorEastAsia" w:hAnsiTheme="minorHAnsi" w:cstheme="minorBidi"/>
-                <w:color w:val="000000" w:themeColor="text1"/>
-              </w:rPr>
-              <w:t xml:space="preserve"> pero que no </w:t>
-            </w:r>
-            <w:r>
-              <w:rPr>
-                <w:rFonts w:asciiTheme="minorHAnsi" w:eastAsiaTheme="minorEastAsia" w:hAnsiTheme="minorHAnsi" w:cstheme="minorBidi"/>
-                <w:color w:val="000000" w:themeColor="text1"/>
-              </w:rPr>
-              <w:t xml:space="preserve">son coherentes entre </w:t>
-            </w:r>
-            <w:r>
-              <w:rPr>
-                <w:rFonts w:asciiTheme="minorHAnsi" w:eastAsiaTheme="minorEastAsia" w:hAnsiTheme="minorHAnsi" w:cstheme="minorBidi"/>
-                <w:color w:val="000000" w:themeColor="text1"/>
-              </w:rPr>
-              <w:t>mi</w:t>
-            </w:r>
-            <w:r>
-              <w:rPr>
-                <w:rFonts w:asciiTheme="minorHAnsi" w:eastAsiaTheme="minorEastAsia" w:hAnsiTheme="minorHAnsi" w:cstheme="minorBidi"/>
-                <w:color w:val="000000" w:themeColor="text1"/>
-              </w:rPr>
-              <w:t xml:space="preserve"> proyecto y el perfil de egreso de </w:t>
-            </w:r>
-            <w:r>
-              <w:rPr>
-                <w:rFonts w:asciiTheme="minorHAnsi" w:eastAsiaTheme="minorEastAsia" w:hAnsiTheme="minorHAnsi" w:cstheme="minorBidi"/>
-                <w:color w:val="000000" w:themeColor="text1"/>
-              </w:rPr>
-              <w:t>mi</w:t>
-            </w:r>
-            <w:r>
-              <w:rPr>
-                <w:rFonts w:asciiTheme="minorHAnsi" w:eastAsiaTheme="minorEastAsia" w:hAnsiTheme="minorHAnsi" w:cstheme="minorBidi"/>
-                <w:color w:val="000000" w:themeColor="text1"/>
-              </w:rPr>
-              <w:t xml:space="preserve"> plan de estudio.</w:t>
-            </w:r>
-          </w:p>
-        </w:tc>
-        <w:tc>
-          <w:tcPr>
-            <w:tcW w:w="2052" w:type="dxa"/>
+              <w:lastRenderedPageBreak/>
+              <w:t xml:space="preserve">Describí una relación que tiene elementos pero que no son coherentes entre mi proyecto y el </w:t>
+            </w:r>
+            <w:r>
+              <w:rPr>
+                <w:rFonts w:asciiTheme="minorHAnsi" w:eastAsiaTheme="minorEastAsia" w:hAnsiTheme="minorHAnsi" w:cstheme="minorBidi"/>
+                <w:color w:val="000000" w:themeColor="text1"/>
+              </w:rPr>
+              <w:lastRenderedPageBreak/>
+              <w:t>perfil de egreso de mi plan de estudio.</w:t>
+            </w:r>
+          </w:p>
+        </w:tc>
+        <w:tc>
+          <w:tcPr>
+            <w:tcW w:w="1731" w:type="dxa"/>
           </w:tcPr>
           <w:p>
             <w:pPr>
@@ -6721,42 +6285,16 @@
                 <w:rFonts w:asciiTheme="minorHAnsi" w:eastAsiaTheme="minorEastAsia" w:hAnsiTheme="minorHAnsi" w:cstheme="minorBidi"/>
                 <w:color w:val="000000" w:themeColor="text1"/>
               </w:rPr>
-              <w:t xml:space="preserve">Describí </w:t>
-            </w:r>
-            <w:r>
-              <w:rPr>
-                <w:rFonts w:asciiTheme="minorHAnsi" w:eastAsiaTheme="minorEastAsia" w:hAnsiTheme="minorHAnsi" w:cstheme="minorBidi"/>
-                <w:color w:val="000000" w:themeColor="text1"/>
-              </w:rPr>
-              <w:t xml:space="preserve">una relación sin coherencia entre </w:t>
-            </w:r>
-            <w:r>
-              <w:rPr>
-                <w:rFonts w:asciiTheme="minorHAnsi" w:eastAsiaTheme="minorEastAsia" w:hAnsiTheme="minorHAnsi" w:cstheme="minorBidi"/>
-                <w:color w:val="000000" w:themeColor="text1"/>
-              </w:rPr>
-              <w:t>mi</w:t>
-            </w:r>
-            <w:r>
-              <w:rPr>
-                <w:rFonts w:asciiTheme="minorHAnsi" w:eastAsiaTheme="minorEastAsia" w:hAnsiTheme="minorHAnsi" w:cstheme="minorBidi"/>
-                <w:color w:val="000000" w:themeColor="text1"/>
-              </w:rPr>
-              <w:t xml:space="preserve"> proyecto y el perfil de egreso de </w:t>
-            </w:r>
-            <w:r>
-              <w:rPr>
-                <w:rFonts w:asciiTheme="minorHAnsi" w:eastAsiaTheme="minorEastAsia" w:hAnsiTheme="minorHAnsi" w:cstheme="minorBidi"/>
-                <w:color w:val="000000" w:themeColor="text1"/>
-              </w:rPr>
-              <w:t>mi</w:t>
-            </w:r>
-            <w:r>
-              <w:rPr>
-                <w:rFonts w:asciiTheme="minorHAnsi" w:eastAsiaTheme="minorEastAsia" w:hAnsiTheme="minorHAnsi" w:cstheme="minorBidi"/>
-                <w:color w:val="000000" w:themeColor="text1"/>
-              </w:rPr>
-              <w:t xml:space="preserve"> plan de estudio.</w:t>
+              <w:lastRenderedPageBreak/>
+              <w:t xml:space="preserve">Describí una relación sin coherencia entre mi proyecto y el perfil de egreso </w:t>
+            </w:r>
+            <w:r>
+              <w:rPr>
+                <w:rFonts w:asciiTheme="minorHAnsi" w:eastAsiaTheme="minorEastAsia" w:hAnsiTheme="minorHAnsi" w:cstheme="minorBidi"/>
+                <w:color w:val="000000" w:themeColor="text1"/>
+              </w:rPr>
+              <w:lastRenderedPageBreak/>
+              <w:t>de mi plan de estudio.</w:t>
             </w:r>
             <w:r>
               <w:br/>
@@ -6776,41 +6314,13 @@
                 <w:rFonts w:asciiTheme="minorHAnsi" w:eastAsiaTheme="minorEastAsia" w:hAnsiTheme="minorHAnsi" w:cstheme="minorBidi"/>
                 <w:color w:val="000000" w:themeColor="text1"/>
               </w:rPr>
-              <w:t>No relacion</w:t>
-            </w:r>
-            <w:r>
-              <w:rPr>
-                <w:rFonts w:asciiTheme="minorHAnsi" w:eastAsiaTheme="minorEastAsia" w:hAnsiTheme="minorHAnsi" w:cstheme="minorBidi"/>
-                <w:color w:val="000000" w:themeColor="text1"/>
-              </w:rPr>
-              <w:t>é</w:t>
-            </w:r>
-            <w:r>
-              <w:rPr>
-                <w:rFonts w:asciiTheme="minorHAnsi" w:eastAsiaTheme="minorEastAsia" w:hAnsiTheme="minorHAnsi" w:cstheme="minorBidi"/>
-                <w:color w:val="000000" w:themeColor="text1"/>
-              </w:rPr>
-              <w:t xml:space="preserve"> el proyecto con </w:t>
-            </w:r>
-            <w:r>
-              <w:rPr>
-                <w:rFonts w:asciiTheme="minorHAnsi" w:eastAsiaTheme="minorEastAsia" w:hAnsiTheme="minorHAnsi" w:cstheme="minorBidi"/>
-                <w:color w:val="000000" w:themeColor="text1"/>
-              </w:rPr>
-              <w:t>mi</w:t>
-            </w:r>
-            <w:r>
-              <w:rPr>
-                <w:rFonts w:asciiTheme="minorHAnsi" w:eastAsiaTheme="minorEastAsia" w:hAnsiTheme="minorHAnsi" w:cstheme="minorBidi"/>
-                <w:color w:val="000000" w:themeColor="text1"/>
-              </w:rPr>
-              <w:t xml:space="preserve"> perfil de egreso. </w:t>
-            </w:r>
-          </w:p>
-        </w:tc>
-        <w:tc>
-          <w:tcPr>
-            <w:tcW w:w="1449" w:type="dxa"/>
+              <w:t xml:space="preserve">No relacioné el proyecto con mi perfil de egreso. </w:t>
+            </w:r>
+          </w:p>
+        </w:tc>
+        <w:tc>
+          <w:tcPr>
+            <w:tcW w:w="1362" w:type="dxa"/>
             <w:vAlign w:val="center"/>
           </w:tcPr>
           <w:p>
@@ -6832,7 +6342,73 @@
                 <w:color w:val="3B3838" w:themeColor="background2" w:themeShade="40"/>
                 <w:lang w:eastAsia="es-CL"/>
               </w:rPr>
+              <w:lastRenderedPageBreak/>
               <w:t>5</w:t>
+            </w:r>
+          </w:p>
+        </w:tc>
+        <w:tc>
+          <w:tcPr>
+            <w:tcW w:w="878" w:type="dxa"/>
+          </w:tcPr>
+          <w:p>
+            <w:pPr>
+              <w:jc w:val="center"/>
+              <w:rPr>
+                <w:rFonts w:asciiTheme="minorHAnsi" w:eastAsiaTheme="minorEastAsia" w:hAnsiTheme="minorHAnsi" w:cstheme="minorBidi"/>
+                <w:b/>
+                <w:bCs/>
+                <w:color w:val="3B3838" w:themeColor="background2" w:themeShade="40"/>
+                <w:lang w:eastAsia="es-CL"/>
+              </w:rPr>
+            </w:pPr>
+            <w:r>
+              <w:rPr>
+                <w:rFonts w:asciiTheme="minorHAnsi" w:eastAsiaTheme="minorEastAsia" w:hAnsiTheme="minorHAnsi" w:cstheme="minorBidi"/>
+                <w:b/>
+                <w:bCs/>
+                <w:color w:val="3B3838" w:themeColor="background2" w:themeShade="40"/>
+                <w:lang w:eastAsia="es-CL"/>
+              </w:rPr>
+              <w:t>100%</w:t>
+            </w:r>
+          </w:p>
+        </w:tc>
+        <w:tc>
+          <w:tcPr>
+            <w:tcW w:w="878" w:type="dxa"/>
+          </w:tcPr>
+          <w:p>
+            <w:pPr>
+              <w:jc w:val="center"/>
+              <w:rPr>
+                <w:rFonts w:asciiTheme="minorHAnsi" w:eastAsiaTheme="minorEastAsia" w:hAnsiTheme="minorHAnsi" w:cstheme="minorBidi"/>
+                <w:b/>
+                <w:bCs/>
+                <w:color w:val="3B3838" w:themeColor="background2" w:themeShade="40"/>
+                <w:lang w:eastAsia="es-CL"/>
+              </w:rPr>
+            </w:pPr>
+            <w:r>
+              <w:rPr>
+                <w:rFonts w:asciiTheme="minorHAnsi" w:eastAsiaTheme="minorEastAsia" w:hAnsiTheme="minorHAnsi" w:cstheme="minorBidi"/>
+                <w:b/>
+                <w:bCs/>
+                <w:color w:val="3B3838" w:themeColor="background2" w:themeShade="40"/>
+                <w:lang w:eastAsia="es-CL"/>
+              </w:rPr>
+              <w:t xml:space="preserve">Pude conectar el proyecto con mi perfil de egreso, detallando cómo aplico </w:t>
+            </w:r>
+            <w:r>
+              <w:rPr>
+                <w:rFonts w:asciiTheme="minorHAnsi" w:eastAsiaTheme="minorEastAsia" w:hAnsiTheme="minorHAnsi" w:cstheme="minorBidi"/>
+                <w:b/>
+                <w:bCs/>
+                <w:color w:val="3B3838" w:themeColor="background2" w:themeShade="40"/>
+                <w:lang w:eastAsia="es-CL"/>
+              </w:rPr>
+              <w:lastRenderedPageBreak/>
+              <w:t>cada competencia.</w:t>
             </w:r>
           </w:p>
         </w:tc>
@@ -6843,7 +6419,7 @@
         </w:trPr>
         <w:tc>
           <w:tcPr>
-            <w:tcW w:w="2972" w:type="dxa"/>
+            <w:tcW w:w="2327" w:type="dxa"/>
             <w:vAlign w:val="center"/>
           </w:tcPr>
           <w:p>
@@ -6887,7 +6463,7 @@
         </w:tc>
         <w:tc>
           <w:tcPr>
-            <w:tcW w:w="2268" w:type="dxa"/>
+            <w:tcW w:w="2001" w:type="dxa"/>
           </w:tcPr>
           <w:p>
             <w:pPr>
@@ -6903,55 +6479,13 @@
                 <w:rFonts w:asciiTheme="minorHAnsi" w:eastAsiaTheme="minorEastAsia" w:hAnsiTheme="minorHAnsi" w:cstheme="minorBidi"/>
                 <w:color w:val="000000" w:themeColor="text1"/>
               </w:rPr>
-              <w:t>Mencion</w:t>
-            </w:r>
-            <w:r>
-              <w:rPr>
-                <w:rFonts w:asciiTheme="minorHAnsi" w:eastAsiaTheme="minorEastAsia" w:hAnsiTheme="minorHAnsi" w:cstheme="minorBidi"/>
-                <w:color w:val="000000" w:themeColor="text1"/>
-              </w:rPr>
-              <w:t>é mis</w:t>
-            </w:r>
-            <w:r>
-              <w:rPr>
-                <w:rFonts w:asciiTheme="minorHAnsi" w:eastAsiaTheme="minorEastAsia" w:hAnsiTheme="minorHAnsi" w:cstheme="minorBidi"/>
-                <w:color w:val="000000" w:themeColor="text1"/>
-              </w:rPr>
-              <w:t xml:space="preserve"> intereses profesionales y expli</w:t>
-            </w:r>
-            <w:r>
-              <w:rPr>
-                <w:rFonts w:asciiTheme="minorHAnsi" w:eastAsiaTheme="minorEastAsia" w:hAnsiTheme="minorHAnsi" w:cstheme="minorBidi"/>
-                <w:color w:val="000000" w:themeColor="text1"/>
-              </w:rPr>
-              <w:t>qué</w:t>
-            </w:r>
-            <w:r>
-              <w:rPr>
-                <w:rFonts w:asciiTheme="minorHAnsi" w:eastAsiaTheme="minorEastAsia" w:hAnsiTheme="minorHAnsi" w:cstheme="minorBidi"/>
-                <w:color w:val="000000" w:themeColor="text1"/>
-              </w:rPr>
-              <w:t xml:space="preserve"> con claridad cómo estos se ven reflejados en </w:t>
-            </w:r>
-            <w:r>
-              <w:rPr>
-                <w:rFonts w:asciiTheme="minorHAnsi" w:eastAsiaTheme="minorEastAsia" w:hAnsiTheme="minorHAnsi" w:cstheme="minorBidi"/>
-                <w:color w:val="000000" w:themeColor="text1"/>
-              </w:rPr>
-              <w:t>mi</w:t>
-            </w:r>
-            <w:r>
-              <w:rPr>
-                <w:rFonts w:asciiTheme="minorHAnsi" w:eastAsiaTheme="minorEastAsia" w:hAnsiTheme="minorHAnsi" w:cstheme="minorBidi"/>
-                <w:color w:val="000000" w:themeColor="text1"/>
-              </w:rPr>
-              <w:t xml:space="preserve"> proyecto. </w:t>
-            </w:r>
-          </w:p>
-        </w:tc>
-        <w:tc>
-          <w:tcPr>
-            <w:tcW w:w="2126" w:type="dxa"/>
+              <w:t xml:space="preserve">Mencioné mis intereses profesionales y expliqué con claridad cómo estos se ven reflejados en mi proyecto. </w:t>
+            </w:r>
+          </w:p>
+        </w:tc>
+        <w:tc>
+          <w:tcPr>
+            <w:tcW w:w="1896" w:type="dxa"/>
           </w:tcPr>
           <w:p>
             <w:pPr>
@@ -6967,48 +6501,13 @@
                 <w:rFonts w:asciiTheme="minorHAnsi" w:eastAsiaTheme="minorEastAsia" w:hAnsiTheme="minorHAnsi" w:cstheme="minorBidi"/>
                 <w:color w:val="000000" w:themeColor="text1"/>
               </w:rPr>
-              <w:t xml:space="preserve">Mencioné </w:t>
-            </w:r>
-            <w:r>
-              <w:rPr>
-                <w:rFonts w:asciiTheme="minorHAnsi" w:eastAsiaTheme="minorEastAsia" w:hAnsiTheme="minorHAnsi" w:cstheme="minorBidi"/>
-                <w:color w:val="000000" w:themeColor="text1"/>
-              </w:rPr>
-              <w:t>mis</w:t>
-            </w:r>
-            <w:r>
-              <w:rPr>
-                <w:rFonts w:asciiTheme="minorHAnsi" w:eastAsiaTheme="minorEastAsia" w:hAnsiTheme="minorHAnsi" w:cstheme="minorBidi"/>
-                <w:color w:val="000000" w:themeColor="text1"/>
-              </w:rPr>
-              <w:t xml:space="preserve"> intereses profesionales, pero no queda completamente cla</w:t>
-            </w:r>
-            <w:r>
-              <w:rPr>
-                <w:rFonts w:asciiTheme="minorHAnsi" w:eastAsiaTheme="minorEastAsia" w:hAnsiTheme="minorHAnsi" w:cstheme="minorBidi"/>
-                <w:color w:val="000000" w:themeColor="text1"/>
-              </w:rPr>
-              <w:t xml:space="preserve">ra su conexión con </w:t>
-            </w:r>
-            <w:r>
-              <w:rPr>
-                <w:rFonts w:asciiTheme="minorHAnsi" w:eastAsiaTheme="minorEastAsia" w:hAnsiTheme="minorHAnsi" w:cstheme="minorBidi"/>
-                <w:color w:val="000000" w:themeColor="text1"/>
-              </w:rPr>
-              <w:t>mi</w:t>
-            </w:r>
-            <w:r>
-              <w:rPr>
-                <w:rFonts w:asciiTheme="minorHAnsi" w:eastAsiaTheme="minorEastAsia" w:hAnsiTheme="minorHAnsi" w:cstheme="minorBidi"/>
-                <w:color w:val="000000" w:themeColor="text1"/>
-              </w:rPr>
-              <w:t xml:space="preserve"> proyecto.</w:t>
-            </w:r>
-          </w:p>
-        </w:tc>
-        <w:tc>
-          <w:tcPr>
-            <w:tcW w:w="2127" w:type="dxa"/>
+              <w:t>Mencioné mis intereses profesionales, pero no queda completamente clara su conexión con mi proyecto.</w:t>
+            </w:r>
+          </w:p>
+        </w:tc>
+        <w:tc>
+          <w:tcPr>
+            <w:tcW w:w="1921" w:type="dxa"/>
           </w:tcPr>
           <w:p>
             <w:pPr>
@@ -7024,41 +6523,13 @@
                 <w:rFonts w:asciiTheme="minorHAnsi" w:eastAsiaTheme="minorEastAsia" w:hAnsiTheme="minorHAnsi" w:cstheme="minorBidi"/>
                 <w:color w:val="000000" w:themeColor="text1"/>
               </w:rPr>
-              <w:t xml:space="preserve">Menciona </w:t>
-            </w:r>
-            <w:r>
-              <w:rPr>
-                <w:rFonts w:asciiTheme="minorHAnsi" w:eastAsiaTheme="minorEastAsia" w:hAnsiTheme="minorHAnsi" w:cstheme="minorBidi"/>
-                <w:color w:val="000000" w:themeColor="text1"/>
-              </w:rPr>
-              <w:t>mis</w:t>
-            </w:r>
-            <w:r>
-              <w:rPr>
-                <w:rFonts w:asciiTheme="minorHAnsi" w:eastAsiaTheme="minorEastAsia" w:hAnsiTheme="minorHAnsi" w:cstheme="minorBidi"/>
-                <w:color w:val="000000" w:themeColor="text1"/>
-              </w:rPr>
-              <w:t xml:space="preserve"> intereses profesionales sin conectarlos con </w:t>
-            </w:r>
-            <w:r>
-              <w:rPr>
-                <w:rFonts w:asciiTheme="minorHAnsi" w:eastAsiaTheme="minorEastAsia" w:hAnsiTheme="minorHAnsi" w:cstheme="minorBidi"/>
-                <w:color w:val="000000" w:themeColor="text1"/>
-              </w:rPr>
-              <w:t>mi</w:t>
-            </w:r>
-            <w:r>
-              <w:rPr>
-                <w:rFonts w:asciiTheme="minorHAnsi" w:eastAsiaTheme="minorEastAsia" w:hAnsiTheme="minorHAnsi" w:cstheme="minorBidi"/>
-                <w:color w:val="000000" w:themeColor="text1"/>
-              </w:rPr>
-              <w:t xml:space="preserve"> proyecto. </w:t>
-            </w:r>
-          </w:p>
-        </w:tc>
-        <w:tc>
-          <w:tcPr>
-            <w:tcW w:w="2052" w:type="dxa"/>
+              <w:t xml:space="preserve">Menciona mis intereses profesionales sin conectarlos con mi proyecto. </w:t>
+            </w:r>
+          </w:p>
+        </w:tc>
+        <w:tc>
+          <w:tcPr>
+            <w:tcW w:w="1731" w:type="dxa"/>
           </w:tcPr>
           <w:p>
             <w:pPr>
@@ -7074,27 +6545,13 @@
                 <w:rFonts w:asciiTheme="minorHAnsi" w:eastAsiaTheme="minorEastAsia" w:hAnsiTheme="minorHAnsi" w:cstheme="minorBidi"/>
                 <w:color w:val="000000" w:themeColor="text1"/>
               </w:rPr>
-              <w:t xml:space="preserve">No menciona </w:t>
-            </w:r>
-            <w:r>
-              <w:rPr>
-                <w:rFonts w:asciiTheme="minorHAnsi" w:eastAsiaTheme="minorEastAsia" w:hAnsiTheme="minorHAnsi" w:cstheme="minorBidi"/>
-                <w:color w:val="000000" w:themeColor="text1"/>
-              </w:rPr>
-              <w:t>mis</w:t>
-            </w:r>
-            <w:r>
-              <w:rPr>
-                <w:rFonts w:asciiTheme="minorHAnsi" w:eastAsiaTheme="minorEastAsia" w:hAnsiTheme="minorHAnsi" w:cstheme="minorBidi"/>
-                <w:color w:val="000000" w:themeColor="text1"/>
-              </w:rPr>
-              <w:t xml:space="preserve"> intereses profesionales.</w:t>
-            </w:r>
-          </w:p>
-        </w:tc>
-        <w:tc>
-          <w:tcPr>
-            <w:tcW w:w="1449" w:type="dxa"/>
+              <w:t>No menciona mis intereses profesionales.</w:t>
+            </w:r>
+          </w:p>
+        </w:tc>
+        <w:tc>
+          <w:tcPr>
+            <w:tcW w:w="1362" w:type="dxa"/>
             <w:vAlign w:val="center"/>
           </w:tcPr>
           <w:p>
@@ -7117,6 +6574,91 @@
                 <w:lang w:eastAsia="es-CL"/>
               </w:rPr>
               <w:t>5</w:t>
+            </w:r>
+          </w:p>
+        </w:tc>
+        <w:tc>
+          <w:tcPr>
+            <w:tcW w:w="878" w:type="dxa"/>
+          </w:tcPr>
+          <w:p>
+            <w:pPr>
+              <w:jc w:val="center"/>
+              <w:rPr>
+                <w:rFonts w:asciiTheme="minorHAnsi" w:eastAsiaTheme="minorEastAsia" w:hAnsiTheme="minorHAnsi" w:cstheme="minorBidi"/>
+                <w:b/>
+                <w:bCs/>
+                <w:color w:val="3B3838" w:themeColor="background2" w:themeShade="40"/>
+                <w:lang w:eastAsia="es-CL"/>
+              </w:rPr>
+            </w:pPr>
+            <w:r>
+              <w:rPr>
+                <w:rFonts w:asciiTheme="minorHAnsi" w:eastAsiaTheme="minorEastAsia" w:hAnsiTheme="minorHAnsi" w:cstheme="minorBidi"/>
+                <w:b/>
+                <w:bCs/>
+                <w:color w:val="3B3838" w:themeColor="background2" w:themeShade="40"/>
+                <w:lang w:eastAsia="es-CL"/>
+              </w:rPr>
+              <w:t>100%</w:t>
+            </w:r>
+          </w:p>
+        </w:tc>
+        <w:tc>
+          <w:tcPr>
+            <w:tcW w:w="878" w:type="dxa"/>
+          </w:tcPr>
+          <w:p>
+            <w:pPr>
+              <w:jc w:val="center"/>
+              <w:rPr>
+                <w:rFonts w:asciiTheme="minorHAnsi" w:eastAsiaTheme="minorEastAsia" w:hAnsiTheme="minorHAnsi" w:cstheme="minorBidi"/>
+                <w:b/>
+                <w:bCs/>
+                <w:color w:val="3B3838" w:themeColor="background2" w:themeShade="40"/>
+                <w:lang w:eastAsia="es-CL"/>
+              </w:rPr>
+            </w:pPr>
+            <w:r>
+              <w:rPr>
+                <w:rFonts w:asciiTheme="minorHAnsi" w:eastAsiaTheme="minorEastAsia" w:hAnsiTheme="minorHAnsi" w:cstheme="minorBidi"/>
+                <w:b/>
+                <w:bCs/>
+                <w:color w:val="3B3838" w:themeColor="background2" w:themeShade="40"/>
+                <w:lang w:eastAsia="es-CL"/>
+              </w:rPr>
+              <w:t>Fui</w:t>
+            </w:r>
+            <w:r>
+              <w:rPr>
+                <w:rFonts w:asciiTheme="minorHAnsi" w:eastAsiaTheme="minorEastAsia" w:hAnsiTheme="minorHAnsi" w:cstheme="minorBidi"/>
+                <w:b/>
+                <w:bCs/>
+                <w:color w:val="3B3838" w:themeColor="background2" w:themeShade="40"/>
+                <w:lang w:eastAsia="es-CL"/>
+              </w:rPr>
+              <w:t xml:space="preserve"> </w:t>
+            </w:r>
+            <w:r>
+              <w:rPr>
+                <w:rFonts w:asciiTheme="minorHAnsi" w:eastAsiaTheme="minorEastAsia" w:hAnsiTheme="minorHAnsi" w:cstheme="minorBidi"/>
+                <w:lang w:eastAsia="es-CL"/>
+              </w:rPr>
+              <w:t xml:space="preserve">transparente </w:t>
+            </w:r>
+            <w:r>
+              <w:rPr>
+                <w:rFonts w:asciiTheme="minorHAnsi" w:eastAsiaTheme="minorEastAsia" w:hAnsiTheme="minorHAnsi" w:cstheme="minorBidi"/>
+                <w:lang w:eastAsia="es-CL"/>
+              </w:rPr>
+              <w:t xml:space="preserve">en </w:t>
+            </w:r>
+            <w:r>
+              <w:rPr>
+                <w:rFonts w:asciiTheme="minorHAnsi" w:eastAsiaTheme="minorEastAsia" w:hAnsiTheme="minorHAnsi" w:cstheme="minorBidi"/>
+                <w:lang w:eastAsia="es-CL"/>
+              </w:rPr>
+              <w:t>qué me apasiona de la carrera y cómo el proyecto se alinea a esas metas profesionales.</w:t>
             </w:r>
           </w:p>
         </w:tc>
@@ -7127,7 +6669,7 @@
         </w:trPr>
         <w:tc>
           <w:tcPr>
-            <w:tcW w:w="2972" w:type="dxa"/>
+            <w:tcW w:w="2327" w:type="dxa"/>
             <w:vAlign w:val="center"/>
           </w:tcPr>
           <w:p>
@@ -7151,7 +6693,7 @@
         </w:tc>
         <w:tc>
           <w:tcPr>
-            <w:tcW w:w="2268" w:type="dxa"/>
+            <w:tcW w:w="2001" w:type="dxa"/>
           </w:tcPr>
           <w:p>
             <w:pPr>
@@ -7167,41 +6709,13 @@
                 <w:rFonts w:asciiTheme="minorHAnsi" w:eastAsiaTheme="minorEastAsia" w:hAnsiTheme="minorHAnsi" w:cstheme="minorBidi"/>
                 <w:color w:val="000000" w:themeColor="text1"/>
               </w:rPr>
-              <w:t>Justifi</w:t>
-            </w:r>
-            <w:r>
-              <w:rPr>
-                <w:rFonts w:asciiTheme="minorHAnsi" w:eastAsiaTheme="minorEastAsia" w:hAnsiTheme="minorHAnsi" w:cstheme="minorBidi"/>
-                <w:color w:val="000000" w:themeColor="text1"/>
-              </w:rPr>
-              <w:t>qué</w:t>
-            </w:r>
-            <w:r>
-              <w:rPr>
-                <w:rFonts w:asciiTheme="minorHAnsi" w:eastAsiaTheme="minorEastAsia" w:hAnsiTheme="minorHAnsi" w:cstheme="minorBidi"/>
-                <w:color w:val="000000" w:themeColor="text1"/>
-              </w:rPr>
-              <w:t xml:space="preserve"> por qué el proyecto puede desarrollarse considerado tiempo, materiales y factores externos, y en caso de posibles dificultades plante</w:t>
-            </w:r>
-            <w:r>
-              <w:rPr>
-                <w:rFonts w:asciiTheme="minorHAnsi" w:eastAsiaTheme="minorEastAsia" w:hAnsiTheme="minorHAnsi" w:cstheme="minorBidi"/>
-                <w:color w:val="000000" w:themeColor="text1"/>
-              </w:rPr>
-              <w:t>e</w:t>
-            </w:r>
-            <w:r>
-              <w:rPr>
-                <w:rFonts w:asciiTheme="minorHAnsi" w:eastAsiaTheme="minorEastAsia" w:hAnsiTheme="minorHAnsi" w:cstheme="minorBidi"/>
-                <w:color w:val="000000" w:themeColor="text1"/>
-              </w:rPr>
-              <w:t xml:space="preserve"> como las abordaría.</w:t>
-            </w:r>
-          </w:p>
-        </w:tc>
-        <w:tc>
-          <w:tcPr>
-            <w:tcW w:w="2126" w:type="dxa"/>
+              <w:t>Justifiqué por qué el proyecto puede desarrollarse considerado tiempo, materiales y factores externos, y en caso de posibles dificultades plantee como las abordaría.</w:t>
+            </w:r>
+          </w:p>
+        </w:tc>
+        <w:tc>
+          <w:tcPr>
+            <w:tcW w:w="1896" w:type="dxa"/>
           </w:tcPr>
           <w:p>
             <w:pPr>
@@ -7217,14 +6731,7 @@
                 <w:rFonts w:asciiTheme="minorHAnsi" w:eastAsiaTheme="minorEastAsia" w:hAnsiTheme="minorHAnsi" w:cstheme="minorBidi"/>
                 <w:color w:val="000000" w:themeColor="text1"/>
               </w:rPr>
-              <w:t xml:space="preserve">Justifiqué </w:t>
-            </w:r>
-            <w:r>
-              <w:rPr>
-                <w:rFonts w:asciiTheme="minorHAnsi" w:eastAsiaTheme="minorEastAsia" w:hAnsiTheme="minorHAnsi" w:cstheme="minorBidi"/>
-                <w:color w:val="000000" w:themeColor="text1"/>
-              </w:rPr>
-              <w:t>por qué el proyecto puede desarrollarse, considerando el tiempo y materiales o factores externos</w:t>
+              <w:t>Justifiqué por qué el proyecto puede desarrollarse, considerando el tiempo y materiales o factores externos</w:t>
             </w:r>
             <w:r>
               <w:br/>
@@ -7244,27 +6751,13 @@
                 <w:rFonts w:asciiTheme="minorHAnsi" w:eastAsiaTheme="minorEastAsia" w:hAnsiTheme="minorHAnsi" w:cstheme="minorBidi"/>
                 <w:color w:val="000000" w:themeColor="text1"/>
               </w:rPr>
-              <w:t>En caso de posibles dificultades no plante</w:t>
-            </w:r>
-            <w:r>
-              <w:rPr>
-                <w:rFonts w:asciiTheme="minorHAnsi" w:eastAsiaTheme="minorEastAsia" w:hAnsiTheme="minorHAnsi" w:cstheme="minorBidi"/>
-                <w:color w:val="000000" w:themeColor="text1"/>
-              </w:rPr>
-              <w:t>e</w:t>
-            </w:r>
-            <w:r>
-              <w:rPr>
-                <w:rFonts w:asciiTheme="minorHAnsi" w:eastAsiaTheme="minorEastAsia" w:hAnsiTheme="minorHAnsi" w:cstheme="minorBidi"/>
-                <w:color w:val="000000" w:themeColor="text1"/>
-              </w:rPr>
-              <w:t xml:space="preserve"> claramente como las abordaría.</w:t>
-            </w:r>
-          </w:p>
-        </w:tc>
-        <w:tc>
-          <w:tcPr>
-            <w:tcW w:w="2127" w:type="dxa"/>
+              <w:t>En caso de posibles dificultades no plantee claramente como las abordaría.</w:t>
+            </w:r>
+          </w:p>
+        </w:tc>
+        <w:tc>
+          <w:tcPr>
+            <w:tcW w:w="1921" w:type="dxa"/>
           </w:tcPr>
           <w:p>
             <w:pPr>
@@ -7280,14 +6773,7 @@
                 <w:rFonts w:asciiTheme="minorHAnsi" w:eastAsiaTheme="minorEastAsia" w:hAnsiTheme="minorHAnsi" w:cstheme="minorBidi"/>
                 <w:color w:val="000000" w:themeColor="text1"/>
               </w:rPr>
-              <w:t xml:space="preserve">Justifiqué </w:t>
-            </w:r>
-            <w:r>
-              <w:rPr>
-                <w:rFonts w:asciiTheme="minorHAnsi" w:eastAsiaTheme="minorEastAsia" w:hAnsiTheme="minorHAnsi" w:cstheme="minorBidi"/>
-                <w:color w:val="000000" w:themeColor="text1"/>
-              </w:rPr>
-              <w:t xml:space="preserve">por qué el proyecto puede desarrollarse en el tiempo de la asignatura, sin considerar materiales ni factores externos. </w:t>
+              <w:t xml:space="preserve">Justifiqué por qué el proyecto puede desarrollarse en el tiempo de la asignatura, sin considerar materiales ni factores externos. </w:t>
             </w:r>
             <w:r>
               <w:br/>
@@ -7307,27 +6793,13 @@
                 <w:rFonts w:asciiTheme="minorHAnsi" w:eastAsiaTheme="minorEastAsia" w:hAnsiTheme="minorHAnsi" w:cstheme="minorBidi"/>
                 <w:color w:val="000000" w:themeColor="text1"/>
               </w:rPr>
-              <w:t>En caso de posibles dificultades no plante</w:t>
-            </w:r>
-            <w:r>
-              <w:rPr>
-                <w:rFonts w:asciiTheme="minorHAnsi" w:eastAsiaTheme="minorEastAsia" w:hAnsiTheme="minorHAnsi" w:cstheme="minorBidi"/>
-                <w:color w:val="000000" w:themeColor="text1"/>
-              </w:rPr>
-              <w:t>e</w:t>
-            </w:r>
-            <w:r>
-              <w:rPr>
-                <w:rFonts w:asciiTheme="minorHAnsi" w:eastAsiaTheme="minorEastAsia" w:hAnsiTheme="minorHAnsi" w:cstheme="minorBidi"/>
-                <w:color w:val="000000" w:themeColor="text1"/>
-              </w:rPr>
-              <w:t xml:space="preserve"> como abordarlas.</w:t>
-            </w:r>
-          </w:p>
-        </w:tc>
-        <w:tc>
-          <w:tcPr>
-            <w:tcW w:w="2052" w:type="dxa"/>
+              <w:t>En caso de posibles dificultades no plantee como abordarlas.</w:t>
+            </w:r>
+          </w:p>
+        </w:tc>
+        <w:tc>
+          <w:tcPr>
+            <w:tcW w:w="1731" w:type="dxa"/>
           </w:tcPr>
           <w:p>
             <w:pPr>
@@ -7343,35 +6815,7 @@
                 <w:rFonts w:asciiTheme="minorHAnsi" w:eastAsiaTheme="minorEastAsia" w:hAnsiTheme="minorHAnsi" w:cstheme="minorBidi"/>
                 <w:color w:val="000000" w:themeColor="text1"/>
               </w:rPr>
-              <w:t>No justifiqué</w:t>
-            </w:r>
-            <w:r>
-              <w:rPr>
-                <w:rFonts w:asciiTheme="minorHAnsi" w:eastAsiaTheme="minorEastAsia" w:hAnsiTheme="minorHAnsi" w:cstheme="minorBidi"/>
-                <w:color w:val="000000" w:themeColor="text1"/>
-              </w:rPr>
-              <w:t xml:space="preserve"> </w:t>
-            </w:r>
-            <w:r>
-              <w:rPr>
-                <w:rFonts w:asciiTheme="minorHAnsi" w:eastAsiaTheme="minorEastAsia" w:hAnsiTheme="minorHAnsi" w:cstheme="minorBidi"/>
-                <w:color w:val="000000" w:themeColor="text1"/>
-              </w:rPr>
-              <w:t xml:space="preserve">las razones de porque </w:t>
-            </w:r>
-            <w:r>
-              <w:rPr>
-                <w:rFonts w:asciiTheme="minorHAnsi" w:eastAsiaTheme="minorEastAsia" w:hAnsiTheme="minorHAnsi" w:cstheme="minorBidi"/>
-                <w:color w:val="000000" w:themeColor="text1"/>
-              </w:rPr>
-              <w:t>mi</w:t>
-            </w:r>
-            <w:r>
-              <w:rPr>
-                <w:rFonts w:asciiTheme="minorHAnsi" w:eastAsiaTheme="minorEastAsia" w:hAnsiTheme="minorHAnsi" w:cstheme="minorBidi"/>
-                <w:color w:val="000000" w:themeColor="text1"/>
-              </w:rPr>
-              <w:t xml:space="preserve"> proyecto puede desarrollarse. </w:t>
+              <w:t xml:space="preserve">No justifiqué las razones de porque mi proyecto puede desarrollarse. </w:t>
             </w:r>
             <w:r>
               <w:br/>
@@ -7397,7 +6841,7 @@
         </w:tc>
         <w:tc>
           <w:tcPr>
-            <w:tcW w:w="1449" w:type="dxa"/>
+            <w:tcW w:w="1362" w:type="dxa"/>
             <w:vAlign w:val="center"/>
           </w:tcPr>
           <w:p>
@@ -7420,6 +6864,60 @@
                 <w:lang w:eastAsia="es-CL"/>
               </w:rPr>
               <w:t>5</w:t>
+            </w:r>
+          </w:p>
+        </w:tc>
+        <w:tc>
+          <w:tcPr>
+            <w:tcW w:w="878" w:type="dxa"/>
+          </w:tcPr>
+          <w:p>
+            <w:pPr>
+              <w:jc w:val="center"/>
+              <w:rPr>
+                <w:rFonts w:asciiTheme="minorHAnsi" w:eastAsiaTheme="minorEastAsia" w:hAnsiTheme="minorHAnsi" w:cstheme="minorBidi"/>
+                <w:b/>
+                <w:bCs/>
+                <w:color w:val="3B3838" w:themeColor="background2" w:themeShade="40"/>
+                <w:lang w:eastAsia="es-CL"/>
+              </w:rPr>
+            </w:pPr>
+            <w:r>
+              <w:rPr>
+                <w:rFonts w:asciiTheme="minorHAnsi" w:eastAsiaTheme="minorEastAsia" w:hAnsiTheme="minorHAnsi" w:cstheme="minorBidi"/>
+                <w:b/>
+                <w:bCs/>
+                <w:color w:val="3B3838" w:themeColor="background2" w:themeShade="40"/>
+                <w:lang w:eastAsia="es-CL"/>
+              </w:rPr>
+              <w:t>80%</w:t>
+            </w:r>
+          </w:p>
+        </w:tc>
+        <w:tc>
+          <w:tcPr>
+            <w:tcW w:w="878" w:type="dxa"/>
+          </w:tcPr>
+          <w:p>
+            <w:pPr>
+              <w:jc w:val="center"/>
+              <w:rPr>
+                <w:rFonts w:asciiTheme="minorHAnsi" w:eastAsiaTheme="minorEastAsia" w:hAnsiTheme="minorHAnsi" w:cstheme="minorBidi"/>
+                <w:b/>
+                <w:bCs/>
+                <w:color w:val="3B3838" w:themeColor="background2" w:themeShade="40"/>
+                <w:lang w:eastAsia="es-CL"/>
+              </w:rPr>
+            </w:pPr>
+            <w:r>
+              <w:rPr>
+                <w:rFonts w:asciiTheme="minorHAnsi" w:eastAsiaTheme="minorEastAsia" w:hAnsiTheme="minorHAnsi" w:cstheme="minorBidi"/>
+                <w:b/>
+                <w:bCs/>
+                <w:color w:val="3B3838" w:themeColor="background2" w:themeShade="40"/>
+                <w:lang w:eastAsia="es-CL"/>
+              </w:rPr>
+              <w:t>Me faltó anticiparme a los problemas; expliqué los tiempos y recursos, pero no dejé un plan B por si algo sale mal.</w:t>
             </w:r>
           </w:p>
         </w:tc>
@@ -7430,7 +6928,7 @@
         </w:trPr>
         <w:tc>
           <w:tcPr>
-            <w:tcW w:w="2972" w:type="dxa"/>
+            <w:tcW w:w="2327" w:type="dxa"/>
             <w:vAlign w:val="center"/>
           </w:tcPr>
           <w:p>
@@ -7448,21 +6946,13 @@
                 <w:color w:val="000000" w:themeColor="text1"/>
                 <w:lang w:eastAsia="es-CL"/>
               </w:rPr>
-              <w:t>5. Formula objetivos claros, concisos y coherentes con la disciplina y la situación a abordar.</w:t>
-            </w:r>
-            <w:r>
-              <w:rPr>
-                <w:rFonts w:asciiTheme="minorHAnsi" w:eastAsiaTheme="minorEastAsia" w:hAnsiTheme="minorHAnsi" w:cstheme="minorBidi"/>
-                <w:color w:val="000000" w:themeColor="text1"/>
-                <w:lang w:eastAsia="es-CL"/>
-              </w:rPr>
-              <w:t xml:space="preserve"> </w:t>
-            </w:r>
-          </w:p>
-        </w:tc>
-        <w:tc>
-          <w:tcPr>
-            <w:tcW w:w="2268" w:type="dxa"/>
+              <w:t xml:space="preserve">5. Formula objetivos claros, concisos y coherentes con la disciplina y la situación a abordar. </w:t>
+            </w:r>
+          </w:p>
+        </w:tc>
+        <w:tc>
+          <w:tcPr>
+            <w:tcW w:w="2001" w:type="dxa"/>
           </w:tcPr>
           <w:p>
             <w:pPr>
@@ -7478,27 +6968,13 @@
                 <w:rFonts w:asciiTheme="minorHAnsi" w:eastAsiaTheme="minorEastAsia" w:hAnsiTheme="minorHAnsi" w:cstheme="minorBidi"/>
                 <w:color w:val="000000" w:themeColor="text1"/>
               </w:rPr>
-              <w:t>Formul</w:t>
-            </w:r>
-            <w:r>
-              <w:rPr>
-                <w:rFonts w:asciiTheme="minorHAnsi" w:eastAsiaTheme="minorEastAsia" w:hAnsiTheme="minorHAnsi" w:cstheme="minorBidi"/>
-                <w:color w:val="000000" w:themeColor="text1"/>
-              </w:rPr>
-              <w:t>é</w:t>
-            </w:r>
-            <w:r>
-              <w:rPr>
-                <w:rFonts w:asciiTheme="minorHAnsi" w:eastAsiaTheme="minorEastAsia" w:hAnsiTheme="minorHAnsi" w:cstheme="minorBidi"/>
-                <w:color w:val="000000" w:themeColor="text1"/>
-              </w:rPr>
-              <w:t xml:space="preserve"> objetivos claros, concisos y coherentes con la disciplina y la situación a abordar.</w:t>
-            </w:r>
-          </w:p>
-        </w:tc>
-        <w:tc>
-          <w:tcPr>
-            <w:tcW w:w="2126" w:type="dxa"/>
+              <w:t>Formulé objetivos claros, concisos y coherentes con la disciplina y la situación a abordar.</w:t>
+            </w:r>
+          </w:p>
+        </w:tc>
+        <w:tc>
+          <w:tcPr>
+            <w:tcW w:w="1896" w:type="dxa"/>
           </w:tcPr>
           <w:p>
             <w:pPr>
@@ -7514,36 +6990,13 @@
                 <w:rFonts w:asciiTheme="minorHAnsi" w:eastAsiaTheme="minorEastAsia" w:hAnsiTheme="minorHAnsi" w:cstheme="minorBidi"/>
                 <w:color w:val="000000" w:themeColor="text1"/>
               </w:rPr>
-              <w:t xml:space="preserve">Formulé </w:t>
-            </w:r>
-            <w:r>
-              <w:rPr>
-                <w:rFonts w:asciiTheme="minorHAnsi" w:eastAsiaTheme="minorEastAsia" w:hAnsiTheme="minorHAnsi" w:cstheme="minorBidi"/>
-                <w:color w:val="000000" w:themeColor="text1"/>
-              </w:rPr>
-              <w:t xml:space="preserve">objetivos claros y coherentes con la situación a abordar, pero imprecisos </w:t>
-            </w:r>
-            <w:proofErr w:type="gramStart"/>
-            <w:r>
-              <w:rPr>
-                <w:rFonts w:asciiTheme="minorHAnsi" w:eastAsiaTheme="minorEastAsia" w:hAnsiTheme="minorHAnsi" w:cstheme="minorBidi"/>
-                <w:color w:val="000000" w:themeColor="text1"/>
-              </w:rPr>
-              <w:t>de acuerdo a</w:t>
-            </w:r>
-            <w:proofErr w:type="gramEnd"/>
-            <w:r>
-              <w:rPr>
-                <w:rFonts w:asciiTheme="minorHAnsi" w:eastAsiaTheme="minorEastAsia" w:hAnsiTheme="minorHAnsi" w:cstheme="minorBidi"/>
-                <w:color w:val="000000" w:themeColor="text1"/>
-              </w:rPr>
-              <w:t xml:space="preserve"> la disciplina. </w:t>
-            </w:r>
-          </w:p>
-        </w:tc>
-        <w:tc>
-          <w:tcPr>
-            <w:tcW w:w="2127" w:type="dxa"/>
+              <w:t xml:space="preserve">Formulé objetivos claros y coherentes con la situación a abordar, pero imprecisos de acuerdo a la disciplina. </w:t>
+            </w:r>
+          </w:p>
+        </w:tc>
+        <w:tc>
+          <w:tcPr>
+            <w:tcW w:w="1921" w:type="dxa"/>
           </w:tcPr>
           <w:p>
             <w:pPr>
@@ -7559,20 +7012,13 @@
                 <w:rFonts w:asciiTheme="minorHAnsi" w:eastAsiaTheme="minorEastAsia" w:hAnsiTheme="minorHAnsi" w:cstheme="minorBidi"/>
                 <w:color w:val="000000" w:themeColor="text1"/>
               </w:rPr>
-              <w:t xml:space="preserve">Formulé </w:t>
-            </w:r>
-            <w:r>
-              <w:rPr>
-                <w:rFonts w:asciiTheme="minorHAnsi" w:eastAsiaTheme="minorEastAsia" w:hAnsiTheme="minorHAnsi" w:cstheme="minorBidi"/>
-                <w:color w:val="000000" w:themeColor="text1"/>
-              </w:rPr>
-              <w:t xml:space="preserve">objetivos confusos, por lo que no queda claro lo que se busca alcanzar ni si es coherente con la situación a abordar.  </w:t>
-            </w:r>
-          </w:p>
-        </w:tc>
-        <w:tc>
-          <w:tcPr>
-            <w:tcW w:w="2052" w:type="dxa"/>
+              <w:t xml:space="preserve">Formulé objetivos confusos, por lo que no queda claro lo que se busca alcanzar ni si es coherente con la situación a abordar.  </w:t>
+            </w:r>
+          </w:p>
+        </w:tc>
+        <w:tc>
+          <w:tcPr>
+            <w:tcW w:w="1731" w:type="dxa"/>
           </w:tcPr>
           <w:p>
             <w:pPr>
@@ -7588,27 +7034,13 @@
                 <w:rFonts w:asciiTheme="minorHAnsi" w:eastAsiaTheme="minorEastAsia" w:hAnsiTheme="minorHAnsi" w:cstheme="minorBidi"/>
                 <w:color w:val="000000" w:themeColor="text1"/>
               </w:rPr>
-              <w:t>No plante</w:t>
-            </w:r>
-            <w:r>
-              <w:rPr>
-                <w:rFonts w:asciiTheme="minorHAnsi" w:eastAsiaTheme="minorEastAsia" w:hAnsiTheme="minorHAnsi" w:cstheme="minorBidi"/>
-                <w:color w:val="000000" w:themeColor="text1"/>
-              </w:rPr>
-              <w:t>e</w:t>
-            </w:r>
-            <w:r>
-              <w:rPr>
-                <w:rFonts w:asciiTheme="minorHAnsi" w:eastAsiaTheme="minorEastAsia" w:hAnsiTheme="minorHAnsi" w:cstheme="minorBidi"/>
-                <w:color w:val="000000" w:themeColor="text1"/>
-              </w:rPr>
-              <w:t xml:space="preserve"> objetivos o estos no son coherentes con la disciplina ni la situación a abordar.</w:t>
-            </w:r>
-          </w:p>
-        </w:tc>
-        <w:tc>
-          <w:tcPr>
-            <w:tcW w:w="1449" w:type="dxa"/>
+              <w:t>No plantee objetivos o estos no son coherentes con la disciplina ni la situación a abordar.</w:t>
+            </w:r>
+          </w:p>
+        </w:tc>
+        <w:tc>
+          <w:tcPr>
+            <w:tcW w:w="1362" w:type="dxa"/>
             <w:vAlign w:val="center"/>
           </w:tcPr>
           <w:p>
@@ -7631,6 +7063,81 @@
                 <w:lang w:eastAsia="es-CL"/>
               </w:rPr>
               <w:t>10</w:t>
+            </w:r>
+          </w:p>
+        </w:tc>
+        <w:tc>
+          <w:tcPr>
+            <w:tcW w:w="878" w:type="dxa"/>
+          </w:tcPr>
+          <w:p>
+            <w:pPr>
+              <w:jc w:val="center"/>
+              <w:rPr>
+                <w:rFonts w:asciiTheme="minorHAnsi" w:eastAsiaTheme="minorEastAsia" w:hAnsiTheme="minorHAnsi" w:cstheme="minorBidi"/>
+                <w:b/>
+                <w:bCs/>
+                <w:color w:val="3B3838" w:themeColor="background2" w:themeShade="40"/>
+                <w:lang w:eastAsia="es-CL"/>
+              </w:rPr>
+            </w:pPr>
+            <w:r>
+              <w:rPr>
+                <w:rFonts w:asciiTheme="minorHAnsi" w:eastAsiaTheme="minorEastAsia" w:hAnsiTheme="minorHAnsi" w:cstheme="minorBidi"/>
+                <w:b/>
+                <w:bCs/>
+                <w:color w:val="3B3838" w:themeColor="background2" w:themeShade="40"/>
+                <w:lang w:eastAsia="es-CL"/>
+              </w:rPr>
+              <w:t>80%</w:t>
+            </w:r>
+          </w:p>
+        </w:tc>
+        <w:tc>
+          <w:tcPr>
+            <w:tcW w:w="878" w:type="dxa"/>
+          </w:tcPr>
+          <w:p>
+            <w:pPr>
+              <w:jc w:val="center"/>
+              <w:rPr>
+                <w:rFonts w:asciiTheme="minorHAnsi" w:eastAsiaTheme="minorEastAsia" w:hAnsiTheme="minorHAnsi" w:cstheme="minorBidi"/>
+                <w:b/>
+                <w:bCs/>
+                <w:color w:val="3B3838" w:themeColor="background2" w:themeShade="40"/>
+                <w:lang w:eastAsia="es-CL"/>
+              </w:rPr>
+            </w:pPr>
+            <w:r>
+              <w:rPr>
+                <w:rFonts w:asciiTheme="minorHAnsi" w:eastAsiaTheme="minorEastAsia" w:hAnsiTheme="minorHAnsi" w:cstheme="minorBidi"/>
+                <w:b/>
+                <w:bCs/>
+                <w:color w:val="3B3838" w:themeColor="background2" w:themeShade="40"/>
+                <w:lang w:eastAsia="es-CL"/>
+              </w:rPr>
+              <w:t>Definí bien lo que quiero lograr,</w:t>
+            </w:r>
+            <w:r>
+              <w:rPr>
+                <w:rFonts w:asciiTheme="minorHAnsi" w:eastAsiaTheme="minorEastAsia" w:hAnsiTheme="minorHAnsi" w:cstheme="minorBidi"/>
+                <w:b/>
+                <w:bCs/>
+                <w:color w:val="3B3838" w:themeColor="background2" w:themeShade="40"/>
+                <w:lang w:eastAsia="es-CL"/>
+              </w:rPr>
+              <w:t xml:space="preserve"> pero algunos objetivos fueron alcanzables por pobre </w:t>
+            </w:r>
+            <w:r>
+              <w:rPr>
+                <w:rFonts w:asciiTheme="minorHAnsi" w:eastAsiaTheme="minorEastAsia" w:hAnsiTheme="minorHAnsi" w:cstheme="minorBidi"/>
+                <w:b/>
+                <w:bCs/>
+                <w:color w:val="3B3838" w:themeColor="background2" w:themeShade="40"/>
+                <w:lang w:eastAsia="es-CL"/>
+              </w:rPr>
+              <w:lastRenderedPageBreak/>
+              <w:t>planificación de tecnologías.</w:t>
             </w:r>
           </w:p>
         </w:tc>
@@ -7641,7 +7148,7 @@
         </w:trPr>
         <w:tc>
           <w:tcPr>
-            <w:tcW w:w="2972" w:type="dxa"/>
+            <w:tcW w:w="2327" w:type="dxa"/>
             <w:vAlign w:val="center"/>
           </w:tcPr>
           <w:p>
@@ -7659,13 +7166,14 @@
                 <w:color w:val="000000" w:themeColor="text1"/>
                 <w:lang w:eastAsia="es-CL"/>
               </w:rPr>
+              <w:lastRenderedPageBreak/>
               <w:t>6. Propone una metodología de trabajo que permite alcanzar los objetivos propuestos y es pertinente con los requerimientos disciplinares.</w:t>
             </w:r>
           </w:p>
         </w:tc>
         <w:tc>
           <w:tcPr>
-            <w:tcW w:w="2268" w:type="dxa"/>
+            <w:tcW w:w="2001" w:type="dxa"/>
           </w:tcPr>
           <w:p>
             <w:pPr>
@@ -7681,27 +7189,13 @@
                 <w:rFonts w:asciiTheme="minorHAnsi" w:eastAsiaTheme="minorEastAsia" w:hAnsiTheme="minorHAnsi" w:cstheme="minorBidi"/>
                 <w:color w:val="000000" w:themeColor="text1"/>
               </w:rPr>
-              <w:t>Describ</w:t>
-            </w:r>
-            <w:r>
-              <w:rPr>
-                <w:rFonts w:asciiTheme="minorHAnsi" w:eastAsiaTheme="minorEastAsia" w:hAnsiTheme="minorHAnsi" w:cstheme="minorBidi"/>
-                <w:color w:val="000000" w:themeColor="text1"/>
-              </w:rPr>
-              <w:t>í</w:t>
-            </w:r>
-            <w:r>
-              <w:rPr>
-                <w:rFonts w:asciiTheme="minorHAnsi" w:eastAsiaTheme="minorEastAsia" w:hAnsiTheme="minorHAnsi" w:cstheme="minorBidi"/>
-                <w:color w:val="000000" w:themeColor="text1"/>
-              </w:rPr>
-              <w:t xml:space="preserve"> una metodología pertinente con los requerimientos disciplinares, contemplando todos los aspectos necesarios para alcanzar los objetivos planteados.</w:t>
-            </w:r>
-          </w:p>
-        </w:tc>
-        <w:tc>
-          <w:tcPr>
-            <w:tcW w:w="2126" w:type="dxa"/>
+              <w:t>Describí una metodología pertinente con los requerimientos disciplinares, contemplando todos los aspectos necesarios para alcanzar los objetivos planteados.</w:t>
+            </w:r>
+          </w:p>
+        </w:tc>
+        <w:tc>
+          <w:tcPr>
+            <w:tcW w:w="1896" w:type="dxa"/>
           </w:tcPr>
           <w:p>
             <w:pPr>
@@ -7717,34 +7211,13 @@
                 <w:rFonts w:asciiTheme="minorHAnsi" w:eastAsiaTheme="minorEastAsia" w:hAnsiTheme="minorHAnsi" w:cstheme="minorBidi"/>
                 <w:color w:val="000000" w:themeColor="text1"/>
               </w:rPr>
-              <w:t xml:space="preserve">Describí </w:t>
-            </w:r>
-            <w:r>
-              <w:rPr>
-                <w:rFonts w:asciiTheme="minorHAnsi" w:eastAsiaTheme="minorEastAsia" w:hAnsiTheme="minorHAnsi" w:cstheme="minorBidi"/>
-                <w:color w:val="000000" w:themeColor="text1"/>
-              </w:rPr>
-              <w:t>una metodología pertinente con los requerimientos disciplinares, pero no contempl</w:t>
-            </w:r>
-            <w:r>
-              <w:rPr>
-                <w:rFonts w:asciiTheme="minorHAnsi" w:eastAsiaTheme="minorEastAsia" w:hAnsiTheme="minorHAnsi" w:cstheme="minorBidi"/>
-                <w:color w:val="000000" w:themeColor="text1"/>
-              </w:rPr>
-              <w:t>é</w:t>
-            </w:r>
-            <w:r>
-              <w:rPr>
-                <w:rFonts w:asciiTheme="minorHAnsi" w:eastAsiaTheme="minorEastAsia" w:hAnsiTheme="minorHAnsi" w:cstheme="minorBidi"/>
-                <w:color w:val="000000" w:themeColor="text1"/>
-              </w:rPr>
-              <w:t xml:space="preserve"> todos los aspectos necesarios para alcanzar los objetivos planteados.</w:t>
-            </w:r>
-          </w:p>
-        </w:tc>
-        <w:tc>
-          <w:tcPr>
-            <w:tcW w:w="2127" w:type="dxa"/>
+              <w:t>Describí una metodología pertinente con los requerimientos disciplinares, pero no contemplé todos los aspectos necesarios para alcanzar los objetivos planteados.</w:t>
+            </w:r>
+          </w:p>
+        </w:tc>
+        <w:tc>
+          <w:tcPr>
+            <w:tcW w:w="1921" w:type="dxa"/>
           </w:tcPr>
           <w:p>
             <w:pPr>
@@ -7760,20 +7233,13 @@
                 <w:rFonts w:asciiTheme="minorHAnsi" w:eastAsiaTheme="minorEastAsia" w:hAnsiTheme="minorHAnsi" w:cstheme="minorBidi"/>
                 <w:color w:val="000000" w:themeColor="text1"/>
               </w:rPr>
-              <w:t xml:space="preserve">Describí </w:t>
-            </w:r>
-            <w:r>
-              <w:rPr>
-                <w:rFonts w:asciiTheme="minorHAnsi" w:eastAsiaTheme="minorEastAsia" w:hAnsiTheme="minorHAnsi" w:cstheme="minorBidi"/>
-                <w:color w:val="000000" w:themeColor="text1"/>
-              </w:rPr>
-              <w:t>una metodología que no es del todo pertinente para lograr los objetivos planteados.</w:t>
-            </w:r>
-          </w:p>
-        </w:tc>
-        <w:tc>
-          <w:tcPr>
-            <w:tcW w:w="2052" w:type="dxa"/>
+              <w:t>Describí una metodología que no es del todo pertinente para lograr los objetivos planteados.</w:t>
+            </w:r>
+          </w:p>
+        </w:tc>
+        <w:tc>
+          <w:tcPr>
+            <w:tcW w:w="1731" w:type="dxa"/>
           </w:tcPr>
           <w:p>
             <w:pPr>
@@ -7789,27 +7255,13 @@
                 <w:rFonts w:asciiTheme="minorHAnsi" w:eastAsiaTheme="minorEastAsia" w:hAnsiTheme="minorHAnsi" w:cstheme="minorBidi"/>
                 <w:color w:val="000000" w:themeColor="text1"/>
               </w:rPr>
-              <w:t>No describ</w:t>
-            </w:r>
-            <w:r>
-              <w:rPr>
-                <w:rFonts w:asciiTheme="minorHAnsi" w:eastAsiaTheme="minorEastAsia" w:hAnsiTheme="minorHAnsi" w:cstheme="minorBidi"/>
-                <w:color w:val="000000" w:themeColor="text1"/>
-              </w:rPr>
-              <w:t>í</w:t>
-            </w:r>
-            <w:r>
-              <w:rPr>
-                <w:rFonts w:asciiTheme="minorHAnsi" w:eastAsiaTheme="minorEastAsia" w:hAnsiTheme="minorHAnsi" w:cstheme="minorBidi"/>
-                <w:color w:val="000000" w:themeColor="text1"/>
-              </w:rPr>
-              <w:t xml:space="preserve"> una metodología, o bien esta no es pertinente para lograr los objetivos propuestos. </w:t>
-            </w:r>
-          </w:p>
-        </w:tc>
-        <w:tc>
-          <w:tcPr>
-            <w:tcW w:w="1449" w:type="dxa"/>
+              <w:t xml:space="preserve">No describí una metodología, o bien esta no es pertinente para lograr los objetivos propuestos. </w:t>
+            </w:r>
+          </w:p>
+        </w:tc>
+        <w:tc>
+          <w:tcPr>
+            <w:tcW w:w="1362" w:type="dxa"/>
             <w:vAlign w:val="center"/>
           </w:tcPr>
           <w:p>
@@ -7832,6 +7284,60 @@
                 <w:lang w:eastAsia="es-CL"/>
               </w:rPr>
               <w:t>10</w:t>
+            </w:r>
+          </w:p>
+        </w:tc>
+        <w:tc>
+          <w:tcPr>
+            <w:tcW w:w="878" w:type="dxa"/>
+          </w:tcPr>
+          <w:p>
+            <w:pPr>
+              <w:jc w:val="center"/>
+              <w:rPr>
+                <w:rFonts w:asciiTheme="minorHAnsi" w:eastAsiaTheme="minorEastAsia" w:hAnsiTheme="minorHAnsi" w:cstheme="minorBidi"/>
+                <w:b/>
+                <w:bCs/>
+                <w:color w:val="3B3838" w:themeColor="background2" w:themeShade="40"/>
+                <w:lang w:eastAsia="es-CL"/>
+              </w:rPr>
+            </w:pPr>
+            <w:r>
+              <w:rPr>
+                <w:rFonts w:asciiTheme="minorHAnsi" w:eastAsiaTheme="minorEastAsia" w:hAnsiTheme="minorHAnsi" w:cstheme="minorBidi"/>
+                <w:b/>
+                <w:bCs/>
+                <w:color w:val="3B3838" w:themeColor="background2" w:themeShade="40"/>
+                <w:lang w:eastAsia="es-CL"/>
+              </w:rPr>
+              <w:t>100%</w:t>
+            </w:r>
+          </w:p>
+        </w:tc>
+        <w:tc>
+          <w:tcPr>
+            <w:tcW w:w="878" w:type="dxa"/>
+          </w:tcPr>
+          <w:p>
+            <w:pPr>
+              <w:jc w:val="center"/>
+              <w:rPr>
+                <w:rFonts w:asciiTheme="minorHAnsi" w:eastAsiaTheme="minorEastAsia" w:hAnsiTheme="minorHAnsi" w:cstheme="minorBidi"/>
+                <w:b/>
+                <w:bCs/>
+                <w:color w:val="3B3838" w:themeColor="background2" w:themeShade="40"/>
+                <w:lang w:eastAsia="es-CL"/>
+              </w:rPr>
+            </w:pPr>
+            <w:r>
+              <w:rPr>
+                <w:rFonts w:asciiTheme="minorHAnsi" w:eastAsiaTheme="minorEastAsia" w:hAnsiTheme="minorHAnsi" w:cstheme="minorBidi"/>
+                <w:b/>
+                <w:bCs/>
+                <w:color w:val="3B3838" w:themeColor="background2" w:themeShade="40"/>
+                <w:lang w:eastAsia="es-CL"/>
+              </w:rPr>
+              <w:t>Definí paso a paso la forma de trabajo y cubrí todos los puntos para alcanzar los objetivos sin dejar cabos sueltos.</w:t>
             </w:r>
           </w:p>
         </w:tc>
@@ -7842,7 +7348,7 @@
         </w:trPr>
         <w:tc>
           <w:tcPr>
-            <w:tcW w:w="2972" w:type="dxa"/>
+            <w:tcW w:w="2327" w:type="dxa"/>
             <w:vAlign w:val="center"/>
           </w:tcPr>
           <w:p>
@@ -7860,15 +7366,7 @@
                 <w:color w:val="000000" w:themeColor="text1"/>
                 <w:lang w:eastAsia="es-CL"/>
               </w:rPr>
-              <w:t>7. Establece un plan de trabajo para su proyecto APT considerando los recursos, duración, facilitadores y obstaculizadores en el desarrollo de las actividades</w:t>
-            </w:r>
-            <w:r>
-              <w:rPr>
-                <w:rFonts w:asciiTheme="minorHAnsi" w:eastAsiaTheme="minorEastAsia" w:hAnsiTheme="minorHAnsi" w:cstheme="minorBidi"/>
-                <w:color w:val="000000" w:themeColor="text1"/>
-                <w:lang w:eastAsia="es-CL"/>
-              </w:rPr>
-              <w:t xml:space="preserve">. </w:t>
+              <w:t xml:space="preserve">7. Establece un plan de trabajo para su proyecto APT considerando los recursos, duración, facilitadores y obstaculizadores en el desarrollo de las actividades. </w:t>
             </w:r>
           </w:p>
           <w:p>
@@ -7884,7 +7382,7 @@
         </w:tc>
         <w:tc>
           <w:tcPr>
-            <w:tcW w:w="2268" w:type="dxa"/>
+            <w:tcW w:w="2001" w:type="dxa"/>
           </w:tcPr>
           <w:p>
             <w:pPr>
@@ -7900,41 +7398,13 @@
                 <w:rFonts w:asciiTheme="minorHAnsi" w:eastAsiaTheme="minorEastAsia" w:hAnsiTheme="minorHAnsi" w:cstheme="minorBidi"/>
                 <w:color w:val="000000" w:themeColor="text1"/>
               </w:rPr>
-              <w:t>Establec</w:t>
-            </w:r>
-            <w:r>
-              <w:rPr>
-                <w:rFonts w:asciiTheme="minorHAnsi" w:eastAsiaTheme="minorEastAsia" w:hAnsiTheme="minorHAnsi" w:cstheme="minorBidi"/>
-                <w:color w:val="000000" w:themeColor="text1"/>
-              </w:rPr>
-              <w:t>í</w:t>
-            </w:r>
-            <w:r>
-              <w:rPr>
-                <w:rFonts w:asciiTheme="minorHAnsi" w:eastAsiaTheme="minorEastAsia" w:hAnsiTheme="minorHAnsi" w:cstheme="minorBidi"/>
-                <w:color w:val="000000" w:themeColor="text1"/>
-              </w:rPr>
-              <w:t xml:space="preserve"> un plan de trabajo con todas las actividades necesarias para cumplir </w:t>
-            </w:r>
-            <w:r>
-              <w:rPr>
-                <w:rFonts w:asciiTheme="minorHAnsi" w:eastAsiaTheme="minorEastAsia" w:hAnsiTheme="minorHAnsi" w:cstheme="minorBidi"/>
-                <w:color w:val="000000" w:themeColor="text1"/>
-              </w:rPr>
-              <w:t>mis</w:t>
-            </w:r>
-            <w:r>
-              <w:rPr>
-                <w:rFonts w:asciiTheme="minorHAnsi" w:eastAsiaTheme="minorEastAsia" w:hAnsiTheme="minorHAnsi" w:cstheme="minorBidi"/>
-                <w:color w:val="000000" w:themeColor="text1"/>
-              </w:rPr>
-              <w:t xml:space="preserve"> objetivos, teniendo en consideración los recursos, duración, facilitadores y obstaculizadores. </w:t>
-            </w:r>
-          </w:p>
-        </w:tc>
-        <w:tc>
-          <w:tcPr>
-            <w:tcW w:w="2126" w:type="dxa"/>
+              <w:t xml:space="preserve">Establecí un plan de trabajo con todas las actividades necesarias para cumplir mis objetivos, teniendo en consideración los recursos, duración, facilitadores y obstaculizadores. </w:t>
+            </w:r>
+          </w:p>
+        </w:tc>
+        <w:tc>
+          <w:tcPr>
+            <w:tcW w:w="1896" w:type="dxa"/>
           </w:tcPr>
           <w:p>
             <w:pPr>
@@ -7950,34 +7420,13 @@
                 <w:rFonts w:asciiTheme="minorHAnsi" w:eastAsiaTheme="minorEastAsia" w:hAnsiTheme="minorHAnsi" w:cstheme="minorBidi"/>
                 <w:color w:val="000000" w:themeColor="text1"/>
               </w:rPr>
-              <w:t xml:space="preserve">Establecí </w:t>
-            </w:r>
-            <w:r>
-              <w:rPr>
-                <w:rFonts w:asciiTheme="minorHAnsi" w:eastAsiaTheme="minorEastAsia" w:hAnsiTheme="minorHAnsi" w:cstheme="minorBidi"/>
-                <w:color w:val="000000" w:themeColor="text1"/>
-              </w:rPr>
-              <w:t xml:space="preserve">un plan de trabajo con la mayoría de las actividades necesarias para cumplir </w:t>
-            </w:r>
-            <w:r>
-              <w:rPr>
-                <w:rFonts w:asciiTheme="minorHAnsi" w:eastAsiaTheme="minorEastAsia" w:hAnsiTheme="minorHAnsi" w:cstheme="minorBidi"/>
-                <w:color w:val="000000" w:themeColor="text1"/>
-              </w:rPr>
-              <w:t>mis</w:t>
-            </w:r>
-            <w:r>
-              <w:rPr>
-                <w:rFonts w:asciiTheme="minorHAnsi" w:eastAsiaTheme="minorEastAsia" w:hAnsiTheme="minorHAnsi" w:cstheme="minorBidi"/>
-                <w:color w:val="000000" w:themeColor="text1"/>
-              </w:rPr>
-              <w:t xml:space="preserve"> objetivos, teniendo en consideración los recursos, duración, facilitadores y obstaculizadores. </w:t>
-            </w:r>
-          </w:p>
-        </w:tc>
-        <w:tc>
-          <w:tcPr>
-            <w:tcW w:w="2127" w:type="dxa"/>
+              <w:t xml:space="preserve">Establecí un plan de trabajo con la mayoría de las actividades necesarias para cumplir mis objetivos, teniendo en consideración los recursos, duración, facilitadores y obstaculizadores. </w:t>
+            </w:r>
+          </w:p>
+        </w:tc>
+        <w:tc>
+          <w:tcPr>
+            <w:tcW w:w="1921" w:type="dxa"/>
           </w:tcPr>
           <w:p>
             <w:pPr>
@@ -7993,34 +7442,13 @@
                 <w:rFonts w:asciiTheme="minorHAnsi" w:eastAsiaTheme="minorEastAsia" w:hAnsiTheme="minorHAnsi" w:cstheme="minorBidi"/>
                 <w:color w:val="000000" w:themeColor="text1"/>
               </w:rPr>
-              <w:t xml:space="preserve">Establecí </w:t>
-            </w:r>
-            <w:r>
-              <w:rPr>
-                <w:rFonts w:asciiTheme="minorHAnsi" w:eastAsiaTheme="minorEastAsia" w:hAnsiTheme="minorHAnsi" w:cstheme="minorBidi"/>
-                <w:color w:val="000000" w:themeColor="text1"/>
-              </w:rPr>
-              <w:t xml:space="preserve">un plan de trabajo que carece de actividades necesarias para cumplir </w:t>
-            </w:r>
-            <w:r>
-              <w:rPr>
-                <w:rFonts w:asciiTheme="minorHAnsi" w:eastAsiaTheme="minorEastAsia" w:hAnsiTheme="minorHAnsi" w:cstheme="minorBidi"/>
-                <w:color w:val="000000" w:themeColor="text1"/>
-              </w:rPr>
-              <w:t>mis</w:t>
-            </w:r>
-            <w:r>
-              <w:rPr>
-                <w:rFonts w:asciiTheme="minorHAnsi" w:eastAsiaTheme="minorEastAsia" w:hAnsiTheme="minorHAnsi" w:cstheme="minorBidi"/>
-                <w:color w:val="000000" w:themeColor="text1"/>
-              </w:rPr>
-              <w:t xml:space="preserve"> objetivos y/o no tiene en consideración los recursos, duración, facilitadores y obstaculizadores. </w:t>
-            </w:r>
-          </w:p>
-        </w:tc>
-        <w:tc>
-          <w:tcPr>
-            <w:tcW w:w="2052" w:type="dxa"/>
+              <w:t xml:space="preserve">Establecí un plan de trabajo que carece de actividades necesarias para cumplir mis objetivos y/o no tiene en consideración los recursos, duración, facilitadores y obstaculizadores. </w:t>
+            </w:r>
+          </w:p>
+        </w:tc>
+        <w:tc>
+          <w:tcPr>
+            <w:tcW w:w="1731" w:type="dxa"/>
           </w:tcPr>
           <w:p>
             <w:pPr>
@@ -8036,55 +7464,13 @@
                 <w:rFonts w:asciiTheme="minorHAnsi" w:eastAsiaTheme="minorEastAsia" w:hAnsiTheme="minorHAnsi" w:cstheme="minorBidi"/>
                 <w:color w:val="000000" w:themeColor="text1"/>
               </w:rPr>
-              <w:t>No establec</w:t>
-            </w:r>
-            <w:r>
-              <w:rPr>
-                <w:rFonts w:asciiTheme="minorHAnsi" w:eastAsiaTheme="minorEastAsia" w:hAnsiTheme="minorHAnsi" w:cstheme="minorBidi"/>
-                <w:color w:val="000000" w:themeColor="text1"/>
-              </w:rPr>
-              <w:t>í</w:t>
-            </w:r>
-            <w:r>
-              <w:rPr>
-                <w:rFonts w:asciiTheme="minorHAnsi" w:eastAsiaTheme="minorEastAsia" w:hAnsiTheme="minorHAnsi" w:cstheme="minorBidi"/>
-                <w:color w:val="000000" w:themeColor="text1"/>
-              </w:rPr>
-              <w:t xml:space="preserve"> un plan de trabajo, o bien este no </w:t>
-            </w:r>
-            <w:r>
-              <w:rPr>
-                <w:rFonts w:asciiTheme="minorHAnsi" w:eastAsiaTheme="minorEastAsia" w:hAnsiTheme="minorHAnsi" w:cstheme="minorBidi"/>
-                <w:color w:val="000000" w:themeColor="text1"/>
-              </w:rPr>
-              <w:t>permite</w:t>
-            </w:r>
-            <w:r>
-              <w:rPr>
-                <w:rFonts w:asciiTheme="minorHAnsi" w:eastAsiaTheme="minorEastAsia" w:hAnsiTheme="minorHAnsi" w:cstheme="minorBidi"/>
-                <w:color w:val="000000" w:themeColor="text1"/>
-              </w:rPr>
-              <w:t xml:space="preserve"> cumplir los objetivos de</w:t>
-            </w:r>
-            <w:r>
-              <w:rPr>
-                <w:rFonts w:asciiTheme="minorHAnsi" w:eastAsiaTheme="minorEastAsia" w:hAnsiTheme="minorHAnsi" w:cstheme="minorBidi"/>
-                <w:color w:val="000000" w:themeColor="text1"/>
-              </w:rPr>
-              <w:t xml:space="preserve"> mi </w:t>
-            </w:r>
-            <w:r>
-              <w:rPr>
-                <w:rFonts w:asciiTheme="minorHAnsi" w:eastAsiaTheme="minorEastAsia" w:hAnsiTheme="minorHAnsi" w:cstheme="minorBidi"/>
-                <w:color w:val="000000" w:themeColor="text1"/>
-              </w:rPr>
-              <w:t>proyecto APT.</w:t>
-            </w:r>
-          </w:p>
-        </w:tc>
-        <w:tc>
-          <w:tcPr>
-            <w:tcW w:w="1449" w:type="dxa"/>
+              <w:t>No establecí un plan de trabajo, o bien este no permite cumplir los objetivos de mi proyecto APT.</w:t>
+            </w:r>
+          </w:p>
+        </w:tc>
+        <w:tc>
+          <w:tcPr>
+            <w:tcW w:w="1362" w:type="dxa"/>
             <w:vAlign w:val="center"/>
           </w:tcPr>
           <w:p>
@@ -8107,6 +7493,60 @@
                 <w:lang w:eastAsia="es-CL"/>
               </w:rPr>
               <w:t>10</w:t>
+            </w:r>
+          </w:p>
+        </w:tc>
+        <w:tc>
+          <w:tcPr>
+            <w:tcW w:w="878" w:type="dxa"/>
+          </w:tcPr>
+          <w:p>
+            <w:pPr>
+              <w:jc w:val="center"/>
+              <w:rPr>
+                <w:rFonts w:asciiTheme="minorHAnsi" w:eastAsiaTheme="minorEastAsia" w:hAnsiTheme="minorHAnsi" w:cstheme="minorBidi"/>
+                <w:b/>
+                <w:bCs/>
+                <w:color w:val="3B3838" w:themeColor="background2" w:themeShade="40"/>
+                <w:lang w:eastAsia="es-CL"/>
+              </w:rPr>
+            </w:pPr>
+            <w:r>
+              <w:rPr>
+                <w:rFonts w:asciiTheme="minorHAnsi" w:eastAsiaTheme="minorEastAsia" w:hAnsiTheme="minorHAnsi" w:cstheme="minorBidi"/>
+                <w:b/>
+                <w:bCs/>
+                <w:color w:val="3B3838" w:themeColor="background2" w:themeShade="40"/>
+                <w:lang w:eastAsia="es-CL"/>
+              </w:rPr>
+              <w:t>60%</w:t>
+            </w:r>
+          </w:p>
+        </w:tc>
+        <w:tc>
+          <w:tcPr>
+            <w:tcW w:w="878" w:type="dxa"/>
+          </w:tcPr>
+          <w:p>
+            <w:pPr>
+              <w:jc w:val="center"/>
+              <w:rPr>
+                <w:rFonts w:asciiTheme="minorHAnsi" w:eastAsiaTheme="minorEastAsia" w:hAnsiTheme="minorHAnsi" w:cstheme="minorBidi"/>
+                <w:b/>
+                <w:bCs/>
+                <w:color w:val="3B3838" w:themeColor="background2" w:themeShade="40"/>
+                <w:lang w:eastAsia="es-CL"/>
+              </w:rPr>
+            </w:pPr>
+            <w:r>
+              <w:rPr>
+                <w:rFonts w:asciiTheme="minorHAnsi" w:eastAsiaTheme="minorEastAsia" w:hAnsiTheme="minorHAnsi" w:cstheme="minorBidi"/>
+                <w:b/>
+                <w:bCs/>
+                <w:color w:val="3B3838" w:themeColor="background2" w:themeShade="40"/>
+                <w:lang w:eastAsia="es-CL"/>
+              </w:rPr>
+              <w:t>Armé la lista de actividades principales, pero omití algunos imponderables, recursos específicos y posibles trabas en el camino.</w:t>
             </w:r>
           </w:p>
         </w:tc>
@@ -8117,7 +7557,7 @@
         </w:trPr>
         <w:tc>
           <w:tcPr>
-            <w:tcW w:w="2972" w:type="dxa"/>
+            <w:tcW w:w="2327" w:type="dxa"/>
             <w:vAlign w:val="center"/>
           </w:tcPr>
           <w:p>
@@ -8141,7 +7581,7 @@
         </w:tc>
         <w:tc>
           <w:tcPr>
-            <w:tcW w:w="2268" w:type="dxa"/>
+            <w:tcW w:w="2001" w:type="dxa"/>
           </w:tcPr>
           <w:p>
             <w:pPr>
@@ -8157,55 +7597,13 @@
                 <w:rFonts w:asciiTheme="minorHAnsi" w:eastAsiaTheme="minorEastAsia" w:hAnsiTheme="minorHAnsi" w:cstheme="minorBidi"/>
                 <w:color w:val="000000" w:themeColor="text1"/>
               </w:rPr>
-              <w:t>Describ</w:t>
-            </w:r>
-            <w:r>
-              <w:rPr>
-                <w:rFonts w:asciiTheme="minorHAnsi" w:eastAsiaTheme="minorEastAsia" w:hAnsiTheme="minorHAnsi" w:cstheme="minorBidi"/>
-                <w:color w:val="000000" w:themeColor="text1"/>
-              </w:rPr>
-              <w:t>í</w:t>
-            </w:r>
-            <w:r>
-              <w:rPr>
-                <w:rFonts w:asciiTheme="minorHAnsi" w:eastAsiaTheme="minorEastAsia" w:hAnsiTheme="minorHAnsi" w:cstheme="minorBidi"/>
-                <w:color w:val="000000" w:themeColor="text1"/>
-              </w:rPr>
-              <w:t xml:space="preserve"> evidencias que permiten dar cuenta del logro de las actividades de</w:t>
-            </w:r>
-            <w:r>
-              <w:rPr>
-                <w:rFonts w:asciiTheme="minorHAnsi" w:eastAsiaTheme="minorEastAsia" w:hAnsiTheme="minorHAnsi" w:cstheme="minorBidi"/>
-                <w:color w:val="000000" w:themeColor="text1"/>
-              </w:rPr>
-              <w:t xml:space="preserve"> mi</w:t>
-            </w:r>
-            <w:r>
-              <w:rPr>
-                <w:rFonts w:asciiTheme="minorHAnsi" w:eastAsiaTheme="minorEastAsia" w:hAnsiTheme="minorHAnsi" w:cstheme="minorBidi"/>
-                <w:color w:val="000000" w:themeColor="text1"/>
-              </w:rPr>
-              <w:t xml:space="preserve"> proyecto APT y justifi</w:t>
-            </w:r>
-            <w:r>
-              <w:rPr>
-                <w:rFonts w:asciiTheme="minorHAnsi" w:eastAsiaTheme="minorEastAsia" w:hAnsiTheme="minorHAnsi" w:cstheme="minorBidi"/>
-                <w:color w:val="000000" w:themeColor="text1"/>
-              </w:rPr>
-              <w:t>qué</w:t>
-            </w:r>
-            <w:r>
-              <w:rPr>
-                <w:rFonts w:asciiTheme="minorHAnsi" w:eastAsiaTheme="minorEastAsia" w:hAnsiTheme="minorHAnsi" w:cstheme="minorBidi"/>
-                <w:color w:val="000000" w:themeColor="text1"/>
-              </w:rPr>
-              <w:t xml:space="preserve"> su selección. </w:t>
-            </w:r>
-          </w:p>
-        </w:tc>
-        <w:tc>
-          <w:tcPr>
-            <w:tcW w:w="2126" w:type="dxa"/>
+              <w:t xml:space="preserve">Describí evidencias que permiten dar cuenta del logro de las actividades de mi proyecto APT y justifiqué su selección. </w:t>
+            </w:r>
+          </w:p>
+        </w:tc>
+        <w:tc>
+          <w:tcPr>
+            <w:tcW w:w="1896" w:type="dxa"/>
           </w:tcPr>
           <w:p>
             <w:pPr>
@@ -8220,48 +7618,13 @@
                 <w:rFonts w:asciiTheme="minorHAnsi" w:eastAsiaTheme="minorEastAsia" w:hAnsiTheme="minorHAnsi" w:cstheme="minorBidi"/>
                 <w:color w:val="000000" w:themeColor="text1"/>
               </w:rPr>
-              <w:t xml:space="preserve">Describí </w:t>
-            </w:r>
-            <w:r>
-              <w:rPr>
-                <w:rFonts w:asciiTheme="minorHAnsi" w:eastAsiaTheme="minorEastAsia" w:hAnsiTheme="minorHAnsi" w:cstheme="minorBidi"/>
-                <w:color w:val="000000" w:themeColor="text1"/>
-              </w:rPr>
-              <w:t>evidencias que permiten dar cuenta del logro de las actividades de</w:t>
-            </w:r>
-            <w:r>
-              <w:rPr>
-                <w:rFonts w:asciiTheme="minorHAnsi" w:eastAsiaTheme="minorEastAsia" w:hAnsiTheme="minorHAnsi" w:cstheme="minorBidi"/>
-                <w:color w:val="000000" w:themeColor="text1"/>
-              </w:rPr>
-              <w:t xml:space="preserve"> mi</w:t>
-            </w:r>
-            <w:r>
-              <w:rPr>
-                <w:rFonts w:asciiTheme="minorHAnsi" w:eastAsiaTheme="minorEastAsia" w:hAnsiTheme="minorHAnsi" w:cstheme="minorBidi"/>
-                <w:color w:val="000000" w:themeColor="text1"/>
-              </w:rPr>
-              <w:t xml:space="preserve"> proyecto APT, pero no justifi</w:t>
-            </w:r>
-            <w:r>
-              <w:rPr>
-                <w:rFonts w:asciiTheme="minorHAnsi" w:eastAsiaTheme="minorEastAsia" w:hAnsiTheme="minorHAnsi" w:cstheme="minorBidi"/>
-                <w:color w:val="000000" w:themeColor="text1"/>
-              </w:rPr>
-              <w:t>qué</w:t>
-            </w:r>
-            <w:r>
-              <w:rPr>
-                <w:rFonts w:asciiTheme="minorHAnsi" w:eastAsiaTheme="minorEastAsia" w:hAnsiTheme="minorHAnsi" w:cstheme="minorBidi"/>
-                <w:color w:val="000000" w:themeColor="text1"/>
-              </w:rPr>
-              <w:t xml:space="preserve"> con claridad su selección.</w:t>
-            </w:r>
-          </w:p>
-        </w:tc>
-        <w:tc>
-          <w:tcPr>
-            <w:tcW w:w="2127" w:type="dxa"/>
+              <w:t>Describí evidencias que permiten dar cuenta del logro de las actividades de mi proyecto APT, pero no justifiqué con claridad su selección.</w:t>
+            </w:r>
+          </w:p>
+        </w:tc>
+        <w:tc>
+          <w:tcPr>
+            <w:tcW w:w="1921" w:type="dxa"/>
           </w:tcPr>
           <w:p>
             <w:pPr>
@@ -8277,55 +7640,13 @@
                 <w:rFonts w:asciiTheme="minorHAnsi" w:eastAsiaTheme="minorEastAsia" w:hAnsiTheme="minorHAnsi" w:cstheme="minorBidi"/>
                 <w:color w:val="000000" w:themeColor="text1"/>
               </w:rPr>
-              <w:t xml:space="preserve">Describí </w:t>
-            </w:r>
-            <w:r>
-              <w:rPr>
-                <w:rFonts w:asciiTheme="minorHAnsi" w:eastAsiaTheme="minorEastAsia" w:hAnsiTheme="minorHAnsi" w:cstheme="minorBidi"/>
-                <w:color w:val="000000" w:themeColor="text1"/>
-              </w:rPr>
-              <w:t>evidencias que permiten dar cuenta del logro de solo algunas actividades de</w:t>
-            </w:r>
-            <w:r>
-              <w:rPr>
-                <w:rFonts w:asciiTheme="minorHAnsi" w:eastAsiaTheme="minorEastAsia" w:hAnsiTheme="minorHAnsi" w:cstheme="minorBidi"/>
-                <w:color w:val="000000" w:themeColor="text1"/>
-              </w:rPr>
-              <w:t xml:space="preserve"> mi</w:t>
-            </w:r>
-            <w:r>
-              <w:rPr>
-                <w:rFonts w:asciiTheme="minorHAnsi" w:eastAsiaTheme="minorEastAsia" w:hAnsiTheme="minorHAnsi" w:cstheme="minorBidi"/>
-                <w:color w:val="000000" w:themeColor="text1"/>
-              </w:rPr>
-              <w:t xml:space="preserve"> proyecto APT y/o </w:t>
-            </w:r>
-            <w:r>
-              <w:rPr>
-                <w:rFonts w:asciiTheme="minorHAnsi" w:eastAsiaTheme="minorEastAsia" w:hAnsiTheme="minorHAnsi" w:cstheme="minorBidi"/>
-                <w:color w:val="000000" w:themeColor="text1"/>
-              </w:rPr>
-              <w:t>no justifiqué</w:t>
-            </w:r>
-            <w:r>
-              <w:rPr>
-                <w:rFonts w:asciiTheme="minorHAnsi" w:eastAsiaTheme="minorEastAsia" w:hAnsiTheme="minorHAnsi" w:cstheme="minorBidi"/>
-                <w:color w:val="000000" w:themeColor="text1"/>
-              </w:rPr>
-              <w:t xml:space="preserve"> </w:t>
-            </w:r>
-            <w:r>
-              <w:rPr>
-                <w:rFonts w:asciiTheme="minorHAnsi" w:eastAsiaTheme="minorEastAsia" w:hAnsiTheme="minorHAnsi" w:cstheme="minorBidi"/>
-                <w:color w:val="000000" w:themeColor="text1"/>
-              </w:rPr>
-              <w:t xml:space="preserve">su selección. </w:t>
-            </w:r>
-          </w:p>
-        </w:tc>
-        <w:tc>
-          <w:tcPr>
-            <w:tcW w:w="2052" w:type="dxa"/>
+              <w:t xml:space="preserve">Describí evidencias que permiten dar cuenta del logro de solo algunas actividades de mi proyecto APT y/o no justifiqué su selección. </w:t>
+            </w:r>
+          </w:p>
+        </w:tc>
+        <w:tc>
+          <w:tcPr>
+            <w:tcW w:w="1731" w:type="dxa"/>
           </w:tcPr>
           <w:p>
             <w:pPr>
@@ -8341,41 +7662,13 @@
                 <w:rFonts w:asciiTheme="minorHAnsi" w:eastAsiaTheme="minorEastAsia" w:hAnsiTheme="minorHAnsi" w:cstheme="minorBidi"/>
                 <w:color w:val="000000" w:themeColor="text1"/>
               </w:rPr>
-              <w:t>No inclu</w:t>
-            </w:r>
-            <w:r>
-              <w:rPr>
-                <w:rFonts w:asciiTheme="minorHAnsi" w:eastAsiaTheme="minorEastAsia" w:hAnsiTheme="minorHAnsi" w:cstheme="minorBidi"/>
-                <w:color w:val="000000" w:themeColor="text1"/>
-              </w:rPr>
-              <w:t>í</w:t>
-            </w:r>
-            <w:r>
-              <w:rPr>
-                <w:rFonts w:asciiTheme="minorHAnsi" w:eastAsiaTheme="minorEastAsia" w:hAnsiTheme="minorHAnsi" w:cstheme="minorBidi"/>
-                <w:color w:val="000000" w:themeColor="text1"/>
-              </w:rPr>
-              <w:t xml:space="preserve"> evidencias que pueden dar cuenta del desarrollo de </w:t>
-            </w:r>
-            <w:r>
-              <w:rPr>
-                <w:rFonts w:asciiTheme="minorHAnsi" w:eastAsiaTheme="minorEastAsia" w:hAnsiTheme="minorHAnsi" w:cstheme="minorBidi"/>
-                <w:color w:val="000000" w:themeColor="text1"/>
-              </w:rPr>
-              <w:t>mi</w:t>
-            </w:r>
-            <w:r>
-              <w:rPr>
-                <w:rFonts w:asciiTheme="minorHAnsi" w:eastAsiaTheme="minorEastAsia" w:hAnsiTheme="minorHAnsi" w:cstheme="minorBidi"/>
-                <w:color w:val="000000" w:themeColor="text1"/>
-              </w:rPr>
-              <w:t xml:space="preserve"> proyecto.</w:t>
-            </w:r>
-          </w:p>
-        </w:tc>
-        <w:tc>
-          <w:tcPr>
-            <w:tcW w:w="1449" w:type="dxa"/>
+              <w:t>No incluí evidencias que pueden dar cuenta del desarrollo de mi proyecto.</w:t>
+            </w:r>
+          </w:p>
+        </w:tc>
+        <w:tc>
+          <w:tcPr>
+            <w:tcW w:w="1362" w:type="dxa"/>
             <w:vAlign w:val="center"/>
           </w:tcPr>
           <w:p>
@@ -8398,6 +7691,60 @@
                 <w:lang w:eastAsia="es-CL"/>
               </w:rPr>
               <w:t>10</w:t>
+            </w:r>
+          </w:p>
+        </w:tc>
+        <w:tc>
+          <w:tcPr>
+            <w:tcW w:w="878" w:type="dxa"/>
+          </w:tcPr>
+          <w:p>
+            <w:pPr>
+              <w:jc w:val="center"/>
+              <w:rPr>
+                <w:rFonts w:asciiTheme="minorHAnsi" w:eastAsiaTheme="minorEastAsia" w:hAnsiTheme="minorHAnsi" w:cstheme="minorBidi"/>
+                <w:b/>
+                <w:bCs/>
+                <w:color w:val="3B3838" w:themeColor="background2" w:themeShade="40"/>
+                <w:lang w:eastAsia="es-CL"/>
+              </w:rPr>
+            </w:pPr>
+            <w:r>
+              <w:rPr>
+                <w:rFonts w:asciiTheme="minorHAnsi" w:eastAsiaTheme="minorEastAsia" w:hAnsiTheme="minorHAnsi" w:cstheme="minorBidi"/>
+                <w:b/>
+                <w:bCs/>
+                <w:color w:val="3B3838" w:themeColor="background2" w:themeShade="40"/>
+                <w:lang w:eastAsia="es-CL"/>
+              </w:rPr>
+              <w:t>100%</w:t>
+            </w:r>
+          </w:p>
+        </w:tc>
+        <w:tc>
+          <w:tcPr>
+            <w:tcW w:w="878" w:type="dxa"/>
+          </w:tcPr>
+          <w:p>
+            <w:pPr>
+              <w:jc w:val="center"/>
+              <w:rPr>
+                <w:rFonts w:asciiTheme="minorHAnsi" w:eastAsiaTheme="minorEastAsia" w:hAnsiTheme="minorHAnsi" w:cstheme="minorBidi"/>
+                <w:b/>
+                <w:bCs/>
+                <w:color w:val="3B3838" w:themeColor="background2" w:themeShade="40"/>
+                <w:lang w:eastAsia="es-CL"/>
+              </w:rPr>
+            </w:pPr>
+            <w:r>
+              <w:rPr>
+                <w:rFonts w:asciiTheme="minorHAnsi" w:eastAsiaTheme="minorEastAsia" w:hAnsiTheme="minorHAnsi" w:cstheme="minorBidi"/>
+                <w:b/>
+                <w:bCs/>
+                <w:color w:val="3B3838" w:themeColor="background2" w:themeShade="40"/>
+                <w:lang w:eastAsia="es-CL"/>
+              </w:rPr>
+              <w:t>Elegí los respaldos precisos para demostrar los avances y justificó bien por qué servía cada evidencia.</w:t>
             </w:r>
           </w:p>
         </w:tc>
@@ -8408,7 +7755,7 @@
         </w:trPr>
         <w:tc>
           <w:tcPr>
-            <w:tcW w:w="2972" w:type="dxa"/>
+            <w:tcW w:w="2327" w:type="dxa"/>
             <w:vAlign w:val="center"/>
           </w:tcPr>
           <w:p>
@@ -8426,13 +7773,22 @@
                 <w:color w:val="000000" w:themeColor="text1"/>
                 <w:lang w:eastAsia="es-CL"/>
               </w:rPr>
-              <w:t xml:space="preserve">9. Utiliza reglas de redacción, ortografía (literal, puntual, acentual) y las normas para citas y referencias. </w:t>
-            </w:r>
-          </w:p>
-        </w:tc>
-        <w:tc>
-          <w:tcPr>
-            <w:tcW w:w="2268" w:type="dxa"/>
+              <w:t xml:space="preserve">9. Utiliza reglas de redacción, </w:t>
+            </w:r>
+            <w:r>
+              <w:rPr>
+                <w:rFonts w:asciiTheme="minorHAnsi" w:eastAsiaTheme="minorEastAsia" w:hAnsiTheme="minorHAnsi" w:cstheme="minorBidi"/>
+                <w:color w:val="000000" w:themeColor="text1"/>
+                <w:lang w:eastAsia="es-CL"/>
+              </w:rPr>
+              <w:lastRenderedPageBreak/>
+              <w:t xml:space="preserve">ortografía (literal, puntual, acentual) y las normas para citas y referencias. </w:t>
+            </w:r>
+          </w:p>
+        </w:tc>
+        <w:tc>
+          <w:tcPr>
+            <w:tcW w:w="2001" w:type="dxa"/>
           </w:tcPr>
           <w:p>
             <w:pPr>
@@ -8448,7 +7804,16 @@
                 <w:rFonts w:asciiTheme="minorHAnsi" w:eastAsiaTheme="minorEastAsia" w:hAnsiTheme="minorHAnsi" w:cstheme="minorBidi"/>
                 <w:color w:val="000000" w:themeColor="text1"/>
               </w:rPr>
-              <w:t>El texto cumple con las reglas ortografía y de redacción en todos sus apartados.</w:t>
+              <w:lastRenderedPageBreak/>
+              <w:t xml:space="preserve">El texto cumple con las reglas </w:t>
+            </w:r>
+            <w:r>
+              <w:rPr>
+                <w:rFonts w:asciiTheme="minorHAnsi" w:eastAsiaTheme="minorEastAsia" w:hAnsiTheme="minorHAnsi" w:cstheme="minorBidi"/>
+                <w:color w:val="000000" w:themeColor="text1"/>
+              </w:rPr>
+              <w:lastRenderedPageBreak/>
+              <w:t>ortografía y de redacción en todos sus apartados.</w:t>
             </w:r>
             <w:r>
               <w:br/>
@@ -8468,27 +7833,13 @@
                 <w:rFonts w:asciiTheme="minorHAnsi" w:eastAsiaTheme="minorEastAsia" w:hAnsiTheme="minorHAnsi" w:cstheme="minorBidi"/>
                 <w:color w:val="000000" w:themeColor="text1"/>
               </w:rPr>
-              <w:t>Utili</w:t>
-            </w:r>
-            <w:r>
-              <w:rPr>
-                <w:rFonts w:asciiTheme="minorHAnsi" w:eastAsiaTheme="minorEastAsia" w:hAnsiTheme="minorHAnsi" w:cstheme="minorBidi"/>
-                <w:color w:val="000000" w:themeColor="text1"/>
-              </w:rPr>
-              <w:t>cé</w:t>
-            </w:r>
-            <w:r>
-              <w:rPr>
-                <w:rFonts w:asciiTheme="minorHAnsi" w:eastAsiaTheme="minorEastAsia" w:hAnsiTheme="minorHAnsi" w:cstheme="minorBidi"/>
-                <w:color w:val="000000" w:themeColor="text1"/>
-              </w:rPr>
-              <w:t xml:space="preserve"> correctamente todas las normas de citación y referencias.</w:t>
-            </w:r>
-          </w:p>
-        </w:tc>
-        <w:tc>
-          <w:tcPr>
-            <w:tcW w:w="2126" w:type="dxa"/>
+              <w:t>Utilicé correctamente todas las normas de citación y referencias.</w:t>
+            </w:r>
+          </w:p>
+        </w:tc>
+        <w:tc>
+          <w:tcPr>
+            <w:tcW w:w="1896" w:type="dxa"/>
           </w:tcPr>
           <w:p>
             <w:pPr>
@@ -8504,13 +7855,22 @@
                 <w:rFonts w:asciiTheme="minorHAnsi" w:eastAsiaTheme="minorEastAsia" w:hAnsiTheme="minorHAnsi" w:cstheme="minorBidi"/>
                 <w:color w:val="000000" w:themeColor="text1"/>
               </w:rPr>
-              <w:t>El texto presenta de 1 a 5 errores de ortografía, redacción o en las citas y referencias del informe.</w:t>
-            </w:r>
-          </w:p>
-        </w:tc>
-        <w:tc>
-          <w:tcPr>
-            <w:tcW w:w="2127" w:type="dxa"/>
+              <w:lastRenderedPageBreak/>
+              <w:t xml:space="preserve">El texto presenta de 1 a 5 errores de </w:t>
+            </w:r>
+            <w:r>
+              <w:rPr>
+                <w:rFonts w:asciiTheme="minorHAnsi" w:eastAsiaTheme="minorEastAsia" w:hAnsiTheme="minorHAnsi" w:cstheme="minorBidi"/>
+                <w:color w:val="000000" w:themeColor="text1"/>
+              </w:rPr>
+              <w:lastRenderedPageBreak/>
+              <w:t>ortografía, redacción o en las citas y referencias del informe.</w:t>
+            </w:r>
+          </w:p>
+        </w:tc>
+        <w:tc>
+          <w:tcPr>
+            <w:tcW w:w="1921" w:type="dxa"/>
           </w:tcPr>
           <w:p>
             <w:pPr>
@@ -8526,13 +7886,22 @@
                 <w:rFonts w:asciiTheme="minorHAnsi" w:eastAsiaTheme="minorEastAsia" w:hAnsiTheme="minorHAnsi" w:cstheme="minorBidi"/>
                 <w:color w:val="000000" w:themeColor="text1"/>
               </w:rPr>
-              <w:t>El texto presenta de 6 a 10 errores de ortografía, redacción o en las citas y referencias del informe.</w:t>
-            </w:r>
-          </w:p>
-        </w:tc>
-        <w:tc>
-          <w:tcPr>
-            <w:tcW w:w="2052" w:type="dxa"/>
+              <w:lastRenderedPageBreak/>
+              <w:t xml:space="preserve">El texto presenta de 6 a 10 errores </w:t>
+            </w:r>
+            <w:r>
+              <w:rPr>
+                <w:rFonts w:asciiTheme="minorHAnsi" w:eastAsiaTheme="minorEastAsia" w:hAnsiTheme="minorHAnsi" w:cstheme="minorBidi"/>
+                <w:color w:val="000000" w:themeColor="text1"/>
+              </w:rPr>
+              <w:lastRenderedPageBreak/>
+              <w:t>de ortografía, redacción o en las citas y referencias del informe.</w:t>
+            </w:r>
+          </w:p>
+        </w:tc>
+        <w:tc>
+          <w:tcPr>
+            <w:tcW w:w="1731" w:type="dxa"/>
           </w:tcPr>
           <w:p>
             <w:pPr>
@@ -8548,13 +7917,22 @@
                 <w:rFonts w:asciiTheme="minorHAnsi" w:eastAsiaTheme="minorEastAsia" w:hAnsiTheme="minorHAnsi" w:cstheme="minorBidi"/>
                 <w:color w:val="000000" w:themeColor="text1"/>
               </w:rPr>
-              <w:t>El texto presenta más de 10 errores de ortografía, redacción o en las citas y referencias del informe.</w:t>
-            </w:r>
-          </w:p>
-        </w:tc>
-        <w:tc>
-          <w:tcPr>
-            <w:tcW w:w="1449" w:type="dxa"/>
+              <w:lastRenderedPageBreak/>
+              <w:t xml:space="preserve">El texto presenta más </w:t>
+            </w:r>
+            <w:r>
+              <w:rPr>
+                <w:rFonts w:asciiTheme="minorHAnsi" w:eastAsiaTheme="minorEastAsia" w:hAnsiTheme="minorHAnsi" w:cstheme="minorBidi"/>
+                <w:color w:val="000000" w:themeColor="text1"/>
+              </w:rPr>
+              <w:lastRenderedPageBreak/>
+              <w:t>de 10 errores de ortografía, redacción o en las citas y referencias del informe.</w:t>
+            </w:r>
+          </w:p>
+        </w:tc>
+        <w:tc>
+          <w:tcPr>
+            <w:tcW w:w="1362" w:type="dxa"/>
             <w:vAlign w:val="center"/>
           </w:tcPr>
           <w:p>
@@ -8576,7 +7954,83 @@
                 <w:color w:val="3B3838" w:themeColor="background2" w:themeShade="40"/>
                 <w:lang w:eastAsia="es-CL"/>
               </w:rPr>
+              <w:lastRenderedPageBreak/>
               <w:t>5</w:t>
+            </w:r>
+          </w:p>
+        </w:tc>
+        <w:tc>
+          <w:tcPr>
+            <w:tcW w:w="878" w:type="dxa"/>
+          </w:tcPr>
+          <w:p>
+            <w:pPr>
+              <w:jc w:val="center"/>
+              <w:rPr>
+                <w:rFonts w:asciiTheme="minorHAnsi" w:eastAsiaTheme="minorEastAsia" w:hAnsiTheme="minorHAnsi" w:cstheme="minorBidi"/>
+                <w:b/>
+                <w:bCs/>
+                <w:color w:val="3B3838" w:themeColor="background2" w:themeShade="40"/>
+                <w:lang w:eastAsia="es-CL"/>
+              </w:rPr>
+            </w:pPr>
+            <w:r>
+              <w:rPr>
+                <w:rFonts w:asciiTheme="minorHAnsi" w:eastAsiaTheme="minorEastAsia" w:hAnsiTheme="minorHAnsi" w:cstheme="minorBidi"/>
+                <w:b/>
+                <w:bCs/>
+                <w:color w:val="3B3838" w:themeColor="background2" w:themeShade="40"/>
+                <w:lang w:eastAsia="es-CL"/>
+              </w:rPr>
+              <w:t>40%</w:t>
+            </w:r>
+          </w:p>
+        </w:tc>
+        <w:tc>
+          <w:tcPr>
+            <w:tcW w:w="878" w:type="dxa"/>
+          </w:tcPr>
+          <w:p>
+            <w:pPr>
+              <w:jc w:val="center"/>
+              <w:rPr>
+                <w:rFonts w:asciiTheme="minorHAnsi" w:eastAsiaTheme="minorEastAsia" w:hAnsiTheme="minorHAnsi" w:cstheme="minorBidi"/>
+                <w:b/>
+                <w:bCs/>
+                <w:color w:val="3B3838" w:themeColor="background2" w:themeShade="40"/>
+                <w:lang w:eastAsia="es-CL"/>
+              </w:rPr>
+            </w:pPr>
+            <w:r>
+              <w:rPr>
+                <w:rFonts w:asciiTheme="minorHAnsi" w:eastAsiaTheme="minorEastAsia" w:hAnsiTheme="minorHAnsi" w:cstheme="minorBidi"/>
+                <w:b/>
+                <w:bCs/>
+                <w:color w:val="3B3838" w:themeColor="background2" w:themeShade="40"/>
+                <w:lang w:eastAsia="es-CL"/>
+              </w:rPr>
+              <w:t xml:space="preserve">Se me pasaron varios detalles </w:t>
+            </w:r>
+            <w:r>
+              <w:rPr>
+                <w:rFonts w:asciiTheme="minorHAnsi" w:eastAsiaTheme="minorEastAsia" w:hAnsiTheme="minorHAnsi" w:cstheme="minorBidi"/>
+                <w:b/>
+                <w:bCs/>
+                <w:color w:val="3B3838" w:themeColor="background2" w:themeShade="40"/>
+                <w:lang w:eastAsia="es-CL"/>
+              </w:rPr>
+              <w:lastRenderedPageBreak/>
+              <w:t xml:space="preserve">de ortografía, tildes y un par de fallos </w:t>
+            </w:r>
+            <w:r>
+              <w:rPr>
+                <w:rFonts w:asciiTheme="minorHAnsi" w:eastAsiaTheme="minorEastAsia" w:hAnsiTheme="minorHAnsi" w:cstheme="minorBidi"/>
+                <w:b/>
+                <w:bCs/>
+                <w:color w:val="3B3838" w:themeColor="background2" w:themeShade="40"/>
+                <w:lang w:eastAsia="es-CL"/>
+              </w:rPr>
+              <w:t>al momento de elegir términos técnicos.</w:t>
             </w:r>
           </w:p>
         </w:tc>
@@ -8587,7 +8041,7 @@
         </w:trPr>
         <w:tc>
           <w:tcPr>
-            <w:tcW w:w="2972" w:type="dxa"/>
+            <w:tcW w:w="2327" w:type="dxa"/>
             <w:vAlign w:val="center"/>
           </w:tcPr>
           <w:p>
@@ -8611,7 +8065,7 @@
         </w:tc>
         <w:tc>
           <w:tcPr>
-            <w:tcW w:w="2268" w:type="dxa"/>
+            <w:tcW w:w="2001" w:type="dxa"/>
           </w:tcPr>
           <w:p>
             <w:pPr>
@@ -8633,7 +8087,7 @@
         </w:tc>
         <w:tc>
           <w:tcPr>
-            <w:tcW w:w="2126" w:type="dxa"/>
+            <w:tcW w:w="1896" w:type="dxa"/>
           </w:tcPr>
           <w:p>
             <w:pPr>
@@ -8655,7 +8109,7 @@
         </w:tc>
         <w:tc>
           <w:tcPr>
-            <w:tcW w:w="2127" w:type="dxa"/>
+            <w:tcW w:w="1921" w:type="dxa"/>
           </w:tcPr>
           <w:p>
             <w:pPr>
@@ -8677,7 +8131,7 @@
         </w:tc>
         <w:tc>
           <w:tcPr>
-            <w:tcW w:w="2052" w:type="dxa"/>
+            <w:tcW w:w="1731" w:type="dxa"/>
           </w:tcPr>
           <w:p>
             <w:pPr>
@@ -8699,7 +8153,7 @@
         </w:tc>
         <w:tc>
           <w:tcPr>
-            <w:tcW w:w="1449" w:type="dxa"/>
+            <w:tcW w:w="1362" w:type="dxa"/>
             <w:vAlign w:val="center"/>
           </w:tcPr>
           <w:p>
@@ -8722,6 +8176,60 @@
                 <w:lang w:eastAsia="es-CL"/>
               </w:rPr>
               <w:t>5</w:t>
+            </w:r>
+          </w:p>
+        </w:tc>
+        <w:tc>
+          <w:tcPr>
+            <w:tcW w:w="878" w:type="dxa"/>
+          </w:tcPr>
+          <w:p>
+            <w:pPr>
+              <w:jc w:val="center"/>
+              <w:rPr>
+                <w:rFonts w:asciiTheme="minorHAnsi" w:eastAsiaTheme="minorEastAsia" w:hAnsiTheme="minorHAnsi" w:cstheme="minorBidi"/>
+                <w:b/>
+                <w:bCs/>
+                <w:color w:val="3B3838" w:themeColor="background2" w:themeShade="40"/>
+                <w:lang w:eastAsia="es-CL"/>
+              </w:rPr>
+            </w:pPr>
+            <w:r>
+              <w:rPr>
+                <w:rFonts w:asciiTheme="minorHAnsi" w:eastAsiaTheme="minorEastAsia" w:hAnsiTheme="minorHAnsi" w:cstheme="minorBidi"/>
+                <w:b/>
+                <w:bCs/>
+                <w:color w:val="3B3838" w:themeColor="background2" w:themeShade="40"/>
+                <w:lang w:eastAsia="es-CL"/>
+              </w:rPr>
+              <w:t>100%</w:t>
+            </w:r>
+          </w:p>
+        </w:tc>
+        <w:tc>
+          <w:tcPr>
+            <w:tcW w:w="878" w:type="dxa"/>
+          </w:tcPr>
+          <w:p>
+            <w:pPr>
+              <w:jc w:val="center"/>
+              <w:rPr>
+                <w:rFonts w:asciiTheme="minorHAnsi" w:eastAsiaTheme="minorEastAsia" w:hAnsiTheme="minorHAnsi" w:cstheme="minorBidi"/>
+                <w:b/>
+                <w:bCs/>
+                <w:color w:val="3B3838" w:themeColor="background2" w:themeShade="40"/>
+                <w:lang w:eastAsia="es-CL"/>
+              </w:rPr>
+            </w:pPr>
+            <w:r>
+              <w:rPr>
+                <w:rFonts w:asciiTheme="minorHAnsi" w:eastAsiaTheme="minorEastAsia" w:hAnsiTheme="minorHAnsi" w:cstheme="minorBidi"/>
+                <w:b/>
+                <w:bCs/>
+                <w:color w:val="3B3838" w:themeColor="background2" w:themeShade="40"/>
+                <w:lang w:eastAsia="es-CL"/>
+              </w:rPr>
+              <w:t>Seguí al pie de la letra toda la estructura, márgenes y presentación que pedía la carrera.</w:t>
             </w:r>
           </w:p>
         </w:tc>
@@ -8732,7 +8240,7 @@
         </w:trPr>
         <w:tc>
           <w:tcPr>
-            <w:tcW w:w="2972" w:type="dxa"/>
+            <w:tcW w:w="2327" w:type="dxa"/>
             <w:vAlign w:val="center"/>
           </w:tcPr>
           <w:p>
@@ -8750,55 +8258,13 @@
                 <w:color w:val="000000" w:themeColor="text1"/>
                 <w:lang w:eastAsia="es-CL"/>
               </w:rPr>
-              <w:t>11</w:t>
-            </w:r>
-            <w:r>
-              <w:rPr>
-                <w:rFonts w:asciiTheme="minorHAnsi" w:eastAsiaTheme="minorEastAsia" w:hAnsiTheme="minorHAnsi" w:cstheme="minorBidi"/>
-                <w:color w:val="000000" w:themeColor="text1"/>
-                <w:lang w:eastAsia="es-CL"/>
-              </w:rPr>
-              <w:t xml:space="preserve">. Cumple con los indicadores de calidad requeridos en </w:t>
-            </w:r>
-            <w:r>
-              <w:rPr>
-                <w:rFonts w:asciiTheme="minorHAnsi" w:eastAsiaTheme="minorEastAsia" w:hAnsiTheme="minorHAnsi" w:cstheme="minorBidi"/>
-                <w:color w:val="000000" w:themeColor="text1"/>
-                <w:lang w:eastAsia="es-CL"/>
-              </w:rPr>
-              <w:t>la presentación del</w:t>
-            </w:r>
-            <w:r>
-              <w:rPr>
-                <w:rFonts w:asciiTheme="minorHAnsi" w:eastAsiaTheme="minorEastAsia" w:hAnsiTheme="minorHAnsi" w:cstheme="minorBidi"/>
-                <w:color w:val="000000" w:themeColor="text1"/>
-                <w:lang w:eastAsia="es-CL"/>
-              </w:rPr>
-              <w:t xml:space="preserve"> diseño del Proyecto APT </w:t>
-            </w:r>
-            <w:proofErr w:type="gramStart"/>
-            <w:r>
-              <w:rPr>
-                <w:rFonts w:asciiTheme="minorHAnsi" w:eastAsiaTheme="minorEastAsia" w:hAnsiTheme="minorHAnsi" w:cstheme="minorBidi"/>
-                <w:color w:val="000000" w:themeColor="text1"/>
-                <w:lang w:eastAsia="es-CL"/>
-              </w:rPr>
-              <w:t>de acuerdo a</w:t>
-            </w:r>
-            <w:proofErr w:type="gramEnd"/>
-            <w:r>
-              <w:rPr>
-                <w:rFonts w:asciiTheme="minorHAnsi" w:eastAsiaTheme="minorEastAsia" w:hAnsiTheme="minorHAnsi" w:cstheme="minorBidi"/>
-                <w:color w:val="000000" w:themeColor="text1"/>
-                <w:lang w:eastAsia="es-CL"/>
-              </w:rPr>
-              <w:t xml:space="preserve"> estándares definidos por la disciplina.</w:t>
-            </w:r>
-          </w:p>
-        </w:tc>
-        <w:tc>
-          <w:tcPr>
-            <w:tcW w:w="2268" w:type="dxa"/>
+              <w:t>11. Cumple con los indicadores de calidad requeridos en la presentación del diseño del Proyecto APT de acuerdo a estándares definidos por la disciplina.</w:t>
+            </w:r>
+          </w:p>
+        </w:tc>
+        <w:tc>
+          <w:tcPr>
+            <w:tcW w:w="2001" w:type="dxa"/>
           </w:tcPr>
           <w:p>
             <w:pPr>
@@ -8821,7 +8287,7 @@
         </w:tc>
         <w:tc>
           <w:tcPr>
-            <w:tcW w:w="2126" w:type="dxa"/>
+            <w:tcW w:w="1896" w:type="dxa"/>
           </w:tcPr>
           <w:p>
             <w:pPr>
@@ -8844,7 +8310,7 @@
         </w:tc>
         <w:tc>
           <w:tcPr>
-            <w:tcW w:w="2127" w:type="dxa"/>
+            <w:tcW w:w="1921" w:type="dxa"/>
           </w:tcPr>
           <w:p>
             <w:pPr>
@@ -8867,7 +8333,7 @@
         </w:tc>
         <w:tc>
           <w:tcPr>
-            <w:tcW w:w="2052" w:type="dxa"/>
+            <w:tcW w:w="1731" w:type="dxa"/>
           </w:tcPr>
           <w:p>
             <w:pPr>
@@ -8890,7 +8356,7 @@
         </w:tc>
         <w:tc>
           <w:tcPr>
-            <w:tcW w:w="1449" w:type="dxa"/>
+            <w:tcW w:w="1362" w:type="dxa"/>
             <w:vAlign w:val="center"/>
           </w:tcPr>
           <w:p>
@@ -8912,17 +8378,61 @@
                 <w:color w:val="3B3838" w:themeColor="background2" w:themeShade="40"/>
                 <w:lang w:eastAsia="es-CL"/>
               </w:rPr>
-              <w:t>2</w:t>
-            </w:r>
-            <w:r>
-              <w:rPr>
-                <w:rFonts w:asciiTheme="minorHAnsi" w:eastAsiaTheme="minorEastAsia" w:hAnsiTheme="minorHAnsi" w:cstheme="minorBidi"/>
-                <w:b/>
-                <w:bCs/>
-                <w:color w:val="3B3838" w:themeColor="background2" w:themeShade="40"/>
-                <w:lang w:eastAsia="es-CL"/>
-              </w:rPr>
-              <w:t>0</w:t>
+              <w:t>20</w:t>
+            </w:r>
+          </w:p>
+        </w:tc>
+        <w:tc>
+          <w:tcPr>
+            <w:tcW w:w="878" w:type="dxa"/>
+          </w:tcPr>
+          <w:p>
+            <w:pPr>
+              <w:jc w:val="center"/>
+              <w:rPr>
+                <w:rFonts w:asciiTheme="minorHAnsi" w:eastAsiaTheme="minorEastAsia" w:hAnsiTheme="minorHAnsi" w:cstheme="minorBidi"/>
+                <w:b/>
+                <w:bCs/>
+                <w:color w:val="3B3838" w:themeColor="background2" w:themeShade="40"/>
+                <w:lang w:eastAsia="es-CL"/>
+              </w:rPr>
+            </w:pPr>
+            <w:r>
+              <w:rPr>
+                <w:rFonts w:asciiTheme="minorHAnsi" w:eastAsiaTheme="minorEastAsia" w:hAnsiTheme="minorHAnsi" w:cstheme="minorBidi"/>
+                <w:b/>
+                <w:bCs/>
+                <w:color w:val="3B3838" w:themeColor="background2" w:themeShade="40"/>
+                <w:lang w:eastAsia="es-CL"/>
+              </w:rPr>
+              <w:t>60$</w:t>
+            </w:r>
+          </w:p>
+        </w:tc>
+        <w:tc>
+          <w:tcPr>
+            <w:tcW w:w="878" w:type="dxa"/>
+          </w:tcPr>
+          <w:p>
+            <w:pPr>
+              <w:jc w:val="center"/>
+              <w:rPr>
+                <w:rFonts w:asciiTheme="minorHAnsi" w:eastAsiaTheme="minorEastAsia" w:hAnsiTheme="minorHAnsi" w:cstheme="minorBidi"/>
+                <w:b/>
+                <w:bCs/>
+                <w:color w:val="3B3838" w:themeColor="background2" w:themeShade="40"/>
+                <w:lang w:eastAsia="es-CL"/>
+              </w:rPr>
+            </w:pPr>
+            <w:r>
+              <w:rPr>
+                <w:rFonts w:asciiTheme="minorHAnsi" w:eastAsiaTheme="minorEastAsia" w:hAnsiTheme="minorHAnsi" w:cstheme="minorBidi"/>
+                <w:b/>
+                <w:bCs/>
+                <w:color w:val="3B3838" w:themeColor="background2" w:themeShade="40"/>
+                <w:lang w:eastAsia="es-CL"/>
+              </w:rPr>
+              <w:t>Cumplí con la base del diseño, pero me faltó profundizar en varios de los estándares de calidad que exige la disciplina.</w:t>
             </w:r>
           </w:p>
         </w:tc>
@@ -8933,7 +8443,7 @@
         </w:trPr>
         <w:tc>
           <w:tcPr>
-            <w:tcW w:w="2972" w:type="dxa"/>
+            <w:tcW w:w="2327" w:type="dxa"/>
             <w:vAlign w:val="center"/>
           </w:tcPr>
           <w:p>
@@ -8949,186 +8459,270 @@
                 <w:rFonts w:ascii="Calibri" w:eastAsia="Calibri" w:hAnsi="Calibri" w:cs="Calibri"/>
                 <w:color w:val="000000" w:themeColor="text1"/>
               </w:rPr>
-              <w:t>1</w:t>
-            </w:r>
+              <w:t xml:space="preserve">12. Redacta el </w:t>
+            </w:r>
+            <w:proofErr w:type="spellStart"/>
             <w:r>
               <w:rPr>
                 <w:rFonts w:ascii="Calibri" w:eastAsia="Calibri" w:hAnsi="Calibri" w:cs="Calibri"/>
                 <w:color w:val="000000" w:themeColor="text1"/>
               </w:rPr>
-              <w:t>2</w:t>
-            </w:r>
+              <w:t>abstract</w:t>
+            </w:r>
+            <w:proofErr w:type="spellEnd"/>
             <w:r>
               <w:rPr>
                 <w:rFonts w:ascii="Calibri" w:eastAsia="Calibri" w:hAnsi="Calibri" w:cs="Calibri"/>
                 <w:color w:val="000000" w:themeColor="text1"/>
               </w:rPr>
-              <w:t>.</w:t>
+              <w:t xml:space="preserve">, las conclusiones y la reflexión en inglés con ideas completas que se conectan en secuencia lógica, utilizando estructuras gramaticales y </w:t>
             </w:r>
             <w:r>
               <w:rPr>
                 <w:rFonts w:ascii="Calibri" w:eastAsia="Calibri" w:hAnsi="Calibri" w:cs="Calibri"/>
                 <w:color w:val="000000" w:themeColor="text1"/>
               </w:rPr>
-              <w:t xml:space="preserve"> Redacta el </w:t>
-            </w:r>
-            <w:proofErr w:type="gramStart"/>
-            <w:r>
+              <w:lastRenderedPageBreak/>
+              <w:t>vocabulario en forma correcta y pertinente al tema a un nivel intermedio alto.</w:t>
+            </w:r>
+          </w:p>
+          <w:p>
+            <w:pPr>
+              <w:jc w:val="both"/>
               <w:rPr>
                 <w:rFonts w:ascii="Calibri" w:eastAsia="Calibri" w:hAnsi="Calibri" w:cs="Calibri"/>
                 <w:color w:val="000000" w:themeColor="text1"/>
               </w:rPr>
+            </w:pPr>
+          </w:p>
+          <w:p>
+            <w:pPr>
+              <w:jc w:val="both"/>
+              <w:rPr>
+                <w:rFonts w:ascii="Calibri" w:eastAsia="Calibri" w:hAnsi="Calibri" w:cs="Calibri"/>
+                <w:color w:val="000000" w:themeColor="text1"/>
+              </w:rPr>
+            </w:pPr>
+          </w:p>
+        </w:tc>
+        <w:tc>
+          <w:tcPr>
+            <w:tcW w:w="2001" w:type="dxa"/>
+          </w:tcPr>
+          <w:p>
+            <w:pPr>
+              <w:rPr>
+                <w:rFonts w:ascii="Calibri" w:eastAsia="Calibri" w:hAnsi="Calibri" w:cs="Calibri"/>
+              </w:rPr>
+            </w:pPr>
+            <w:r>
+              <w:rPr>
+                <w:rFonts w:ascii="Calibri" w:eastAsia="Calibri" w:hAnsi="Calibri" w:cs="Calibri"/>
+              </w:rPr>
+              <w:lastRenderedPageBreak/>
+              <w:t xml:space="preserve">Redacta los textos en inglés siguiendo una secuencia lógica en la que todas las oraciones se conectan de manera fluida y comprensible, utilizando en forma correcta las estructuras </w:t>
+            </w:r>
+            <w:r>
+              <w:rPr>
+                <w:rFonts w:ascii="Calibri" w:eastAsia="Calibri" w:hAnsi="Calibri" w:cs="Calibri"/>
+              </w:rPr>
+              <w:lastRenderedPageBreak/>
+              <w:t>gramaticales y el vocabulario pertinentes al tema.</w:t>
+            </w:r>
+          </w:p>
+        </w:tc>
+        <w:tc>
+          <w:tcPr>
+            <w:tcW w:w="1896" w:type="dxa"/>
+          </w:tcPr>
+          <w:p>
+            <w:pPr>
+              <w:rPr>
+                <w:rFonts w:ascii="Calibri" w:eastAsia="Calibri" w:hAnsi="Calibri" w:cs="Calibri"/>
+              </w:rPr>
+            </w:pPr>
+            <w:r>
+              <w:rPr>
+                <w:rFonts w:ascii="Calibri" w:eastAsia="Calibri" w:hAnsi="Calibri" w:cs="Calibri"/>
+              </w:rPr>
+              <w:lastRenderedPageBreak/>
+              <w:t xml:space="preserve">Redacta los textos en inglés siguiendo una secuencia lógica en la que gran parte de las oraciones se conectan de manera fluida y comprensible, utilizando en </w:t>
+            </w:r>
+            <w:r>
+              <w:rPr>
+                <w:rFonts w:ascii="Calibri" w:eastAsia="Calibri" w:hAnsi="Calibri" w:cs="Calibri"/>
+              </w:rPr>
+              <w:lastRenderedPageBreak/>
+              <w:t>forma correcta la mayoría de las estructuras gramaticales y el vocabulario pertinentes al tema.</w:t>
+            </w:r>
+          </w:p>
+        </w:tc>
+        <w:tc>
+          <w:tcPr>
+            <w:tcW w:w="1921" w:type="dxa"/>
+          </w:tcPr>
+          <w:p>
+            <w:pPr>
+              <w:rPr>
+                <w:rFonts w:ascii="Calibri" w:eastAsia="Calibri" w:hAnsi="Calibri" w:cs="Calibri"/>
+              </w:rPr>
+            </w:pPr>
+            <w:r>
+              <w:rPr>
+                <w:rFonts w:ascii="Calibri" w:eastAsia="Calibri" w:hAnsi="Calibri" w:cs="Calibri"/>
+              </w:rPr>
+              <w:lastRenderedPageBreak/>
+              <w:t xml:space="preserve">Redacta los textos en inglés usando una secuencia limitada o desorganizada que dificulta la comprensión de las ideas, utilizando inadecuadamente las estructuras </w:t>
+            </w:r>
+            <w:r>
+              <w:rPr>
+                <w:rFonts w:ascii="Calibri" w:eastAsia="Calibri" w:hAnsi="Calibri" w:cs="Calibri"/>
+              </w:rPr>
+              <w:lastRenderedPageBreak/>
+              <w:t>gramaticales y el vocabulario pertinentes al tema.</w:t>
+            </w:r>
+          </w:p>
+        </w:tc>
+        <w:tc>
+          <w:tcPr>
+            <w:tcW w:w="1731" w:type="dxa"/>
+          </w:tcPr>
+          <w:p>
+            <w:pPr>
+              <w:rPr>
+                <w:rFonts w:ascii="Calibri" w:eastAsia="Calibri" w:hAnsi="Calibri" w:cs="Calibri"/>
+              </w:rPr>
+            </w:pPr>
+            <w:r>
+              <w:rPr>
+                <w:rFonts w:ascii="Calibri" w:eastAsia="Calibri" w:hAnsi="Calibri" w:cs="Calibri"/>
+              </w:rPr>
+              <w:lastRenderedPageBreak/>
+              <w:t>No produce texto en inglés</w:t>
+            </w:r>
+          </w:p>
+          <w:p>
+            <w:pPr>
+              <w:rPr>
+                <w:rFonts w:ascii="Calibri" w:eastAsia="Calibri" w:hAnsi="Calibri" w:cs="Calibri"/>
+              </w:rPr>
+            </w:pPr>
+            <w:r>
+              <w:rPr>
+                <w:rFonts w:ascii="Calibri" w:eastAsia="Calibri" w:hAnsi="Calibri" w:cs="Calibri"/>
+              </w:rPr>
+              <w:t xml:space="preserve">o escribe frases sueltas que no se relacionan entre ellas impidiendo la comprensión de las ideas, </w:t>
+            </w:r>
+          </w:p>
+          <w:p>
+            <w:pPr>
+              <w:rPr>
+                <w:rFonts w:ascii="Calibri" w:eastAsia="Calibri" w:hAnsi="Calibri" w:cs="Calibri"/>
+              </w:rPr>
+            </w:pPr>
+            <w:r>
+              <w:rPr>
+                <w:rFonts w:ascii="Calibri" w:eastAsia="Calibri" w:hAnsi="Calibri" w:cs="Calibri"/>
+              </w:rPr>
+              <w:lastRenderedPageBreak/>
+              <w:t>utilizando estructuras gramaticales y vocabulario con errores graves.</w:t>
+            </w:r>
+          </w:p>
+        </w:tc>
+        <w:tc>
+          <w:tcPr>
+            <w:tcW w:w="1362" w:type="dxa"/>
+            <w:vAlign w:val="center"/>
+          </w:tcPr>
+          <w:p>
+            <w:pPr>
+              <w:jc w:val="center"/>
+              <w:rPr>
+                <w:rFonts w:ascii="Calibri" w:eastAsia="Calibri" w:hAnsi="Calibri" w:cs="Calibri"/>
+                <w:b/>
+                <w:bCs/>
+                <w:color w:val="000000" w:themeColor="text1"/>
+              </w:rPr>
+            </w:pPr>
+            <w:r>
+              <w:rPr>
+                <w:rFonts w:ascii="Calibri" w:eastAsia="Calibri" w:hAnsi="Calibri" w:cs="Calibri"/>
+                <w:b/>
+                <w:bCs/>
+                <w:color w:val="000000" w:themeColor="text1"/>
+              </w:rPr>
+              <w:lastRenderedPageBreak/>
+              <w:t>10</w:t>
+            </w:r>
+          </w:p>
+        </w:tc>
+        <w:tc>
+          <w:tcPr>
+            <w:tcW w:w="878" w:type="dxa"/>
+          </w:tcPr>
+          <w:p>
+            <w:pPr>
+              <w:jc w:val="center"/>
+              <w:rPr>
+                <w:rFonts w:ascii="Calibri" w:eastAsia="Calibri" w:hAnsi="Calibri" w:cs="Calibri"/>
+                <w:b/>
+                <w:bCs/>
+                <w:color w:val="000000" w:themeColor="text1"/>
+              </w:rPr>
+            </w:pPr>
+            <w:r>
+              <w:rPr>
+                <w:rFonts w:ascii="Calibri" w:eastAsia="Calibri" w:hAnsi="Calibri" w:cs="Calibri"/>
+                <w:b/>
+                <w:bCs/>
+                <w:color w:val="000000" w:themeColor="text1"/>
+              </w:rPr>
+              <w:t>100%</w:t>
+            </w:r>
+          </w:p>
+        </w:tc>
+        <w:tc>
+          <w:tcPr>
+            <w:tcW w:w="878" w:type="dxa"/>
+          </w:tcPr>
+          <w:p>
+            <w:pPr>
+              <w:jc w:val="center"/>
+              <w:rPr>
+                <w:rFonts w:ascii="Calibri" w:eastAsia="Calibri" w:hAnsi="Calibri" w:cs="Calibri"/>
+                <w:b/>
+                <w:bCs/>
+                <w:color w:val="000000" w:themeColor="text1"/>
+              </w:rPr>
+            </w:pPr>
+            <w:r>
+              <w:rPr>
+                <w:rFonts w:ascii="Calibri" w:eastAsia="Calibri" w:hAnsi="Calibri" w:cs="Calibri"/>
+                <w:b/>
+                <w:bCs/>
+                <w:color w:val="000000" w:themeColor="text1"/>
+              </w:rPr>
+              <w:t xml:space="preserve">Logré redactar el </w:t>
+            </w:r>
+            <w:proofErr w:type="spellStart"/>
+            <w:r>
+              <w:rPr>
+                <w:rFonts w:ascii="Calibri" w:eastAsia="Calibri" w:hAnsi="Calibri" w:cs="Calibri"/>
+                <w:b/>
+                <w:bCs/>
+                <w:color w:val="000000" w:themeColor="text1"/>
+              </w:rPr>
               <w:t>abstract</w:t>
             </w:r>
-            <w:proofErr w:type="gramEnd"/>
+            <w:proofErr w:type="spellEnd"/>
             <w:r>
               <w:rPr>
                 <w:rFonts w:ascii="Calibri" w:eastAsia="Calibri" w:hAnsi="Calibri" w:cs="Calibri"/>
-                <w:color w:val="000000" w:themeColor="text1"/>
-              </w:rPr>
-              <w:t>, las conclusiones y la reflexión en inglés con ideas completas que se conectan en secuencia lógica, utilizando estructuras gramaticales y vocabulario en forma correcta y pertinente al tema a un nivel intermedio alto.</w:t>
-            </w:r>
-          </w:p>
-          <w:p>
-            <w:pPr>
-              <w:jc w:val="both"/>
-              <w:rPr>
-                <w:rFonts w:ascii="Calibri" w:eastAsia="Calibri" w:hAnsi="Calibri" w:cs="Calibri"/>
-                <w:color w:val="000000" w:themeColor="text1"/>
-              </w:rPr>
-            </w:pPr>
-          </w:p>
-          <w:p>
-            <w:pPr>
-              <w:jc w:val="both"/>
-              <w:rPr>
-                <w:rFonts w:ascii="Calibri" w:eastAsia="Calibri" w:hAnsi="Calibri" w:cs="Calibri"/>
-                <w:color w:val="000000" w:themeColor="text1"/>
-              </w:rPr>
-            </w:pPr>
-          </w:p>
-        </w:tc>
-        <w:tc>
-          <w:tcPr>
-            <w:tcW w:w="2268" w:type="dxa"/>
-          </w:tcPr>
-          <w:p>
-            <w:pPr>
-              <w:rPr>
-                <w:rFonts w:ascii="Calibri" w:eastAsia="Calibri" w:hAnsi="Calibri" w:cs="Calibri"/>
-              </w:rPr>
-            </w:pPr>
-            <w:r>
-              <w:rPr>
-                <w:rFonts w:ascii="Calibri" w:eastAsia="Calibri" w:hAnsi="Calibri" w:cs="Calibri"/>
-              </w:rPr>
-              <w:t>Redacta los textos en inglés siguiendo una secuencia lógica en la que todas las oraciones se conectan de manera fluida y comprensible, utilizando en forma correcta las estructuras gramaticales y el vocabulario pertinentes al tema.</w:t>
-            </w:r>
-          </w:p>
-        </w:tc>
-        <w:tc>
-          <w:tcPr>
-            <w:tcW w:w="2126" w:type="dxa"/>
-          </w:tcPr>
-          <w:p>
-            <w:pPr>
-              <w:rPr>
-                <w:rFonts w:ascii="Calibri" w:eastAsia="Calibri" w:hAnsi="Calibri" w:cs="Calibri"/>
-              </w:rPr>
-            </w:pPr>
-            <w:r>
-              <w:rPr>
-                <w:rFonts w:ascii="Calibri" w:eastAsia="Calibri" w:hAnsi="Calibri" w:cs="Calibri"/>
-              </w:rPr>
-              <w:t>Redacta los textos en inglés siguiendo una secuencia lógica en la que gran parte de las oraciones se conectan de manera fluida y comprensible, utilizando en forma correcta la mayoría de las estructuras gramaticales y el vocabulario pertinentes al tema.</w:t>
-            </w:r>
-          </w:p>
-        </w:tc>
-        <w:tc>
-          <w:tcPr>
-            <w:tcW w:w="2127" w:type="dxa"/>
-          </w:tcPr>
-          <w:p>
-            <w:pPr>
-              <w:rPr>
-                <w:rFonts w:ascii="Calibri" w:eastAsia="Calibri" w:hAnsi="Calibri" w:cs="Calibri"/>
-              </w:rPr>
-            </w:pPr>
-            <w:r>
-              <w:rPr>
-                <w:rFonts w:ascii="Calibri" w:eastAsia="Calibri" w:hAnsi="Calibri" w:cs="Calibri"/>
-              </w:rPr>
-              <w:t>Redacta los textos en inglés usando una secuencia limitada o desorganizada que dificulta la comprensión de las ideas, utilizando inadecuadamente las estructuras gramaticales y el vocabulario pertinentes al tema.</w:t>
-            </w:r>
-          </w:p>
-        </w:tc>
-        <w:tc>
-          <w:tcPr>
-            <w:tcW w:w="2052" w:type="dxa"/>
-          </w:tcPr>
-          <w:p>
-            <w:pPr>
-              <w:rPr>
-                <w:rFonts w:ascii="Calibri" w:eastAsia="Calibri" w:hAnsi="Calibri" w:cs="Calibri"/>
-              </w:rPr>
-            </w:pPr>
-            <w:r>
-              <w:rPr>
-                <w:rFonts w:ascii="Calibri" w:eastAsia="Calibri" w:hAnsi="Calibri" w:cs="Calibri"/>
-              </w:rPr>
-              <w:t>No produce texto en inglés</w:t>
-            </w:r>
-          </w:p>
-          <w:p>
-            <w:pPr>
-              <w:rPr>
-                <w:rFonts w:ascii="Calibri" w:eastAsia="Calibri" w:hAnsi="Calibri" w:cs="Calibri"/>
-              </w:rPr>
-            </w:pPr>
-            <w:r>
-              <w:rPr>
-                <w:rFonts w:ascii="Calibri" w:eastAsia="Calibri" w:hAnsi="Calibri" w:cs="Calibri"/>
-              </w:rPr>
-              <w:t xml:space="preserve">o escribe frases sueltas que no se relacionan entre ellas impidiendo la comprensión de las ideas, </w:t>
-            </w:r>
-          </w:p>
-          <w:p>
-            <w:pPr>
-              <w:rPr>
-                <w:rFonts w:ascii="Calibri" w:eastAsia="Calibri" w:hAnsi="Calibri" w:cs="Calibri"/>
-              </w:rPr>
-            </w:pPr>
-            <w:r>
-              <w:rPr>
-                <w:rFonts w:ascii="Calibri" w:eastAsia="Calibri" w:hAnsi="Calibri" w:cs="Calibri"/>
-              </w:rPr>
-              <w:t>utilizando estructuras gramaticales y vocabulario con errores graves.</w:t>
-            </w:r>
-          </w:p>
-        </w:tc>
-        <w:tc>
-          <w:tcPr>
-            <w:tcW w:w="1449" w:type="dxa"/>
-            <w:vAlign w:val="center"/>
-          </w:tcPr>
-          <w:p>
-            <w:pPr>
-              <w:jc w:val="center"/>
-              <w:rPr>
-                <w:rFonts w:ascii="Calibri" w:eastAsia="Calibri" w:hAnsi="Calibri" w:cs="Calibri"/>
-                <w:b/>
-                <w:bCs/>
-                <w:color w:val="000000" w:themeColor="text1"/>
-              </w:rPr>
-            </w:pPr>
-            <w:r>
-              <w:rPr>
-                <w:rFonts w:ascii="Calibri" w:eastAsia="Calibri" w:hAnsi="Calibri" w:cs="Calibri"/>
-                <w:b/>
-                <w:bCs/>
-                <w:color w:val="000000" w:themeColor="text1"/>
-              </w:rPr>
-              <w:t>10</w:t>
+                <w:b/>
+                <w:bCs/>
+                <w:color w:val="000000" w:themeColor="text1"/>
+              </w:rPr>
+              <w:t xml:space="preserve"> y las conclusiones en inglés fluido, usando vocabulario técnico adecuado y buena gramática.</w:t>
             </w:r>
           </w:p>
         </w:tc>
@@ -9139,7 +8733,7 @@
         </w:trPr>
         <w:tc>
           <w:tcPr>
-            <w:tcW w:w="11545" w:type="dxa"/>
+            <w:tcW w:w="9876" w:type="dxa"/>
             <w:gridSpan w:val="5"/>
             <w:vAlign w:val="center"/>
           </w:tcPr>
@@ -9168,7 +8762,7 @@
         </w:tc>
         <w:tc>
           <w:tcPr>
-            <w:tcW w:w="1449" w:type="dxa"/>
+            <w:tcW w:w="1362" w:type="dxa"/>
             <w:vAlign w:val="center"/>
           </w:tcPr>
           <w:p>
@@ -9192,6 +8786,40 @@
               </w:rPr>
               <w:t>100%</w:t>
             </w:r>
+          </w:p>
+        </w:tc>
+        <w:tc>
+          <w:tcPr>
+            <w:tcW w:w="878" w:type="dxa"/>
+          </w:tcPr>
+          <w:p>
+            <w:pPr>
+              <w:jc w:val="center"/>
+              <w:rPr>
+                <w:rFonts w:asciiTheme="minorHAnsi" w:eastAsiaTheme="minorEastAsia" w:hAnsiTheme="minorHAnsi" w:cstheme="minorBidi"/>
+                <w:b/>
+                <w:bCs/>
+                <w:color w:val="3B3838" w:themeColor="background2" w:themeShade="40"/>
+                <w:lang w:eastAsia="es-CL"/>
+              </w:rPr>
+            </w:pPr>
+          </w:p>
+        </w:tc>
+        <w:tc>
+          <w:tcPr>
+            <w:tcW w:w="878" w:type="dxa"/>
+          </w:tcPr>
+          <w:p>
+            <w:pPr>
+              <w:jc w:val="center"/>
+              <w:rPr>
+                <w:rFonts w:asciiTheme="minorHAnsi" w:eastAsiaTheme="minorEastAsia" w:hAnsiTheme="minorHAnsi" w:cstheme="minorBidi"/>
+                <w:b/>
+                <w:bCs/>
+                <w:color w:val="3B3838" w:themeColor="background2" w:themeShade="40"/>
+                <w:lang w:eastAsia="es-CL"/>
+              </w:rPr>
+            </w:pPr>
           </w:p>
         </w:tc>
       </w:tr>
@@ -9220,7 +8848,7 @@
 </file>
 
 <file path=word/endnotes.xml><?xml version="1.0" encoding="utf-8"?>
-<w:endnotes xmlns:wpc="http://schemas.microsoft.com/office/word/2010/wordprocessingCanvas" xmlns:cx="http://schemas.microsoft.com/office/drawing/2014/chartex" xmlns:cx1="http://schemas.microsoft.com/office/drawing/2015/9/8/chartex" xmlns:cx2="http://schemas.microsoft.com/office/drawing/2015/10/21/chartex" xmlns:cx3="http://schemas.microsoft.com/office/drawing/2016/5/9/chartex" xmlns:cx4="http://schemas.microsoft.com/office/drawing/2016/5/10/chartex" xmlns:cx5="http://schemas.microsoft.com/office/drawing/2016/5/11/chartex" xmlns:cx6="http://schemas.microsoft.com/office/drawing/2016/5/12/chartex" xmlns:cx7="http://schemas.microsoft.com/office/drawing/2016/5/13/chartex" xmlns:cx8="http://schemas.microsoft.com/office/drawing/2016/5/14/chartex" xmlns:mc="http://schemas.openxmlformats.org/markup-compatibility/2006" xmlns:aink="http://schemas.microsoft.com/office/drawing/2016/ink" xmlns:am3d="http://schemas.microsoft.com/office/drawing/2017/model3d" xmlns:o="urn:schemas-microsoft-com:office:office" xmlns:oel="http://schemas.microsoft.com/office/2019/extlst" xmlns:r="http://schemas.openxmlformats.org/officeDocument/2006/relationships" xmlns:m="http://schemas.openxmlformats.org/officeDocument/2006/math" xmlns:v="urn:schemas-microsoft-com:vml" xmlns:wp14="http://schemas.microsoft.com/office/word/2010/wordprocessingDrawing" xmlns:wp="http://schemas.openxmlformats.org/drawingml/2006/wordprocessingDrawing" xmlns:w10="urn:schemas-microsoft-com:office:word" xmlns:w="http://schemas.openxmlformats.org/wordprocessingml/2006/main" xmlns:w14="http://schemas.microsoft.com/office/word/2010/wordml" xmlns:w15="http://schemas.microsoft.com/office/word/2012/wordml" xmlns:w16cex="http://schemas.microsoft.com/office/word/2018/wordml/cex" xmlns:w16cid="http://schemas.microsoft.com/office/word/2016/wordml/cid" xmlns:w16="http://schemas.microsoft.com/office/word/2018/wordml" xmlns:w16du="http://schemas.microsoft.com/office/word/2023/wordml/word16du" xmlns:w16sdtdh="http://schemas.microsoft.com/office/word/2020/wordml/sdtdatahash" xmlns:w16sdtfl="http://schemas.microsoft.com/office/word/2024/wordml/sdtformatlock" xmlns:w16se="http://schemas.microsoft.com/office/word/2015/wordml/symex" xmlns:wpg="http://schemas.microsoft.com/office/word/2010/wordprocessingGroup" xmlns:wpi="http://schemas.microsoft.com/office/word/2010/wordprocessingInk" xmlns:wne="http://schemas.microsoft.com/office/word/2006/wordml" xmlns:wps="http://schemas.microsoft.com/office/word/2010/wordprocessingShape" mc:Ignorable="w14 w15 w16se w16cid w16 w16cex w16sdtdh w16sdtfl w16du wp14">
+<w:endnotes xmlns:wpc="http://schemas.microsoft.com/office/word/2010/wordprocessingCanvas" xmlns:cx="http://schemas.microsoft.com/office/drawing/2014/chartex" xmlns:cx1="http://schemas.microsoft.com/office/drawing/2015/9/8/chartex" xmlns:cx2="http://schemas.microsoft.com/office/drawing/2015/10/21/chartex" xmlns:cx3="http://schemas.microsoft.com/office/drawing/2016/5/9/chartex" xmlns:cx4="http://schemas.microsoft.com/office/drawing/2016/5/10/chartex" xmlns:cx5="http://schemas.microsoft.com/office/drawing/2016/5/11/chartex" xmlns:cx6="http://schemas.microsoft.com/office/drawing/2016/5/12/chartex" xmlns:cx7="http://schemas.microsoft.com/office/drawing/2016/5/13/chartex" xmlns:cx8="http://schemas.microsoft.com/office/drawing/2016/5/14/chartex" xmlns:mc="http://schemas.openxmlformats.org/markup-compatibility/2006" xmlns:aink="http://schemas.microsoft.com/office/drawing/2016/ink" xmlns:am3d="http://schemas.microsoft.com/office/drawing/2017/model3d" xmlns:o="urn:schemas-microsoft-com:office:office" xmlns:r="http://schemas.openxmlformats.org/officeDocument/2006/relationships" xmlns:m="http://schemas.openxmlformats.org/officeDocument/2006/math" xmlns:v="urn:schemas-microsoft-com:vml" xmlns:wp14="http://schemas.microsoft.com/office/word/2010/wordprocessingDrawing" xmlns:wp="http://schemas.openxmlformats.org/drawingml/2006/wordprocessingDrawing" xmlns:w10="urn:schemas-microsoft-com:office:word" xmlns:w="http://schemas.openxmlformats.org/wordprocessingml/2006/main" xmlns:w14="http://schemas.microsoft.com/office/word/2010/wordml" xmlns:w15="http://schemas.microsoft.com/office/word/2012/wordml" xmlns:w16cex="http://schemas.microsoft.com/office/word/2018/wordml/cex" xmlns:w16cid="http://schemas.microsoft.com/office/word/2016/wordml/cid" xmlns:w16="http://schemas.microsoft.com/office/word/2018/wordml" xmlns:w16sdtdh="http://schemas.microsoft.com/office/word/2020/wordml/sdtdatahash" xmlns:w16se="http://schemas.microsoft.com/office/word/2015/wordml/symex" xmlns:wpg="http://schemas.microsoft.com/office/word/2010/wordprocessingGroup" xmlns:wpi="http://schemas.microsoft.com/office/word/2010/wordprocessingInk" xmlns:wne="http://schemas.microsoft.com/office/word/2006/wordml" xmlns:wps="http://schemas.microsoft.com/office/word/2010/wordprocessingShape" mc:Ignorable="w14 w15 w16se w16cid w16 w16cex w16sdtdh wp14">
   <w:endnote w:type="separator" w:id="-1">
     <w:p>
       <w:r>
@@ -9239,7 +8867,7 @@
 </file>
 
 <file path=word/footer1.xml><?xml version="1.0" encoding="utf-8"?>
-<w:ftr xmlns:wpc="http://schemas.microsoft.com/office/word/2010/wordprocessingCanvas" xmlns:cx="http://schemas.microsoft.com/office/drawing/2014/chartex" xmlns:cx1="http://schemas.microsoft.com/office/drawing/2015/9/8/chartex" xmlns:cx2="http://schemas.microsoft.com/office/drawing/2015/10/21/chartex" xmlns:cx3="http://schemas.microsoft.com/office/drawing/2016/5/9/chartex" xmlns:cx4="http://schemas.microsoft.com/office/drawing/2016/5/10/chartex" xmlns:cx5="http://schemas.microsoft.com/office/drawing/2016/5/11/chartex" xmlns:cx6="http://schemas.microsoft.com/office/drawing/2016/5/12/chartex" xmlns:cx7="http://schemas.microsoft.com/office/drawing/2016/5/13/chartex" xmlns:cx8="http://schemas.microsoft.com/office/drawing/2016/5/14/chartex" xmlns:mc="http://schemas.openxmlformats.org/markup-compatibility/2006" xmlns:aink="http://schemas.microsoft.com/office/drawing/2016/ink" xmlns:am3d="http://schemas.microsoft.com/office/drawing/2017/model3d" xmlns:o="urn:schemas-microsoft-com:office:office" xmlns:oel="http://schemas.microsoft.com/office/2019/extlst" xmlns:r="http://schemas.openxmlformats.org/officeDocument/2006/relationships" xmlns:m="http://schemas.openxmlformats.org/officeDocument/2006/math" xmlns:v="urn:schemas-microsoft-com:vml" xmlns:wp14="http://schemas.microsoft.com/office/word/2010/wordprocessingDrawing" xmlns:wp="http://schemas.openxmlformats.org/drawingml/2006/wordprocessingDrawing" xmlns:w10="urn:schemas-microsoft-com:office:word" xmlns:w="http://schemas.openxmlformats.org/wordprocessingml/2006/main" xmlns:w14="http://schemas.microsoft.com/office/word/2010/wordml" xmlns:w15="http://schemas.microsoft.com/office/word/2012/wordml" xmlns:w16cex="http://schemas.microsoft.com/office/word/2018/wordml/cex" xmlns:w16cid="http://schemas.microsoft.com/office/word/2016/wordml/cid" xmlns:w16="http://schemas.microsoft.com/office/word/2018/wordml" xmlns:w16du="http://schemas.microsoft.com/office/word/2023/wordml/word16du" xmlns:w16sdtdh="http://schemas.microsoft.com/office/word/2020/wordml/sdtdatahash" xmlns:w16sdtfl="http://schemas.microsoft.com/office/word/2024/wordml/sdtformatlock" xmlns:w16se="http://schemas.microsoft.com/office/word/2015/wordml/symex" xmlns:wpg="http://schemas.microsoft.com/office/word/2010/wordprocessingGroup" xmlns:wpi="http://schemas.microsoft.com/office/word/2010/wordprocessingInk" xmlns:wne="http://schemas.microsoft.com/office/word/2006/wordml" xmlns:wps="http://schemas.microsoft.com/office/word/2010/wordprocessingShape" mc:Ignorable="w14 w15 w16se w16cid w16 w16cex w16sdtdh w16sdtfl w16du wp14">
+<w:ftr xmlns:wpc="http://schemas.microsoft.com/office/word/2010/wordprocessingCanvas" xmlns:cx="http://schemas.microsoft.com/office/drawing/2014/chartex" xmlns:cx1="http://schemas.microsoft.com/office/drawing/2015/9/8/chartex" xmlns:cx2="http://schemas.microsoft.com/office/drawing/2015/10/21/chartex" xmlns:cx3="http://schemas.microsoft.com/office/drawing/2016/5/9/chartex" xmlns:cx4="http://schemas.microsoft.com/office/drawing/2016/5/10/chartex" xmlns:cx5="http://schemas.microsoft.com/office/drawing/2016/5/11/chartex" xmlns:cx6="http://schemas.microsoft.com/office/drawing/2016/5/12/chartex" xmlns:cx7="http://schemas.microsoft.com/office/drawing/2016/5/13/chartex" xmlns:cx8="http://schemas.microsoft.com/office/drawing/2016/5/14/chartex" xmlns:mc="http://schemas.openxmlformats.org/markup-compatibility/2006" xmlns:aink="http://schemas.microsoft.com/office/drawing/2016/ink" xmlns:am3d="http://schemas.microsoft.com/office/drawing/2017/model3d" xmlns:o="urn:schemas-microsoft-com:office:office" xmlns:r="http://schemas.openxmlformats.org/officeDocument/2006/relationships" xmlns:m="http://schemas.openxmlformats.org/officeDocument/2006/math" xmlns:v="urn:schemas-microsoft-com:vml" xmlns:wp14="http://schemas.microsoft.com/office/word/2010/wordprocessingDrawing" xmlns:wp="http://schemas.openxmlformats.org/drawingml/2006/wordprocessingDrawing" xmlns:w10="urn:schemas-microsoft-com:office:word" xmlns:w="http://schemas.openxmlformats.org/wordprocessingml/2006/main" xmlns:w14="http://schemas.microsoft.com/office/word/2010/wordml" xmlns:w15="http://schemas.microsoft.com/office/word/2012/wordml" xmlns:w16cex="http://schemas.microsoft.com/office/word/2018/wordml/cex" xmlns:w16cid="http://schemas.microsoft.com/office/word/2016/wordml/cid" xmlns:w16="http://schemas.microsoft.com/office/word/2018/wordml" xmlns:w16sdtdh="http://schemas.microsoft.com/office/word/2020/wordml/sdtdatahash" xmlns:w16se="http://schemas.microsoft.com/office/word/2015/wordml/symex" xmlns:wpg="http://schemas.microsoft.com/office/word/2010/wordprocessingGroup" xmlns:wpi="http://schemas.microsoft.com/office/word/2010/wordprocessingInk" xmlns:wne="http://schemas.microsoft.com/office/word/2006/wordml" xmlns:wps="http://schemas.microsoft.com/office/word/2010/wordprocessingShape" mc:Ignorable="w14 w15 w16se w16cid w16 w16cex w16sdtdh wp14">
   <w:p>
     <w:pPr>
       <w:pStyle w:val="Piedepgina"/>
@@ -9386,6 +9014,7 @@
                                 <w:calendar w:val="gregorian"/>
                               </w:date>
                             </w:sdtPr>
+                            <w:sdtEndPr/>
                             <w:sdtContent>
                               <w:p>
                                 <w:pPr>
@@ -9434,15 +9063,15 @@
             </wp:anchor>
           </w:drawing>
         </mc:Choice>
-        <mc:Fallback xmlns:a="http://schemas.openxmlformats.org/drawingml/2006/main">
+        <mc:Fallback>
           <w:pict>
-            <v:group id="Grupo 37" style="position:absolute;left:0;text-align:left;margin-left:416.8pt;margin-top:0;width:468pt;height:25.2pt;z-index:251662336;mso-width-percent:1000;mso-top-percent:200;mso-wrap-distance-left:0;mso-wrap-distance-right:0;mso-position-horizontal:right;mso-position-horizontal-relative:margin;mso-position-vertical-relative:bottom-margin-area;mso-width-percent:1000;mso-top-percent:200;mso-width-relative:margin;mso-height-relative:margin" coordsize="59626,3238" o:spid="_x0000_s1026" w14:anchorId="0F25DB77" o:gfxdata="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">
-              <v:rect id="Rectángulo 38" style="position:absolute;left:190;width:59436;height:188;visibility:visible;mso-wrap-style:square;v-text-anchor:middle" o:spid="_x0000_s1027" fillcolor="black [3213]" stroked="f" strokeweight="1pt" o:gfxdata="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"/>
+            <v:group w14:anchorId="0F25DB77" id="Grupo 37" o:spid="_x0000_s1026" style="position:absolute;left:0;text-align:left;margin-left:416.8pt;margin-top:0;width:468pt;height:25.2pt;z-index:251662336;mso-width-percent:1000;mso-top-percent:200;mso-wrap-distance-left:0;mso-wrap-distance-right:0;mso-position-horizontal:right;mso-position-horizontal-relative:margin;mso-position-vertical-relative:bottom-margin-area;mso-width-percent:1000;mso-top-percent:200;mso-width-relative:margin;mso-height-relative:margin" coordsize="59626,3238" o:gfxdata="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">
+              <v:rect id="Rectángulo 38" o:spid="_x0000_s1027" style="position:absolute;left:190;width:59436;height:188;visibility:visible;mso-wrap-style:square;v-text-anchor:middle" o:gfxdata="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" fillcolor="black [3213]" stroked="f" strokeweight="1pt"/>
               <v:shapetype id="_x0000_t202" coordsize="21600,21600" o:spt="202" path="m,l,21600r21600,l21600,xe">
                 <v:stroke joinstyle="miter"/>
                 <v:path gradientshapeok="t" o:connecttype="rect"/>
               </v:shapetype>
-              <v:shape id="Cuadro de texto 39" style="position:absolute;top:666;width:59436;height:2572;visibility:visible;mso-wrap-style:square;v-text-anchor:bottom" o:spid="_x0000_s1028" filled="f" stroked="f" strokeweight=".5pt" type="#_x0000_t202" o:gfxdata="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">
+              <v:shape id="Cuadro de texto 39" o:spid="_x0000_s1028" type="#_x0000_t202" style="position:absolute;top:666;width:59436;height:2572;visibility:visible;mso-wrap-style:square;v-text-anchor:bottom" o:gfxdata="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" filled="f" stroked="f" strokeweight=".5pt">
                 <v:textbox inset=",,,0">
                   <w:txbxContent>
                     <w:sdt>
@@ -9646,9 +9275,9 @@
             </wp:anchor>
           </w:drawing>
         </mc:Choice>
-        <mc:Fallback xmlns:a="http://schemas.openxmlformats.org/drawingml/2006/main">
+        <mc:Fallback>
           <w:pict>
-            <v:rect id="Rectángulo 40" style="position:absolute;left:0;text-align:left;margin-left:0;margin-top:0;width:36pt;height:25.2pt;z-index:251661312;visibility:visible;mso-wrap-style:square;mso-width-percent:0;mso-height-percent:0;mso-top-percent:200;mso-wrap-distance-left:0;mso-wrap-distance-top:0;mso-wrap-distance-right:0;mso-wrap-distance-bottom:0;mso-position-horizontal:left;mso-position-horizontal-relative:right-margin-area;mso-position-vertical-relative:bottom-margin-area;mso-width-percent:0;mso-height-percent:0;mso-top-percent:200;mso-width-relative:margin;mso-height-relative:margin;v-text-anchor:bottom" o:spid="_x0000_s1029" fillcolor="black [3213]" stroked="f" strokeweight="3pt" w14:anchorId="3CF0A8BB" o:gfxdata="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">
+            <v:rect w14:anchorId="3CF0A8BB" id="Rectángulo 40" o:spid="_x0000_s1029" style="position:absolute;left:0;text-align:left;margin-left:0;margin-top:0;width:36pt;height:25.2pt;z-index:251661312;visibility:visible;mso-wrap-style:square;mso-width-percent:0;mso-height-percent:0;mso-top-percent:200;mso-wrap-distance-left:0;mso-wrap-distance-top:0;mso-wrap-distance-right:0;mso-wrap-distance-bottom:0;mso-position-horizontal:left;mso-position-horizontal-relative:right-margin-area;mso-position-vertical-relative:bottom-margin-area;mso-width-percent:0;mso-height-percent:0;mso-top-percent:200;mso-width-relative:margin;mso-height-relative:margin;v-text-anchor:bottom" o:gfxdata="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" fillcolor="black [3213]" stroked="f" strokeweight="3pt">
               <v:textbox>
                 <w:txbxContent>
                   <w:p>
@@ -9721,7 +9350,7 @@
 </file>
 
 <file path=word/footnotes.xml><?xml version="1.0" encoding="utf-8"?>
-<w:footnotes xmlns:wpc="http://schemas.microsoft.com/office/word/2010/wordprocessingCanvas" xmlns:cx="http://schemas.microsoft.com/office/drawing/2014/chartex" xmlns:cx1="http://schemas.microsoft.com/office/drawing/2015/9/8/chartex" xmlns:cx2="http://schemas.microsoft.com/office/drawing/2015/10/21/chartex" xmlns:cx3="http://schemas.microsoft.com/office/drawing/2016/5/9/chartex" xmlns:cx4="http://schemas.microsoft.com/office/drawing/2016/5/10/chartex" xmlns:cx5="http://schemas.microsoft.com/office/drawing/2016/5/11/chartex" xmlns:cx6="http://schemas.microsoft.com/office/drawing/2016/5/12/chartex" xmlns:cx7="http://schemas.microsoft.com/office/drawing/2016/5/13/chartex" xmlns:cx8="http://schemas.microsoft.com/office/drawing/2016/5/14/chartex" xmlns:mc="http://schemas.openxmlformats.org/markup-compatibility/2006" xmlns:aink="http://schemas.microsoft.com/office/drawing/2016/ink" xmlns:am3d="http://schemas.microsoft.com/office/drawing/2017/model3d" xmlns:o="urn:schemas-microsoft-com:office:office" xmlns:oel="http://schemas.microsoft.com/office/2019/extlst" xmlns:r="http://schemas.openxmlformats.org/officeDocument/2006/relationships" xmlns:m="http://schemas.openxmlformats.org/officeDocument/2006/math" xmlns:v="urn:schemas-microsoft-com:vml" xmlns:wp14="http://schemas.microsoft.com/office/word/2010/wordprocessingDrawing" xmlns:wp="http://schemas.openxmlformats.org/drawingml/2006/wordprocessingDrawing" xmlns:w10="urn:schemas-microsoft-com:office:word" xmlns:w="http://schemas.openxmlformats.org/wordprocessingml/2006/main" xmlns:w14="http://schemas.microsoft.com/office/word/2010/wordml" xmlns:w15="http://schemas.microsoft.com/office/word/2012/wordml" xmlns:w16cex="http://schemas.microsoft.com/office/word/2018/wordml/cex" xmlns:w16cid="http://schemas.microsoft.com/office/word/2016/wordml/cid" xmlns:w16="http://schemas.microsoft.com/office/word/2018/wordml" xmlns:w16du="http://schemas.microsoft.com/office/word/2023/wordml/word16du" xmlns:w16sdtdh="http://schemas.microsoft.com/office/word/2020/wordml/sdtdatahash" xmlns:w16sdtfl="http://schemas.microsoft.com/office/word/2024/wordml/sdtformatlock" xmlns:w16se="http://schemas.microsoft.com/office/word/2015/wordml/symex" xmlns:wpg="http://schemas.microsoft.com/office/word/2010/wordprocessingGroup" xmlns:wpi="http://schemas.microsoft.com/office/word/2010/wordprocessingInk" xmlns:wne="http://schemas.microsoft.com/office/word/2006/wordml" xmlns:wps="http://schemas.microsoft.com/office/word/2010/wordprocessingShape" mc:Ignorable="w14 w15 w16se w16cid w16 w16cex w16sdtdh w16sdtfl w16du wp14">
+<w:footnotes xmlns:wpc="http://schemas.microsoft.com/office/word/2010/wordprocessingCanvas" xmlns:cx="http://schemas.microsoft.com/office/drawing/2014/chartex" xmlns:cx1="http://schemas.microsoft.com/office/drawing/2015/9/8/chartex" xmlns:cx2="http://schemas.microsoft.com/office/drawing/2015/10/21/chartex" xmlns:cx3="http://schemas.microsoft.com/office/drawing/2016/5/9/chartex" xmlns:cx4="http://schemas.microsoft.com/office/drawing/2016/5/10/chartex" xmlns:cx5="http://schemas.microsoft.com/office/drawing/2016/5/11/chartex" xmlns:cx6="http://schemas.microsoft.com/office/drawing/2016/5/12/chartex" xmlns:cx7="http://schemas.microsoft.com/office/drawing/2016/5/13/chartex" xmlns:cx8="http://schemas.microsoft.com/office/drawing/2016/5/14/chartex" xmlns:mc="http://schemas.openxmlformats.org/markup-compatibility/2006" xmlns:aink="http://schemas.microsoft.com/office/drawing/2016/ink" xmlns:am3d="http://schemas.microsoft.com/office/drawing/2017/model3d" xmlns:o="urn:schemas-microsoft-com:office:office" xmlns:r="http://schemas.openxmlformats.org/officeDocument/2006/relationships" xmlns:m="http://schemas.openxmlformats.org/officeDocument/2006/math" xmlns:v="urn:schemas-microsoft-com:vml" xmlns:wp14="http://schemas.microsoft.com/office/word/2010/wordprocessingDrawing" xmlns:wp="http://schemas.openxmlformats.org/drawingml/2006/wordprocessingDrawing" xmlns:w10="urn:schemas-microsoft-com:office:word" xmlns:w="http://schemas.openxmlformats.org/wordprocessingml/2006/main" xmlns:w14="http://schemas.microsoft.com/office/word/2010/wordml" xmlns:w15="http://schemas.microsoft.com/office/word/2012/wordml" xmlns:w16cex="http://schemas.microsoft.com/office/word/2018/wordml/cex" xmlns:w16cid="http://schemas.microsoft.com/office/word/2016/wordml/cid" xmlns:w16="http://schemas.microsoft.com/office/word/2018/wordml" xmlns:w16sdtdh="http://schemas.microsoft.com/office/word/2020/wordml/sdtdatahash" xmlns:w16se="http://schemas.microsoft.com/office/word/2015/wordml/symex" xmlns:wpg="http://schemas.microsoft.com/office/word/2010/wordprocessingGroup" xmlns:wpi="http://schemas.microsoft.com/office/word/2010/wordprocessingInk" xmlns:wne="http://schemas.microsoft.com/office/word/2006/wordml" xmlns:wps="http://schemas.microsoft.com/office/word/2010/wordprocessingShape" mc:Ignorable="w14 w15 w16se w16cid w16 w16cex w16sdtdh wp14">
   <w:footnote w:type="separator" w:id="-1">
     <w:p>
       <w:r>
@@ -9740,7 +9369,7 @@
 </file>
 
 <file path=word/header1.xml><?xml version="1.0" encoding="utf-8"?>
-<w:hdr xmlns:wpc="http://schemas.microsoft.com/office/word/2010/wordprocessingCanvas" xmlns:cx="http://schemas.microsoft.com/office/drawing/2014/chartex" xmlns:cx1="http://schemas.microsoft.com/office/drawing/2015/9/8/chartex" xmlns:cx2="http://schemas.microsoft.com/office/drawing/2015/10/21/chartex" xmlns:cx3="http://schemas.microsoft.com/office/drawing/2016/5/9/chartex" xmlns:cx4="http://schemas.microsoft.com/office/drawing/2016/5/10/chartex" xmlns:cx5="http://schemas.microsoft.com/office/drawing/2016/5/11/chartex" xmlns:cx6="http://schemas.microsoft.com/office/drawing/2016/5/12/chartex" xmlns:cx7="http://schemas.microsoft.com/office/drawing/2016/5/13/chartex" xmlns:cx8="http://schemas.microsoft.com/office/drawing/2016/5/14/chartex" xmlns:mc="http://schemas.openxmlformats.org/markup-compatibility/2006" xmlns:aink="http://schemas.microsoft.com/office/drawing/2016/ink" xmlns:am3d="http://schemas.microsoft.com/office/drawing/2017/model3d" xmlns:o="urn:schemas-microsoft-com:office:office" xmlns:oel="http://schemas.microsoft.com/office/2019/extlst" xmlns:r="http://schemas.openxmlformats.org/officeDocument/2006/relationships" xmlns:m="http://schemas.openxmlformats.org/officeDocument/2006/math" xmlns:v="urn:schemas-microsoft-com:vml" xmlns:wp14="http://schemas.microsoft.com/office/word/2010/wordprocessingDrawing" xmlns:wp="http://schemas.openxmlformats.org/drawingml/2006/wordprocessingDrawing" xmlns:w10="urn:schemas-microsoft-com:office:word" xmlns:w="http://schemas.openxmlformats.org/wordprocessingml/2006/main" xmlns:w14="http://schemas.microsoft.com/office/word/2010/wordml" xmlns:w15="http://schemas.microsoft.com/office/word/2012/wordml" xmlns:w16cex="http://schemas.microsoft.com/office/word/2018/wordml/cex" xmlns:w16cid="http://schemas.microsoft.com/office/word/2016/wordml/cid" xmlns:w16="http://schemas.microsoft.com/office/word/2018/wordml" xmlns:w16du="http://schemas.microsoft.com/office/word/2023/wordml/word16du" xmlns:w16sdtdh="http://schemas.microsoft.com/office/word/2020/wordml/sdtdatahash" xmlns:w16sdtfl="http://schemas.microsoft.com/office/word/2024/wordml/sdtformatlock" xmlns:w16se="http://schemas.microsoft.com/office/word/2015/wordml/symex" xmlns:wpg="http://schemas.microsoft.com/office/word/2010/wordprocessingGroup" xmlns:wpi="http://schemas.microsoft.com/office/word/2010/wordprocessingInk" xmlns:wne="http://schemas.microsoft.com/office/word/2006/wordml" xmlns:wps="http://schemas.microsoft.com/office/word/2010/wordprocessingShape" mc:Ignorable="w14 w15 w16se w16cid w16 w16cex w16sdtdh w16sdtfl w16du wp14">
+<w:hdr xmlns:wpc="http://schemas.microsoft.com/office/word/2010/wordprocessingCanvas" xmlns:cx="http://schemas.microsoft.com/office/drawing/2014/chartex" xmlns:cx1="http://schemas.microsoft.com/office/drawing/2015/9/8/chartex" xmlns:cx2="http://schemas.microsoft.com/office/drawing/2015/10/21/chartex" xmlns:cx3="http://schemas.microsoft.com/office/drawing/2016/5/9/chartex" xmlns:cx4="http://schemas.microsoft.com/office/drawing/2016/5/10/chartex" xmlns:cx5="http://schemas.microsoft.com/office/drawing/2016/5/11/chartex" xmlns:cx6="http://schemas.microsoft.com/office/drawing/2016/5/12/chartex" xmlns:cx7="http://schemas.microsoft.com/office/drawing/2016/5/13/chartex" xmlns:cx8="http://schemas.microsoft.com/office/drawing/2016/5/14/chartex" xmlns:mc="http://schemas.openxmlformats.org/markup-compatibility/2006" xmlns:aink="http://schemas.microsoft.com/office/drawing/2016/ink" xmlns:am3d="http://schemas.microsoft.com/office/drawing/2017/model3d" xmlns:o="urn:schemas-microsoft-com:office:office" xmlns:r="http://schemas.openxmlformats.org/officeDocument/2006/relationships" xmlns:m="http://schemas.openxmlformats.org/officeDocument/2006/math" xmlns:v="urn:schemas-microsoft-com:vml" xmlns:wp14="http://schemas.microsoft.com/office/word/2010/wordprocessingDrawing" xmlns:wp="http://schemas.openxmlformats.org/drawingml/2006/wordprocessingDrawing" xmlns:w10="urn:schemas-microsoft-com:office:word" xmlns:w="http://schemas.openxmlformats.org/wordprocessingml/2006/main" xmlns:w14="http://schemas.microsoft.com/office/word/2010/wordml" xmlns:w15="http://schemas.microsoft.com/office/word/2012/wordml" xmlns:w16cex="http://schemas.microsoft.com/office/word/2018/wordml/cex" xmlns:w16cid="http://schemas.microsoft.com/office/word/2016/wordml/cid" xmlns:w16="http://schemas.microsoft.com/office/word/2018/wordml" xmlns:w16sdtdh="http://schemas.microsoft.com/office/word/2020/wordml/sdtdatahash" xmlns:w16se="http://schemas.microsoft.com/office/word/2015/wordml/symex" xmlns:wpg="http://schemas.microsoft.com/office/word/2010/wordprocessingGroup" xmlns:wpi="http://schemas.microsoft.com/office/word/2010/wordprocessingInk" xmlns:wne="http://schemas.microsoft.com/office/word/2006/wordml" xmlns:wps="http://schemas.microsoft.com/office/word/2010/wordprocessingShape" mc:Ignorable="w14 w15 w16se w16cid w16 w16cex w16sdtdh wp14">
   <w:p>
     <w:pPr>
       <w:pStyle w:val="Encabezado"/>
@@ -9838,7 +9467,7 @@
 </file>
 
 <file path=word/numbering.xml><?xml version="1.0" encoding="utf-8"?>
-<w:numbering xmlns:wpc="http://schemas.microsoft.com/office/word/2010/wordprocessingCanvas" xmlns:cx="http://schemas.microsoft.com/office/drawing/2014/chartex" xmlns:cx1="http://schemas.microsoft.com/office/drawing/2015/9/8/chartex" xmlns:cx2="http://schemas.microsoft.com/office/drawing/2015/10/21/chartex" xmlns:cx3="http://schemas.microsoft.com/office/drawing/2016/5/9/chartex" xmlns:cx4="http://schemas.microsoft.com/office/drawing/2016/5/10/chartex" xmlns:cx5="http://schemas.microsoft.com/office/drawing/2016/5/11/chartex" xmlns:cx6="http://schemas.microsoft.com/office/drawing/2016/5/12/chartex" xmlns:cx7="http://schemas.microsoft.com/office/drawing/2016/5/13/chartex" xmlns:cx8="http://schemas.microsoft.com/office/drawing/2016/5/14/chartex" xmlns:mc="http://schemas.openxmlformats.org/markup-compatibility/2006" xmlns:aink="http://schemas.microsoft.com/office/drawing/2016/ink" xmlns:am3d="http://schemas.microsoft.com/office/drawing/2017/model3d" xmlns:o="urn:schemas-microsoft-com:office:office" xmlns:oel="http://schemas.microsoft.com/office/2019/extlst" xmlns:r="http://schemas.openxmlformats.org/officeDocument/2006/relationships" xmlns:m="http://schemas.openxmlformats.org/officeDocument/2006/math" xmlns:v="urn:schemas-microsoft-com:vml" xmlns:wp14="http://schemas.microsoft.com/office/word/2010/wordprocessingDrawing" xmlns:wp="http://schemas.openxmlformats.org/drawingml/2006/wordprocessingDrawing" xmlns:w10="urn:schemas-microsoft-com:office:word" xmlns:w="http://schemas.openxmlformats.org/wordprocessingml/2006/main" xmlns:w14="http://schemas.microsoft.com/office/word/2010/wordml" xmlns:w15="http://schemas.microsoft.com/office/word/2012/wordml" xmlns:w16cex="http://schemas.microsoft.com/office/word/2018/wordml/cex" xmlns:w16cid="http://schemas.microsoft.com/office/word/2016/wordml/cid" xmlns:w16="http://schemas.microsoft.com/office/word/2018/wordml" xmlns:w16du="http://schemas.microsoft.com/office/word/2023/wordml/word16du" xmlns:w16sdtdh="http://schemas.microsoft.com/office/word/2020/wordml/sdtdatahash" xmlns:w16sdtfl="http://schemas.microsoft.com/office/word/2024/wordml/sdtformatlock" xmlns:w16se="http://schemas.microsoft.com/office/word/2015/wordml/symex" xmlns:wpg="http://schemas.microsoft.com/office/word/2010/wordprocessingGroup" xmlns:wpi="http://schemas.microsoft.com/office/word/2010/wordprocessingInk" xmlns:wne="http://schemas.microsoft.com/office/word/2006/wordml" xmlns:wps="http://schemas.microsoft.com/office/word/2010/wordprocessingShape" mc:Ignorable="w14 w15 w16se w16cid w16 w16cex w16sdtdh w16sdtfl w16du wp14">
+<w:numbering xmlns:wpc="http://schemas.microsoft.com/office/word/2010/wordprocessingCanvas" xmlns:cx="http://schemas.microsoft.com/office/drawing/2014/chartex" xmlns:cx1="http://schemas.microsoft.com/office/drawing/2015/9/8/chartex" xmlns:cx2="http://schemas.microsoft.com/office/drawing/2015/10/21/chartex" xmlns:cx3="http://schemas.microsoft.com/office/drawing/2016/5/9/chartex" xmlns:cx4="http://schemas.microsoft.com/office/drawing/2016/5/10/chartex" xmlns:cx5="http://schemas.microsoft.com/office/drawing/2016/5/11/chartex" xmlns:cx6="http://schemas.microsoft.com/office/drawing/2016/5/12/chartex" xmlns:cx7="http://schemas.microsoft.com/office/drawing/2016/5/13/chartex" xmlns:cx8="http://schemas.microsoft.com/office/drawing/2016/5/14/chartex" xmlns:mc="http://schemas.openxmlformats.org/markup-compatibility/2006" xmlns:aink="http://schemas.microsoft.com/office/drawing/2016/ink" xmlns:am3d="http://schemas.microsoft.com/office/drawing/2017/model3d" xmlns:o="urn:schemas-microsoft-com:office:office" xmlns:r="http://schemas.openxmlformats.org/officeDocument/2006/relationships" xmlns:m="http://schemas.openxmlformats.org/officeDocument/2006/math" xmlns:v="urn:schemas-microsoft-com:vml" xmlns:wp14="http://schemas.microsoft.com/office/word/2010/wordprocessingDrawing" xmlns:wp="http://schemas.openxmlformats.org/drawingml/2006/wordprocessingDrawing" xmlns:w10="urn:schemas-microsoft-com:office:word" xmlns:w="http://schemas.openxmlformats.org/wordprocessingml/2006/main" xmlns:w14="http://schemas.microsoft.com/office/word/2010/wordml" xmlns:w15="http://schemas.microsoft.com/office/word/2012/wordml" xmlns:w16cex="http://schemas.microsoft.com/office/word/2018/wordml/cex" xmlns:w16cid="http://schemas.microsoft.com/office/word/2016/wordml/cid" xmlns:w16="http://schemas.microsoft.com/office/word/2018/wordml" xmlns:w16sdtdh="http://schemas.microsoft.com/office/word/2020/wordml/sdtdatahash" xmlns:w16se="http://schemas.microsoft.com/office/word/2015/wordml/symex" xmlns:wpg="http://schemas.microsoft.com/office/word/2010/wordprocessingGroup" xmlns:wpi="http://schemas.microsoft.com/office/word/2010/wordprocessingInk" xmlns:wne="http://schemas.microsoft.com/office/word/2006/wordml" xmlns:wps="http://schemas.microsoft.com/office/word/2010/wordprocessingShape" mc:Ignorable="w14 w15 w16se w16cid w16 w16cex w16sdtdh wp14">
   <w:abstractNum w:abstractNumId="0" w15:restartNumberingAfterBreak="0">
     <w:nsid w:val="08183884"/>
     <w:multiLevelType w:val="hybridMultilevel"/>
@@ -13106,98 +12735,98 @@
       </w:rPr>
     </w:lvl>
   </w:abstractNum>
-  <w:num w:numId="1" w16cid:durableId="812254501">
+  <w:num w:numId="1">
     <w:abstractNumId w:val="23"/>
   </w:num>
-  <w:num w:numId="2" w16cid:durableId="944069807">
+  <w:num w:numId="2">
     <w:abstractNumId w:val="6"/>
   </w:num>
-  <w:num w:numId="3" w16cid:durableId="123425022">
+  <w:num w:numId="3">
     <w:abstractNumId w:val="3"/>
   </w:num>
-  <w:num w:numId="4" w16cid:durableId="254246893">
+  <w:num w:numId="4">
     <w:abstractNumId w:val="12"/>
   </w:num>
-  <w:num w:numId="5" w16cid:durableId="1470971647">
+  <w:num w:numId="5">
     <w:abstractNumId w:val="8"/>
   </w:num>
-  <w:num w:numId="6" w16cid:durableId="1368095994">
+  <w:num w:numId="6">
     <w:abstractNumId w:val="28"/>
   </w:num>
-  <w:num w:numId="7" w16cid:durableId="2132626845">
+  <w:num w:numId="7">
     <w:abstractNumId w:val="18"/>
   </w:num>
-  <w:num w:numId="8" w16cid:durableId="1241713319">
+  <w:num w:numId="8">
     <w:abstractNumId w:val="14"/>
   </w:num>
-  <w:num w:numId="9" w16cid:durableId="493839428">
+  <w:num w:numId="9">
     <w:abstractNumId w:val="26"/>
   </w:num>
-  <w:num w:numId="10" w16cid:durableId="956378011">
+  <w:num w:numId="10">
     <w:abstractNumId w:val="25"/>
   </w:num>
-  <w:num w:numId="11" w16cid:durableId="1452894976">
+  <w:num w:numId="11">
     <w:abstractNumId w:val="27"/>
   </w:num>
-  <w:num w:numId="12" w16cid:durableId="701323904">
+  <w:num w:numId="12">
     <w:abstractNumId w:val="17"/>
   </w:num>
-  <w:num w:numId="13" w16cid:durableId="1557857476">
+  <w:num w:numId="13">
     <w:abstractNumId w:val="15"/>
   </w:num>
-  <w:num w:numId="14" w16cid:durableId="866942675">
+  <w:num w:numId="14">
     <w:abstractNumId w:val="20"/>
   </w:num>
-  <w:num w:numId="15" w16cid:durableId="1151092276">
+  <w:num w:numId="15">
     <w:abstractNumId w:val="10"/>
   </w:num>
-  <w:num w:numId="16" w16cid:durableId="946735580">
+  <w:num w:numId="16">
     <w:abstractNumId w:val="5"/>
   </w:num>
-  <w:num w:numId="17" w16cid:durableId="919481013">
+  <w:num w:numId="17">
     <w:abstractNumId w:val="16"/>
   </w:num>
-  <w:num w:numId="18" w16cid:durableId="673728002">
+  <w:num w:numId="18">
     <w:abstractNumId w:val="9"/>
   </w:num>
-  <w:num w:numId="19" w16cid:durableId="187838080">
+  <w:num w:numId="19">
     <w:abstractNumId w:val="7"/>
   </w:num>
-  <w:num w:numId="20" w16cid:durableId="125009624">
+  <w:num w:numId="20">
     <w:abstractNumId w:val="13"/>
   </w:num>
-  <w:num w:numId="21" w16cid:durableId="790442474">
+  <w:num w:numId="21">
     <w:abstractNumId w:val="4"/>
   </w:num>
-  <w:num w:numId="22" w16cid:durableId="1991053848">
+  <w:num w:numId="22">
     <w:abstractNumId w:val="1"/>
   </w:num>
-  <w:num w:numId="23" w16cid:durableId="1040471283">
+  <w:num w:numId="23">
     <w:abstractNumId w:val="0"/>
   </w:num>
-  <w:num w:numId="24" w16cid:durableId="1378432175">
+  <w:num w:numId="24">
     <w:abstractNumId w:val="19"/>
   </w:num>
-  <w:num w:numId="25" w16cid:durableId="1750617564">
+  <w:num w:numId="25">
     <w:abstractNumId w:val="22"/>
   </w:num>
-  <w:num w:numId="26" w16cid:durableId="1292319278">
+  <w:num w:numId="26">
     <w:abstractNumId w:val="21"/>
   </w:num>
-  <w:num w:numId="27" w16cid:durableId="968247522">
+  <w:num w:numId="27">
     <w:abstractNumId w:val="11"/>
   </w:num>
-  <w:num w:numId="28" w16cid:durableId="263811070">
+  <w:num w:numId="28">
     <w:abstractNumId w:val="2"/>
   </w:num>
-  <w:num w:numId="29" w16cid:durableId="333653962">
+  <w:num w:numId="29">
     <w:abstractNumId w:val="24"/>
   </w:num>
 </w:numbering>
 </file>
 
 <file path=word/styles.xml><?xml version="1.0" encoding="utf-8"?>
-<w:styles xmlns:mc="http://schemas.openxmlformats.org/markup-compatibility/2006" xmlns:r="http://schemas.openxmlformats.org/officeDocument/2006/relationships" xmlns:w="http://schemas.openxmlformats.org/wordprocessingml/2006/main" xmlns:w14="http://schemas.microsoft.com/office/word/2010/wordml" xmlns:w15="http://schemas.microsoft.com/office/word/2012/wordml" xmlns:w16cex="http://schemas.microsoft.com/office/word/2018/wordml/cex" xmlns:w16cid="http://schemas.microsoft.com/office/word/2016/wordml/cid" xmlns:w16="http://schemas.microsoft.com/office/word/2018/wordml" xmlns:w16du="http://schemas.microsoft.com/office/word/2023/wordml/word16du" xmlns:w16sdtdh="http://schemas.microsoft.com/office/word/2020/wordml/sdtdatahash" xmlns:w16sdtfl="http://schemas.microsoft.com/office/word/2024/wordml/sdtformatlock" xmlns:w16se="http://schemas.microsoft.com/office/word/2015/wordml/symex" mc:Ignorable="w14 w15 w16se w16cid w16 w16cex w16sdtdh w16sdtfl w16du">
+<w:styles xmlns:mc="http://schemas.openxmlformats.org/markup-compatibility/2006" xmlns:r="http://schemas.openxmlformats.org/officeDocument/2006/relationships" xmlns:w="http://schemas.openxmlformats.org/wordprocessingml/2006/main" xmlns:w14="http://schemas.microsoft.com/office/word/2010/wordml" xmlns:w15="http://schemas.microsoft.com/office/word/2012/wordml" xmlns:w16cex="http://schemas.microsoft.com/office/word/2018/wordml/cex" xmlns:w16cid="http://schemas.microsoft.com/office/word/2016/wordml/cid" xmlns:w16="http://schemas.microsoft.com/office/word/2018/wordml" xmlns:w16sdtdh="http://schemas.microsoft.com/office/word/2020/wordml/sdtdatahash" xmlns:w16se="http://schemas.microsoft.com/office/word/2015/wordml/symex" mc:Ignorable="w14 w15 w16se w16cid w16 w16cex w16sdtdh">
   <w:docDefaults>
     <w:rPrDefault>
       <w:rPr>
@@ -14081,7 +13710,7 @@
       <w:lang w:val="es-CL" w:eastAsia="es-CL"/>
     </w:rPr>
   </w:style>
-  <w:style w:type="character" w:styleId="Fuerte">
+  <w:style w:type="character" w:styleId="Textoennegrita">
     <w:name w:val="Strong"/>
     <w:basedOn w:val="Fuentedeprrafopredeter"/>
     <w:uiPriority w:val="22"/>
@@ -14368,6 +13997,15 @@
 </file>
 
 <file path=customXml/item2.xml><?xml version="1.0" encoding="utf-8"?>
+<?mso-contentType ?>
+<FormTemplates xmlns="http://schemas.microsoft.com/sharepoint/v3/contenttype/forms">
+  <Display>DocumentLibraryForm</Display>
+  <Edit>DocumentLibraryForm</Edit>
+  <New>DocumentLibraryForm</New>
+</FormTemplates>
+</file>
+
+<file path=customXml/item3.xml><?xml version="1.0" encoding="utf-8"?>
 <ct:contentTypeSchema xmlns:ct="http://schemas.microsoft.com/office/2006/metadata/contentType" xmlns:ma="http://schemas.microsoft.com/office/2006/metadata/properties/metaAttributes" ct:_="" ma:_="" ma:contentTypeName="Documento" ma:contentTypeID="0x010100E96778489EE7714D8BD12CC105EB918B" ma:contentTypeVersion="2" ma:contentTypeDescription="Crear nuevo documento." ma:contentTypeScope="" ma:versionID="416c5c7ae9b5d54d83875cd3c65194e3">
   <xsd:schema xmlns:xsd="http://www.w3.org/2001/XMLSchema" xmlns:xs="http://www.w3.org/2001/XMLSchema" xmlns:p="http://schemas.microsoft.com/office/2006/metadata/properties" xmlns:ns2="126e8a1c-9ea9-435a-ac89-d06c80d62e30" targetNamespace="http://schemas.microsoft.com/office/2006/metadata/properties" ma:root="true" ma:fieldsID="70a237c842677bd850644f8595079f5e" ns2:_="">
     <xsd:import namespace="126e8a1c-9ea9-435a-ac89-d06c80d62e30"/>
@@ -14499,23 +14137,14 @@
 </ct:contentTypeSchema>
 </file>
 
-<file path=customXml/item3.xml><?xml version="1.0" encoding="utf-8"?>
-<?mso-contentType ?>
-<FormTemplates xmlns="http://schemas.microsoft.com/sharepoint/v3/contenttype/forms">
-  <Display>DocumentLibraryForm</Display>
-  <Edit>DocumentLibraryForm</Edit>
-  <New>DocumentLibraryForm</New>
-</FormTemplates>
-</file>
-
 <file path=customXml/item4.xml><?xml version="1.0" encoding="utf-8"?>
-<b:Sources xmlns:b="http://schemas.openxmlformats.org/officeDocument/2006/bibliography" xmlns="http://schemas.openxmlformats.org/officeDocument/2006/bibliography" SelectedStyle="\APASixthEditionOfficeOnline.xsl" StyleName="APA" Version="6"/>
+<p:properties xmlns:p="http://schemas.microsoft.com/office/2006/metadata/properties" xmlns:xsi="http://www.w3.org/2001/XMLSchema-instance" xmlns:pc="http://schemas.microsoft.com/office/infopath/2007/PartnerControls">
+  <documentManagement/>
+</p:properties>
 </file>
 
 <file path=customXml/item5.xml><?xml version="1.0" encoding="utf-8"?>
-<p:properties xmlns:p="http://schemas.microsoft.com/office/2006/metadata/properties" xmlns:xsi="http://www.w3.org/2001/XMLSchema-instance" xmlns:pc="http://schemas.microsoft.com/office/infopath/2007/PartnerControls">
-  <documentManagement/>
-</p:properties>
+<b:Sources xmlns:b="http://schemas.openxmlformats.org/officeDocument/2006/bibliography" xmlns="http://schemas.openxmlformats.org/officeDocument/2006/bibliography" SelectedStyle="\APASixthEditionOfficeOnline.xsl" StyleName="APA" Version="6"/>
 </file>
 
 <file path=customXml/itemProps1.xml><?xml version="1.0" encoding="utf-8"?>
@@ -14527,6 +14156,14 @@
 </file>
 
 <file path=customXml/itemProps2.xml><?xml version="1.0" encoding="utf-8"?>
+<ds:datastoreItem xmlns:ds="http://schemas.openxmlformats.org/officeDocument/2006/customXml" ds:itemID="{4EF1E242-F579-4982-B8CC-2FBF33737424}">
+  <ds:schemaRefs>
+    <ds:schemaRef ds:uri="http://schemas.microsoft.com/sharepoint/v3/contenttype/forms"/>
+  </ds:schemaRefs>
+</ds:datastoreItem>
+</file>
+
+<file path=customXml/itemProps3.xml><?xml version="1.0" encoding="utf-8"?>
 <ds:datastoreItem xmlns:ds="http://schemas.openxmlformats.org/officeDocument/2006/customXml" ds:itemID="{14D1F39E-8B56-417C-B337-6A9061C37D5D}">
   <ds:schemaRefs>
     <ds:schemaRef ds:uri="http://schemas.microsoft.com/office/2006/metadata/contentType"/>
@@ -14544,27 +14181,19 @@
 </ds:datastoreItem>
 </file>
 
-<file path=customXml/itemProps3.xml><?xml version="1.0" encoding="utf-8"?>
-<ds:datastoreItem xmlns:ds="http://schemas.openxmlformats.org/officeDocument/2006/customXml" ds:itemID="{4EF1E242-F579-4982-B8CC-2FBF33737424}">
-  <ds:schemaRefs>
-    <ds:schemaRef ds:uri="http://schemas.microsoft.com/sharepoint/v3/contenttype/forms"/>
-  </ds:schemaRefs>
-</ds:datastoreItem>
-</file>
-
 <file path=customXml/itemProps4.xml><?xml version="1.0" encoding="utf-8"?>
-<ds:datastoreItem xmlns:ds="http://schemas.openxmlformats.org/officeDocument/2006/customXml" ds:itemID="{028C5B15-B524-4B7C-9DF0-F573AFD0F54E}">
-  <ds:schemaRefs>
-    <ds:schemaRef ds:uri="http://schemas.openxmlformats.org/officeDocument/2006/bibliography"/>
-  </ds:schemaRefs>
-</ds:datastoreItem>
-</file>
-
-<file path=customXml/itemProps5.xml><?xml version="1.0" encoding="utf-8"?>
 <ds:datastoreItem xmlns:ds="http://schemas.openxmlformats.org/officeDocument/2006/customXml" ds:itemID="{5B7B5873-BEF7-4EF9-B783-7B50266FE496}">
   <ds:schemaRefs>
     <ds:schemaRef ds:uri="http://schemas.microsoft.com/office/2006/metadata/properties"/>
     <ds:schemaRef ds:uri="http://schemas.microsoft.com/office/infopath/2007/PartnerControls"/>
   </ds:schemaRefs>
 </ds:datastoreItem>
+</file>
+
+<file path=customXml/itemProps5.xml><?xml version="1.0" encoding="utf-8"?>
+<ds:datastoreItem xmlns:ds="http://schemas.openxmlformats.org/officeDocument/2006/customXml" ds:itemID="{028C5B15-B524-4B7C-9DF0-F573AFD0F54E}">
+  <ds:schemaRefs>
+    <ds:schemaRef ds:uri="http://schemas.openxmlformats.org/officeDocument/2006/bibliography"/>
+  </ds:schemaRefs>
+</ds:datastoreItem>
 </file>
</xml_diff>